<commit_message>
Docs: cover banking desk, portable PQC, model insights & analyst actions
- Technical doc + presentation guide updated to match the shipped product
- New Core-Banking section + 8th diagram (bank_flow); 9 entities in the data model
- Pure-Python PQC fallback (no compiler) documented across both docs
- SOC analyst Lock/Approve/Dismiss, AI Model Insights, impact metrics
- Test count 31 -> 40; two-computer LAN demo note
- Rebuilt both PDFs + DOCX (8 diagrams embedded each)
</commit_message>
<xml_diff>
--- a/DOCS/Prahari_Documentation.docx
+++ b/DOCS/Prahari_Documentation.docx
@@ -53,7 +53,7 @@
         <w:p>
           <w:r>
             <w:fldChar w:fldCharType="begin" w:dirty="true"/>
-            <w:instrText xml:space="preserve">TOC \o "1-3" \h \z \u</w:instrText>
+            <w:instrText xml:space="preserve">TOC \o "1-2" \h \z \u</w:instrText>
             <w:fldChar w:fldCharType="separate"/>
             <w:fldChar w:fldCharType="end"/>
           </w:r>
@@ -66,15 +66,6 @@
         <w:pStyle w:val="Heading1"/>
       </w:pPr>
       <w:r>
-        <w:rPr>
-          <w:rStyle w:val="SectionNumber"/>
-        </w:rPr>
-        <w:t xml:space="preserve">1</w:t>
-      </w:r>
-      <w:r>
-        <w:tab/>
-      </w:r>
-      <w:r>
         <w:t xml:space="preserve">Executive Summary</w:t>
       </w:r>
     </w:p>
@@ -314,7 +305,7 @@
         <w:t xml:space="preserve"> </w:t>
       </w:r>
       <w:r>
-        <w:t xml:space="preserve">where staff act and enforcement happens live, and a</w:t>
+        <w:t xml:space="preserve">— a working core-banking desk (accounts, payments, transactions, approvals) where staff act and both fraud controls and insider enforcement happen live — and a</w:t>
       </w:r>
       <w:r>
         <w:t xml:space="preserve"> </w:t>
@@ -330,7 +321,7 @@
         <w:t xml:space="preserve"> </w:t>
       </w:r>
       <w:r>
-        <w:t xml:space="preserve">where analysts watch, replay sessions, review access, and verify the audit chain. It runs</w:t>
+        <w:t xml:space="preserve">where analysts watch, replay sessions, review access, lock or clear a session, and verify the audit chain. It runs</w:t>
       </w:r>
       <w:r>
         <w:t xml:space="preserve"> </w:t>
@@ -346,7 +337,20 @@
         <w:t xml:space="preserve"> </w:t>
       </w:r>
       <w:r>
-        <w:t xml:space="preserve">on SQLite and is one connection string away from PostgreSQL.</w:t>
+        <w:t xml:space="preserve">on SQLite and is one connection string away from PostgreSQL. The post-quantum layer needs</w:t>
+      </w:r>
+      <w:r>
+        <w:t xml:space="preserve"> </w:t>
+      </w:r>
+      <w:r>
+        <w:rPr>
+          <w:b/>
+          <w:bCs/>
+        </w:rPr>
+        <w:t xml:space="preserve">no compiler</w:t>
+      </w:r>
+      <w:r>
+        <w:t xml:space="preserve">: it auto-selects a native library when present and falls back to a pure-Python implementation otherwise, so any teammate can launch it.</w:t>
       </w:r>
     </w:p>
     <w:p>
@@ -373,15 +377,6 @@
       <w:pPr>
         <w:pStyle w:val="Heading1"/>
       </w:pPr>
-      <w:r>
-        <w:rPr>
-          <w:rStyle w:val="SectionNumber"/>
-        </w:rPr>
-        <w:t xml:space="preserve">2</w:t>
-      </w:r>
-      <w:r>
-        <w:tab/>
-      </w:r>
       <w:r>
         <w:t xml:space="preserve">Problem and Context</w:t>
       </w:r>
@@ -665,15 +660,6 @@
         <w:pStyle w:val="Heading1"/>
       </w:pPr>
       <w:r>
-        <w:rPr>
-          <w:rStyle w:val="SectionNumber"/>
-        </w:rPr>
-        <w:t xml:space="preserve">3</w:t>
-      </w:r>
-      <w:r>
-        <w:tab/>
-      </w:r>
-      <w:r>
         <w:t xml:space="preserve">Solution Overview</w:t>
       </w:r>
     </w:p>
@@ -793,15 +779,6 @@
       <w:pPr>
         <w:pStyle w:val="Heading1"/>
       </w:pPr>
-      <w:r>
-        <w:rPr>
-          <w:rStyle w:val="SectionNumber"/>
-        </w:rPr>
-        <w:t xml:space="preserve">4</w:t>
-      </w:r>
-      <w:r>
-        <w:tab/>
-      </w:r>
       <w:r>
         <w:t xml:space="preserve">System Architecture</w:t>
       </w:r>
@@ -1033,7 +1010,7 @@
               <w:pStyle w:val="Compact"/>
             </w:pPr>
             <w:r>
-              <w:t xml:space="preserve">liboqs-python — ML-KEM-768 (FIPS 203), ML-DSA-65 (FIPS 204); AES-256-GCM</w:t>
+              <w:t xml:space="preserve">ML-KEM-768 (FIPS 203), ML-DSA-65 (FIPS 204); AES-256-GCM. Native liboqs when present, else pure-Python (kyber-py / dilithium-py) — no compiler</w:t>
             </w:r>
           </w:p>
         </w:tc>
@@ -1153,7 +1130,7 @@
               <w:pStyle w:val="Compact"/>
             </w:pPr>
             <w:r>
-              <w:t xml:space="preserve">pytest (31 tests)</w:t>
+              <w:t xml:space="preserve">pytest (40 tests)</w:t>
             </w:r>
           </w:p>
         </w:tc>
@@ -1166,15 +1143,6 @@
         <w:pStyle w:val="Heading1"/>
       </w:pPr>
       <w:r>
-        <w:rPr>
-          <w:rStyle w:val="SectionNumber"/>
-        </w:rPr>
-        <w:t xml:space="preserve">5</w:t>
-      </w:r>
-      <w:r>
-        <w:tab/>
-      </w:r>
-      <w:r>
         <w:t xml:space="preserve">Data Model</w:t>
       </w:r>
     </w:p>
@@ -1183,7 +1151,7 @@
         <w:pStyle w:val="FirstParagraph"/>
       </w:pPr>
       <w:r>
-        <w:t xml:space="preserve">Seven ORM entities capture the workforce, their recorded sessions and actions, the detection output, and the post-quantum artefacts.</w:t>
+        <w:t xml:space="preserve">Nine ORM entities capture the workforce, their recorded sessions and actions, the detection output, the post-quantum artefacts, and the core-banking ledger.</w:t>
       </w:r>
     </w:p>
     <w:p>
@@ -1193,9 +1161,9 @@
       <w:r>
         <w:drawing>
           <wp:inline>
-            <wp:extent cx="5334000" cy="3517008"/>
+            <wp:extent cx="5334000" cy="3758803"/>
             <wp:effectExtent b="0" l="0" r="0" t="0"/>
-            <wp:docPr descr="Entity model — users, sessions, events, recorded commands, alerts, audit entries and vault items." title="" id="17" name="Picture"/>
+            <wp:docPr descr="Entity model — users, sessions, events, recorded commands, alerts, audit entries, vault items, and the bank accounts and transactions." title="" id="17" name="Picture"/>
             <a:graphic>
               <a:graphicData uri="http://schemas.openxmlformats.org/drawingml/2006/picture">
                 <pic:pic>
@@ -1214,7 +1182,7 @@
                   <pic:spPr bwMode="auto">
                     <a:xfrm>
                       <a:off x="0" y="0"/>
-                      <a:ext cx="5334000" cy="3517008"/>
+                      <a:ext cx="5334000" cy="3758803"/>
                     </a:xfrm>
                     <a:prstGeom prst="rect">
                       <a:avLst/>
@@ -1238,13 +1206,72 @@
         <w:pStyle w:val="ImageCaption"/>
       </w:pPr>
       <w:r>
-        <w:t xml:space="preserve">Entity model — users, sessions, events, recorded commands, alerts, audit entries and vault items.</w:t>
+        <w:t xml:space="preserve">Entity model — users, sessions, events, recorded commands, alerts, audit entries, vault items, and the bank accounts and transactions.</w:t>
       </w:r>
     </w:p>
     <w:p>
       <w:pPr>
         <w:pStyle w:val="BodyText"/>
       </w:pPr>
+      <w:r>
+        <w:rPr>
+          <w:rStyle w:val="VerbatimChar"/>
+        </w:rPr>
+        <w:t xml:space="preserve">BankAccount</w:t>
+      </w:r>
+      <w:r>
+        <w:t xml:space="preserve"> </w:t>
+      </w:r>
+      <w:r>
+        <w:t xml:space="preserve">and</w:t>
+      </w:r>
+      <w:r>
+        <w:t xml:space="preserve"> </w:t>
+      </w:r>
+      <w:r>
+        <w:rPr>
+          <w:rStyle w:val="VerbatimChar"/>
+        </w:rPr>
+        <w:t xml:space="preserve">BankTransaction</w:t>
+      </w:r>
+      <w:r>
+        <w:t xml:space="preserve"> </w:t>
+      </w:r>
+      <w:r>
+        <w:t xml:space="preserve">are the</w:t>
+      </w:r>
+      <w:r>
+        <w:t xml:space="preserve"> </w:t>
+      </w:r>
+      <w:r>
+        <w:rPr>
+          <w:b/>
+          <w:bCs/>
+        </w:rPr>
+        <w:t xml:space="preserve">core-banking ledger</w:t>
+      </w:r>
+      <w:r>
+        <w:t xml:space="preserve"> </w:t>
+      </w:r>
+      <w:r>
+        <w:t xml:space="preserve">that the Employee Portal reads and writes (see</w:t>
+      </w:r>
+      <w:r>
+        <w:t xml:space="preserve"> </w:t>
+      </w:r>
+      <w:r>
+        <w:rPr>
+          <w:i/>
+          <w:iCs/>
+        </w:rPr>
+        <w:t xml:space="preserve">Core Banking Operations</w:t>
+      </w:r>
+      <w:r>
+        <w:t xml:space="preserve">);</w:t>
+      </w:r>
+      <w:r>
+        <w:t xml:space="preserve"> </w:t>
+      </w:r>
       <w:r>
         <w:rPr>
           <w:rStyle w:val="VerbatimChar"/>
@@ -1616,15 +1643,6 @@
         <w:pStyle w:val="Heading1"/>
       </w:pPr>
       <w:r>
-        <w:rPr>
-          <w:rStyle w:val="SectionNumber"/>
-        </w:rPr>
-        <w:t xml:space="preserve">6</w:t>
-      </w:r>
-      <w:r>
-        <w:tab/>
-      </w:r>
-      <w:r>
         <w:t xml:space="preserve">Detection Engine</w:t>
       </w:r>
     </w:p>
@@ -1641,15 +1659,6 @@
       <w:pPr>
         <w:pStyle w:val="Heading2"/>
       </w:pPr>
-      <w:r>
-        <w:rPr>
-          <w:rStyle w:val="SectionNumber"/>
-        </w:rPr>
-        <w:t xml:space="preserve">6.1</w:t>
-      </w:r>
-      <w:r>
-        <w:tab/>
-      </w:r>
       <w:r>
         <w:t xml:space="preserve">Rule engine</w:t>
       </w:r>
@@ -2404,15 +2413,6 @@
         <w:pStyle w:val="Heading2"/>
       </w:pPr>
       <w:r>
-        <w:rPr>
-          <w:rStyle w:val="SectionNumber"/>
-        </w:rPr>
-        <w:t xml:space="preserve">6.2</w:t>
-      </w:r>
-      <w:r>
-        <w:tab/>
-      </w:r>
-      <w:r>
         <w:t xml:space="preserve">UEBA — behavioural analytics</w:t>
       </w:r>
     </w:p>
@@ -2558,15 +2558,6 @@
       <w:pPr>
         <w:pStyle w:val="Heading2"/>
       </w:pPr>
-      <w:r>
-        <w:rPr>
-          <w:rStyle w:val="SectionNumber"/>
-        </w:rPr>
-        <w:t xml:space="preserve">6.3</w:t>
-      </w:r>
-      <w:r>
-        <w:tab/>
-      </w:r>
       <w:r>
         <w:t xml:space="preserve">Risk scoring</w:t>
       </w:r>
@@ -2813,15 +2804,6 @@
         <w:pStyle w:val="Heading1"/>
       </w:pPr>
       <w:r>
-        <w:rPr>
-          <w:rStyle w:val="SectionNumber"/>
-        </w:rPr>
-        <w:t xml:space="preserve">7</w:t>
-      </w:r>
-      <w:r>
-        <w:tab/>
-      </w:r>
-      <w:r>
         <w:t xml:space="preserve">The Three Insider Types</w:t>
       </w:r>
     </w:p>
@@ -3202,21 +3184,12 @@
       </w:r>
     </w:p>
     <w:bookmarkEnd w:id="30"/>
-    <w:bookmarkStart w:id="36" w:name="adaptive-response-and-pam"/>
+    <w:bookmarkStart w:id="38" w:name="adaptive-response-and-pam"/>
     <w:p>
       <w:pPr>
         <w:pStyle w:val="Heading1"/>
       </w:pPr>
       <w:r>
-        <w:rPr>
-          <w:rStyle w:val="SectionNumber"/>
-        </w:rPr>
-        <w:t xml:space="preserve">8</w:t>
-      </w:r>
-      <w:r>
-        <w:tab/>
-      </w:r>
-      <w:r>
         <w:t xml:space="preserve">Adaptive Response and PAM</w:t>
       </w:r>
     </w:p>
@@ -3225,15 +3198,6 @@
       <w:pPr>
         <w:pStyle w:val="Heading2"/>
       </w:pPr>
-      <w:r>
-        <w:rPr>
-          <w:rStyle w:val="SectionNumber"/>
-        </w:rPr>
-        <w:t xml:space="preserve">8.1</w:t>
-      </w:r>
-      <w:r>
-        <w:tab/>
-      </w:r>
       <w:r>
         <w:t xml:space="preserve">Live enforcement</w:t>
       </w:r>
@@ -3424,15 +3388,6 @@
         <w:pStyle w:val="Heading2"/>
       </w:pPr>
       <w:r>
-        <w:rPr>
-          <w:rStyle w:val="SectionNumber"/>
-        </w:rPr>
-        <w:t xml:space="preserve">8.2</w:t>
-      </w:r>
-      <w:r>
-        <w:tab/>
-      </w:r>
-      <w:r>
         <w:t xml:space="preserve">PAM surface</w:t>
       </w:r>
     </w:p>
@@ -3546,23 +3501,241 @@
       </w:r>
     </w:p>
     <w:bookmarkEnd w:id="35"/>
+    <w:bookmarkStart w:id="36" w:name="analyst-response-actions"/>
+    <w:p>
+      <w:pPr>
+        <w:pStyle w:val="Heading2"/>
+      </w:pPr>
+      <w:r>
+        <w:t xml:space="preserve">Analyst response actions</w:t>
+      </w:r>
+    </w:p>
+    <w:p>
+      <w:pPr>
+        <w:pStyle w:val="FirstParagraph"/>
+      </w:pPr>
+      <w:r>
+        <w:t xml:space="preserve">The SOC Console turns a flagged session into a one-click decision, each written to the signed audit log and broadcast live:</w:t>
+      </w:r>
+    </w:p>
+    <w:p>
+      <w:pPr>
+        <w:pStyle w:val="Compact"/>
+        <w:numPr>
+          <w:ilvl w:val="0"/>
+          <w:numId w:val="1007"/>
+        </w:numPr>
+      </w:pPr>
+      <w:r>
+        <w:rPr>
+          <w:b/>
+          <w:bCs/>
+        </w:rPr>
+        <w:t xml:space="preserve">Lock account</w:t>
+      </w:r>
+      <w:r>
+        <w:t xml:space="preserve"> </w:t>
+      </w:r>
+      <w:r>
+        <w:t xml:space="preserve">(</w:t>
+      </w:r>
+      <w:r>
+        <w:rPr>
+          <w:rStyle w:val="VerbatimChar"/>
+        </w:rPr>
+        <w:t xml:space="preserve">POST /soc/sessions/{id}/lock</w:t>
+      </w:r>
+      <w:r>
+        <w:t xml:space="preserve">) — force-blocks the session and disables the account; the next login is refused.</w:t>
+      </w:r>
+    </w:p>
+    <w:p>
+      <w:pPr>
+        <w:pStyle w:val="Compact"/>
+        <w:numPr>
+          <w:ilvl w:val="0"/>
+          <w:numId w:val="1007"/>
+        </w:numPr>
+      </w:pPr>
+      <w:r>
+        <w:rPr>
+          <w:b/>
+          <w:bCs/>
+        </w:rPr>
+        <w:t xml:space="preserve">Approve / clear</w:t>
+      </w:r>
+      <w:r>
+        <w:t xml:space="preserve"> </w:t>
+      </w:r>
+      <w:r>
+        <w:t xml:space="preserve">(</w:t>
+      </w:r>
+      <w:r>
+        <w:rPr>
+          <w:rStyle w:val="VerbatimChar"/>
+        </w:rPr>
+        <w:t xml:space="preserve">POST /soc/sessions/{id}/approve</w:t>
+      </w:r>
+      <w:r>
+        <w:t xml:space="preserve">) — releases a held session for the maker-checker path.</w:t>
+      </w:r>
+    </w:p>
+    <w:p>
+      <w:pPr>
+        <w:pStyle w:val="Compact"/>
+        <w:numPr>
+          <w:ilvl w:val="0"/>
+          <w:numId w:val="1007"/>
+        </w:numPr>
+      </w:pPr>
+      <w:r>
+        <w:rPr>
+          <w:b/>
+          <w:bCs/>
+        </w:rPr>
+        <w:t xml:space="preserve">Dismiss</w:t>
+      </w:r>
+      <w:r>
+        <w:t xml:space="preserve"> </w:t>
+      </w:r>
+      <w:r>
+        <w:t xml:space="preserve">(</w:t>
+      </w:r>
+      <w:r>
+        <w:rPr>
+          <w:rStyle w:val="VerbatimChar"/>
+        </w:rPr>
+        <w:t xml:space="preserve">POST /soc/sessions/{id}/dismiss</w:t>
+      </w:r>
+      <w:r>
+        <w:t xml:space="preserve">) — marks a flag as a reviewed false-positive and clears it from the live board.</w:t>
+      </w:r>
+    </w:p>
     <w:bookmarkEnd w:id="36"/>
-    <w:bookmarkStart w:id="45" w:name="post-quantum-security-layer"/>
+    <w:bookmarkStart w:id="37" w:name="explainable-model-view"/>
+    <w:p>
+      <w:pPr>
+        <w:pStyle w:val="Heading2"/>
+      </w:pPr>
+      <w:r>
+        <w:t xml:space="preserve">Explainable model view</w:t>
+      </w:r>
+    </w:p>
+    <w:p>
+      <w:pPr>
+        <w:pStyle w:val="Compact"/>
+        <w:numPr>
+          <w:ilvl w:val="0"/>
+          <w:numId w:val="1008"/>
+        </w:numPr>
+      </w:pPr>
+      <w:r>
+        <w:rPr>
+          <w:b/>
+          <w:bCs/>
+        </w:rPr>
+        <w:t xml:space="preserve">Model card</w:t>
+      </w:r>
+      <w:r>
+        <w:t xml:space="preserve"> </w:t>
+      </w:r>
+      <w:r>
+        <w:t xml:space="preserve">(</w:t>
+      </w:r>
+      <w:r>
+        <w:rPr>
+          <w:rStyle w:val="VerbatimChar"/>
+        </w:rPr>
+        <w:t xml:space="preserve">GET /soc/sessions/{id}/model</w:t>
+      </w:r>
+      <w:r>
+        <w:t xml:space="preserve">) — the UEBA feature breakdown for the session: each feature’s value, the user’s own baseline, the peer baseline, and its contribution to the anomaly, so an analyst sees</w:t>
+      </w:r>
+      <w:r>
+        <w:t xml:space="preserve"> </w:t>
+      </w:r>
+      <w:r>
+        <w:rPr>
+          <w:i/>
+          <w:iCs/>
+        </w:rPr>
+        <w:t xml:space="preserve">why the model reacted</w:t>
+      </w:r>
+      <w:r>
+        <w:t xml:space="preserve">, not just the number.</w:t>
+      </w:r>
+    </w:p>
+    <w:p>
+      <w:pPr>
+        <w:pStyle w:val="Compact"/>
+        <w:numPr>
+          <w:ilvl w:val="0"/>
+          <w:numId w:val="1008"/>
+        </w:numPr>
+      </w:pPr>
+      <w:r>
+        <w:rPr>
+          <w:b/>
+          <w:bCs/>
+        </w:rPr>
+        <w:t xml:space="preserve">Risk trajectory</w:t>
+      </w:r>
+      <w:r>
+        <w:t xml:space="preserve"> </w:t>
+      </w:r>
+      <w:r>
+        <w:t xml:space="preserve">(</w:t>
+      </w:r>
+      <w:r>
+        <w:rPr>
+          <w:rStyle w:val="VerbatimChar"/>
+        </w:rPr>
+        <w:t xml:space="preserve">GET /soc/sessions/{id}/trajectory</w:t>
+      </w:r>
+      <w:r>
+        <w:t xml:space="preserve">) — the score after each action, rendered as a sparkline, showing exactly where the session crossed a response threshold.</w:t>
+      </w:r>
+    </w:p>
+    <w:p>
+      <w:pPr>
+        <w:pStyle w:val="Compact"/>
+        <w:numPr>
+          <w:ilvl w:val="0"/>
+          <w:numId w:val="1008"/>
+        </w:numPr>
+      </w:pPr>
+      <w:r>
+        <w:rPr>
+          <w:b/>
+          <w:bCs/>
+        </w:rPr>
+        <w:t xml:space="preserve">Impact metrics</w:t>
+      </w:r>
+      <w:r>
+        <w:t xml:space="preserve"> </w:t>
+      </w:r>
+      <w:r>
+        <w:t xml:space="preserve">(</w:t>
+      </w:r>
+      <w:r>
+        <w:rPr>
+          <w:rStyle w:val="VerbatimChar"/>
+        </w:rPr>
+        <w:t xml:space="preserve">GET /soc/metrics</w:t>
+      </w:r>
+      <w:r>
+        <w:t xml:space="preserve">) — a live strip of program impact: sessions watched, threats blocked, money held or flagged, and mean time to decision.</w:t>
+      </w:r>
+    </w:p>
+    <w:bookmarkEnd w:id="37"/>
+    <w:bookmarkEnd w:id="38"/>
+    <w:bookmarkStart w:id="42" w:name="core-banking-operations"/>
     <w:p>
       <w:pPr>
         <w:pStyle w:val="Heading1"/>
       </w:pPr>
       <w:r>
-        <w:rPr>
-          <w:rStyle w:val="SectionNumber"/>
-        </w:rPr>
-        <w:t xml:space="preserve">9</w:t>
-      </w:r>
-      <w:r>
-        <w:tab/>
-      </w:r>
-      <w:r>
-        <w:t xml:space="preserve">Post-Quantum Security Layer</w:t>
+        <w:t xml:space="preserve">Core Banking Operations</w:t>
       </w:r>
     </w:p>
     <w:p>
@@ -3570,19 +3743,29 @@
         <w:pStyle w:val="FirstParagraph"/>
       </w:pPr>
       <w:r>
-        <w:t xml:space="preserve">All post-quantum operations sit behind one abstraction,</w:t>
-      </w:r>
-      <w:r>
-        <w:t xml:space="preserve"> </w:t>
+        <w:t xml:space="preserve">The Employee Portal is a</w:t>
+      </w:r>
+      <w:r>
+        <w:t xml:space="preserve"> </w:t>
+      </w:r>
+      <w:r>
+        <w:rPr>
+          <w:b/>
+          <w:bCs/>
+        </w:rPr>
+        <w:t xml:space="preserve">working core-banking desk</w:t>
+      </w:r>
+      <w:r>
+        <w:t xml:space="preserve">, not a mock: staff open accounts, move money, and clear approvals against a real ledger (</w:t>
       </w:r>
       <w:r>
         <w:rPr>
           <w:rStyle w:val="VerbatimChar"/>
         </w:rPr>
-        <w:t xml:space="preserve">app/security/pqc.py</w:t>
-      </w:r>
-      <w:r>
-        <w:t xml:space="preserve">, exposing</w:t>
+        <w:t xml:space="preserve">BankAccount</w:t>
+      </w:r>
+      <w:r>
+        <w:t xml:space="preserve">,</w:t>
       </w:r>
       <w:r>
         <w:t xml:space="preserve"> </w:t>
@@ -3591,111 +3774,10 @@
         <w:rPr>
           <w:rStyle w:val="VerbatimChar"/>
         </w:rPr>
-        <w:t xml:space="preserve">kem_keypair</w:t>
-      </w:r>
-      <w:r>
-        <w:t xml:space="preserve">,</w:t>
-      </w:r>
-      <w:r>
-        <w:t xml:space="preserve"> </w:t>
-      </w:r>
-      <w:r>
-        <w:rPr>
-          <w:rStyle w:val="VerbatimChar"/>
-        </w:rPr>
-        <w:t xml:space="preserve">kem_encapsulate</w:t>
-      </w:r>
-      <w:r>
-        <w:t xml:space="preserve">,</w:t>
-      </w:r>
-      <w:r>
-        <w:t xml:space="preserve"> </w:t>
-      </w:r>
-      <w:r>
-        <w:rPr>
-          <w:rStyle w:val="VerbatimChar"/>
-        </w:rPr>
-        <w:t xml:space="preserve">kem_decapsulate</w:t>
-      </w:r>
-      <w:r>
-        <w:t xml:space="preserve">,</w:t>
-      </w:r>
-      <w:r>
-        <w:t xml:space="preserve"> </w:t>
-      </w:r>
-      <w:r>
-        <w:rPr>
-          <w:rStyle w:val="VerbatimChar"/>
-        </w:rPr>
-        <w:t xml:space="preserve">sign</w:t>
-      </w:r>
-      <w:r>
-        <w:t xml:space="preserve">, and</w:t>
-      </w:r>
-      <w:r>
-        <w:t xml:space="preserve"> </w:t>
-      </w:r>
-      <w:r>
-        <w:rPr>
-          <w:rStyle w:val="VerbatimChar"/>
-        </w:rPr>
-        <w:t xml:space="preserve">verify</w:t>
-      </w:r>
-      <w:r>
-        <w:t xml:space="preserve"> </w:t>
-      </w:r>
-      <w:r>
-        <w:t xml:space="preserve">over</w:t>
-      </w:r>
-      <w:r>
-        <w:t xml:space="preserve"> </w:t>
-      </w:r>
-      <w:r>
-        <w:rPr>
-          <w:b/>
-          <w:bCs/>
-        </w:rPr>
-        <w:t xml:space="preserve">ML-KEM-768</w:t>
-      </w:r>
-      <w:r>
-        <w:t xml:space="preserve"> </w:t>
-      </w:r>
-      <w:r>
-        <w:t xml:space="preserve">(FIPS 203) and</w:t>
-      </w:r>
-      <w:r>
-        <w:t xml:space="preserve"> </w:t>
-      </w:r>
-      <w:r>
-        <w:rPr>
-          <w:b/>
-          <w:bCs/>
-        </w:rPr>
-        <w:t xml:space="preserve">ML-DSA-65</w:t>
-      </w:r>
-      <w:r>
-        <w:t xml:space="preserve"> </w:t>
-      </w:r>
-      <w:r>
-        <w:t xml:space="preserve">(FIPS 204).</w:t>
-      </w:r>
-    </w:p>
-    <w:bookmarkStart w:id="40" w:name="credential-vault"/>
-    <w:p>
-      <w:pPr>
-        <w:pStyle w:val="Heading2"/>
-      </w:pPr>
-      <w:r>
-        <w:rPr>
-          <w:rStyle w:val="SectionNumber"/>
-        </w:rPr>
-        <w:t xml:space="preserve">9.1</w:t>
-      </w:r>
-      <w:r>
-        <w:tab/>
-      </w:r>
-      <w:r>
-        <w:t xml:space="preserve">Credential vault</w:t>
+        <w:t xml:space="preserve">BankTransaction</w:t>
+      </w:r>
+      <w:r>
+        <w:t xml:space="preserve">). This is what makes insider risk concrete — the same transfer that a portal user submits is the one Prahari scores and, when needed, holds or blocks.</w:t>
       </w:r>
     </w:p>
     <w:p>
@@ -3705,20 +3787,655 @@
       <w:r>
         <w:drawing>
           <wp:inline>
-            <wp:extent cx="5067300" cy="2026919"/>
+            <wp:extent cx="5334000" cy="2219721"/>
             <wp:effectExtent b="0" l="0" r="0" t="0"/>
-            <wp:docPr descr="Credential vault — a secret is sealed with AES-256-GCM under an ML-KEM-768 shared secret." title="" id="38" name="Picture"/>
+            <wp:docPr descr="Core-banking flow — a transfer is checked for fraud and privileged-session risk, then cleared, held for maker-checker, or flagged." title="" id="40" name="Picture"/>
             <a:graphic>
               <a:graphicData uri="http://schemas.openxmlformats.org/drawingml/2006/picture">
                 <pic:pic>
                   <pic:nvPicPr>
-                    <pic:cNvPr descr="img/pqc_vault.png" id="39" name="Picture"/>
+                    <pic:cNvPr descr="img/bank_flow.png" id="41" name="Picture"/>
                     <pic:cNvPicPr>
                       <a:picLocks noChangeArrowheads="1" noChangeAspect="1"/>
                     </pic:cNvPicPr>
                   </pic:nvPicPr>
                   <pic:blipFill>
-                    <a:blip r:embed="rId37"/>
+                    <a:blip r:embed="rId39"/>
+                    <a:stretch>
+                      <a:fillRect/>
+                    </a:stretch>
+                  </pic:blipFill>
+                  <pic:spPr bwMode="auto">
+                    <a:xfrm>
+                      <a:off x="0" y="0"/>
+                      <a:ext cx="5334000" cy="2219721"/>
+                    </a:xfrm>
+                    <a:prstGeom prst="rect">
+                      <a:avLst/>
+                    </a:prstGeom>
+                    <a:noFill/>
+                    <a:ln w="9525">
+                      <a:noFill/>
+                      <a:headEnd/>
+                      <a:tailEnd/>
+                    </a:ln>
+                  </pic:spPr>
+                </pic:pic>
+              </a:graphicData>
+            </a:graphic>
+          </wp:inline>
+        </w:drawing>
+      </w:r>
+    </w:p>
+    <w:p>
+      <w:pPr>
+        <w:pStyle w:val="ImageCaption"/>
+      </w:pPr>
+      <w:r>
+        <w:t xml:space="preserve">Core-banking flow — a transfer is checked for fraud and privileged-session risk, then cleared, held for maker-checker, or flagged.</w:t>
+      </w:r>
+    </w:p>
+    <w:p>
+      <w:pPr>
+        <w:pStyle w:val="BodyText"/>
+      </w:pPr>
+      <w:r>
+        <w:t xml:space="preserve">Every transfer (</w:t>
+      </w:r>
+      <w:r>
+        <w:rPr>
+          <w:rStyle w:val="VerbatimChar"/>
+        </w:rPr>
+        <w:t xml:space="preserve">POST /bank/transfer</w:t>
+      </w:r>
+      <w:r>
+        <w:t xml:space="preserve">) runs three gates in</w:t>
+      </w:r>
+      <w:r>
+        <w:t xml:space="preserve"> </w:t>
+      </w:r>
+      <w:r>
+        <w:rPr>
+          <w:rStyle w:val="VerbatimChar"/>
+        </w:rPr>
+        <w:t xml:space="preserve">app/bank.py</w:t>
+      </w:r>
+      <w:r>
+        <w:t xml:space="preserve"> </w:t>
+      </w:r>
+      <w:r>
+        <w:t xml:space="preserve">before money moves:</w:t>
+      </w:r>
+    </w:p>
+    <w:tbl>
+      <w:tblPr>
+        <w:tblStyle w:val="Table"/>
+        <w:tblW w:type="pct" w:w="5000"/>
+        <w:tblLayout w:type="fixed"/>
+        <w:tblLook w:firstRow="1" w:lastRow="0" w:firstColumn="0" w:lastColumn="0" w:noHBand="0" w:noVBand="0" w:val="0020"/>
+      </w:tblPr>
+      <w:tblGrid>
+        <w:gridCol w:w="2640"/>
+        <w:gridCol w:w="2640"/>
+        <w:gridCol w:w="2640"/>
+      </w:tblGrid>
+      <w:tr>
+        <w:trPr>
+          <w:tblHeader w:val="on"/>
+        </w:trPr>
+        <w:tc>
+          <w:tcPr/>
+          <w:p>
+            <w:pPr>
+              <w:pStyle w:val="Compact"/>
+            </w:pPr>
+            <w:r>
+              <w:t xml:space="preserve">Outcome</w:t>
+            </w:r>
+          </w:p>
+        </w:tc>
+        <w:tc>
+          <w:tcPr/>
+          <w:p>
+            <w:pPr>
+              <w:pStyle w:val="Compact"/>
+            </w:pPr>
+            <w:r>
+              <w:t xml:space="preserve">Trigger</w:t>
+            </w:r>
+          </w:p>
+        </w:tc>
+        <w:tc>
+          <w:tcPr/>
+          <w:p>
+            <w:pPr>
+              <w:pStyle w:val="Compact"/>
+            </w:pPr>
+            <w:r>
+              <w:t xml:space="preserve">Effect</w:t>
+            </w:r>
+          </w:p>
+        </w:tc>
+      </w:tr>
+      <w:tr>
+        <w:tc>
+          <w:tcPr/>
+          <w:p>
+            <w:pPr>
+              <w:pStyle w:val="Compact"/>
+            </w:pPr>
+            <w:r>
+              <w:rPr>
+                <w:b/>
+                <w:bCs/>
+              </w:rPr>
+              <w:t xml:space="preserve">FLAGGED</w:t>
+            </w:r>
+            <w:r>
+              <w:t xml:space="preserve"> </w:t>
+            </w:r>
+            <w:r>
+              <w:t xml:space="preserve">(fraud)</w:t>
+            </w:r>
+          </w:p>
+        </w:tc>
+        <w:tc>
+          <w:tcPr/>
+          <w:p>
+            <w:pPr>
+              <w:pStyle w:val="Compact"/>
+            </w:pPr>
+            <w:r>
+              <w:t xml:space="preserve">watchlisted beneficiary, amount &gt;= Rs 10,00,000, or live session risk &gt;= 70</w:t>
+            </w:r>
+          </w:p>
+        </w:tc>
+        <w:tc>
+          <w:tcPr/>
+          <w:p>
+            <w:pPr>
+              <w:pStyle w:val="Compact"/>
+            </w:pPr>
+            <w:r>
+              <w:t xml:space="preserve">money does</w:t>
+            </w:r>
+            <w:r>
+              <w:t xml:space="preserve"> </w:t>
+            </w:r>
+            <w:r>
+              <w:rPr>
+                <w:b/>
+                <w:bCs/>
+              </w:rPr>
+              <w:t xml:space="preserve">not</w:t>
+            </w:r>
+            <w:r>
+              <w:t xml:space="preserve"> </w:t>
+            </w:r>
+            <w:r>
+              <w:t xml:space="preserve">move; a</w:t>
+            </w:r>
+            <w:r>
+              <w:t xml:space="preserve"> </w:t>
+            </w:r>
+            <w:r>
+              <w:rPr>
+                <w:b/>
+                <w:bCs/>
+              </w:rPr>
+              <w:t xml:space="preserve">CRITICAL</w:t>
+            </w:r>
+            <w:r>
+              <w:t xml:space="preserve"> </w:t>
+            </w:r>
+            <w:r>
+              <w:t xml:space="preserve">alert is raised to the SOC</w:t>
+            </w:r>
+          </w:p>
+        </w:tc>
+      </w:tr>
+      <w:tr>
+        <w:tc>
+          <w:tcPr/>
+          <w:p>
+            <w:pPr>
+              <w:pStyle w:val="Compact"/>
+            </w:pPr>
+            <w:r>
+              <w:rPr>
+                <w:b/>
+                <w:bCs/>
+              </w:rPr>
+              <w:t xml:space="preserve">HELD</w:t>
+            </w:r>
+            <w:r>
+              <w:t xml:space="preserve"> </w:t>
+            </w:r>
+            <w:r>
+              <w:t xml:space="preserve">(maker-checker)</w:t>
+            </w:r>
+          </w:p>
+        </w:tc>
+        <w:tc>
+          <w:tcPr/>
+          <w:p>
+            <w:pPr>
+              <w:pStyle w:val="Compact"/>
+            </w:pPr>
+            <w:r>
+              <w:t xml:space="preserve">amount &gt; Rs 2,00,000</w:t>
+            </w:r>
+          </w:p>
+        </w:tc>
+        <w:tc>
+          <w:tcPr/>
+          <w:p>
+            <w:pPr>
+              <w:pStyle w:val="Compact"/>
+            </w:pPr>
+            <w:r>
+              <w:t xml:space="preserve">money does</w:t>
+            </w:r>
+            <w:r>
+              <w:t xml:space="preserve"> </w:t>
+            </w:r>
+            <w:r>
+              <w:rPr>
+                <w:b/>
+                <w:bCs/>
+              </w:rPr>
+              <w:t xml:space="preserve">not</w:t>
+            </w:r>
+            <w:r>
+              <w:t xml:space="preserve"> </w:t>
+            </w:r>
+            <w:r>
+              <w:t xml:space="preserve">move; queued for a second officer to approve or reject</w:t>
+            </w:r>
+          </w:p>
+        </w:tc>
+      </w:tr>
+      <w:tr>
+        <w:tc>
+          <w:tcPr/>
+          <w:p>
+            <w:pPr>
+              <w:pStyle w:val="Compact"/>
+            </w:pPr>
+            <w:r>
+              <w:rPr>
+                <w:b/>
+                <w:bCs/>
+              </w:rPr>
+              <w:t xml:space="preserve">CLEARED</w:t>
+            </w:r>
+          </w:p>
+        </w:tc>
+        <w:tc>
+          <w:tcPr/>
+          <w:p>
+            <w:pPr>
+              <w:pStyle w:val="Compact"/>
+            </w:pPr>
+            <w:r>
+              <w:t xml:space="preserve">none of the above, sufficient funds, active source account</w:t>
+            </w:r>
+          </w:p>
+        </w:tc>
+        <w:tc>
+          <w:tcPr/>
+          <w:p>
+            <w:pPr>
+              <w:pStyle w:val="Compact"/>
+            </w:pPr>
+            <w:r>
+              <w:t xml:space="preserve">money moves immediately</w:t>
+            </w:r>
+          </w:p>
+        </w:tc>
+      </w:tr>
+    </w:tbl>
+    <w:p>
+      <w:pPr>
+        <w:pStyle w:val="BodyText"/>
+      </w:pPr>
+      <w:r>
+        <w:t xml:space="preserve">Insufficient funds or a frozen source account are refused outright. Held transfers settle only on</w:t>
+      </w:r>
+      <w:r>
+        <w:t xml:space="preserve"> </w:t>
+      </w:r>
+      <w:r>
+        <w:rPr>
+          <w:rStyle w:val="VerbatimChar"/>
+        </w:rPr>
+        <w:t xml:space="preserve">POST /bank/transactions/{id}/approve</w:t>
+      </w:r>
+      <w:r>
+        <w:t xml:space="preserve"> </w:t>
+      </w:r>
+      <w:r>
+        <w:t xml:space="preserve">(a different officer) and reverse on</w:t>
+      </w:r>
+      <w:r>
+        <w:t xml:space="preserve"> </w:t>
+      </w:r>
+      <w:r>
+        <w:rPr>
+          <w:rStyle w:val="VerbatimChar"/>
+        </w:rPr>
+        <w:t xml:space="preserve">.../reject</w:t>
+      </w:r>
+      <w:r>
+        <w:t xml:space="preserve">. A high-value or fraudulent transfer</w:t>
+      </w:r>
+      <w:r>
+        <w:t xml:space="preserve"> </w:t>
+      </w:r>
+      <w:r>
+        <w:rPr>
+          <w:b/>
+          <w:bCs/>
+        </w:rPr>
+        <w:t xml:space="preserve">flashes a banner</w:t>
+      </w:r>
+      <w:r>
+        <w:t xml:space="preserve"> </w:t>
+      </w:r>
+      <w:r>
+        <w:t xml:space="preserve">in the portal and surfaces as a typed alert in the SOC, closing the loop between the banking floor and the analyst.</w:t>
+      </w:r>
+    </w:p>
+    <w:bookmarkEnd w:id="42"/>
+    <w:bookmarkStart w:id="51" w:name="post-quantum-security-layer"/>
+    <w:p>
+      <w:pPr>
+        <w:pStyle w:val="Heading1"/>
+      </w:pPr>
+      <w:r>
+        <w:t xml:space="preserve">Post-Quantum Security Layer</w:t>
+      </w:r>
+    </w:p>
+    <w:p>
+      <w:pPr>
+        <w:pStyle w:val="FirstParagraph"/>
+      </w:pPr>
+      <w:r>
+        <w:t xml:space="preserve">All post-quantum operations sit behind one abstraction,</w:t>
+      </w:r>
+      <w:r>
+        <w:t xml:space="preserve"> </w:t>
+      </w:r>
+      <w:r>
+        <w:rPr>
+          <w:rStyle w:val="VerbatimChar"/>
+        </w:rPr>
+        <w:t xml:space="preserve">app/security/pqc.py</w:t>
+      </w:r>
+      <w:r>
+        <w:t xml:space="preserve">, exposing</w:t>
+      </w:r>
+      <w:r>
+        <w:t xml:space="preserve"> </w:t>
+      </w:r>
+      <w:r>
+        <w:rPr>
+          <w:rStyle w:val="VerbatimChar"/>
+        </w:rPr>
+        <w:t xml:space="preserve">kem_keypair</w:t>
+      </w:r>
+      <w:r>
+        <w:t xml:space="preserve">,</w:t>
+      </w:r>
+      <w:r>
+        <w:t xml:space="preserve"> </w:t>
+      </w:r>
+      <w:r>
+        <w:rPr>
+          <w:rStyle w:val="VerbatimChar"/>
+        </w:rPr>
+        <w:t xml:space="preserve">kem_encapsulate</w:t>
+      </w:r>
+      <w:r>
+        <w:t xml:space="preserve">,</w:t>
+      </w:r>
+      <w:r>
+        <w:t xml:space="preserve"> </w:t>
+      </w:r>
+      <w:r>
+        <w:rPr>
+          <w:rStyle w:val="VerbatimChar"/>
+        </w:rPr>
+        <w:t xml:space="preserve">kem_decapsulate</w:t>
+      </w:r>
+      <w:r>
+        <w:t xml:space="preserve">,</w:t>
+      </w:r>
+      <w:r>
+        <w:t xml:space="preserve"> </w:t>
+      </w:r>
+      <w:r>
+        <w:rPr>
+          <w:rStyle w:val="VerbatimChar"/>
+        </w:rPr>
+        <w:t xml:space="preserve">sign</w:t>
+      </w:r>
+      <w:r>
+        <w:t xml:space="preserve">, and</w:t>
+      </w:r>
+      <w:r>
+        <w:t xml:space="preserve"> </w:t>
+      </w:r>
+      <w:r>
+        <w:rPr>
+          <w:rStyle w:val="VerbatimChar"/>
+        </w:rPr>
+        <w:t xml:space="preserve">verify</w:t>
+      </w:r>
+      <w:r>
+        <w:t xml:space="preserve"> </w:t>
+      </w:r>
+      <w:r>
+        <w:t xml:space="preserve">over</w:t>
+      </w:r>
+      <w:r>
+        <w:t xml:space="preserve"> </w:t>
+      </w:r>
+      <w:r>
+        <w:rPr>
+          <w:b/>
+          <w:bCs/>
+        </w:rPr>
+        <w:t xml:space="preserve">ML-KEM-768</w:t>
+      </w:r>
+      <w:r>
+        <w:t xml:space="preserve"> </w:t>
+      </w:r>
+      <w:r>
+        <w:t xml:space="preserve">(FIPS 203) and</w:t>
+      </w:r>
+      <w:r>
+        <w:t xml:space="preserve"> </w:t>
+      </w:r>
+      <w:r>
+        <w:rPr>
+          <w:b/>
+          <w:bCs/>
+        </w:rPr>
+        <w:t xml:space="preserve">ML-DSA-65</w:t>
+      </w:r>
+      <w:r>
+        <w:t xml:space="preserve"> </w:t>
+      </w:r>
+      <w:r>
+        <w:t xml:space="preserve">(FIPS 204).</w:t>
+      </w:r>
+    </w:p>
+    <w:p>
+      <w:pPr>
+        <w:pStyle w:val="BodyText"/>
+      </w:pPr>
+      <w:r>
+        <w:rPr>
+          <w:b/>
+          <w:bCs/>
+        </w:rPr>
+        <w:t xml:space="preserve">Portable by design — no compiler required.</w:t>
+      </w:r>
+      <w:r>
+        <w:t xml:space="preserve"> </w:t>
+      </w:r>
+      <w:r>
+        <w:t xml:space="preserve">The module selects a provider at import time: a</w:t>
+      </w:r>
+      <w:r>
+        <w:t xml:space="preserve"> </w:t>
+      </w:r>
+      <w:r>
+        <w:rPr>
+          <w:b/>
+          <w:bCs/>
+        </w:rPr>
+        <w:t xml:space="preserve">native liboqs</w:t>
+      </w:r>
+      <w:r>
+        <w:t xml:space="preserve"> </w:t>
+      </w:r>
+      <w:r>
+        <w:t xml:space="preserve">binding if one is installed, otherwise a</w:t>
+      </w:r>
+      <w:r>
+        <w:t xml:space="preserve"> </w:t>
+      </w:r>
+      <w:r>
+        <w:rPr>
+          <w:b/>
+          <w:bCs/>
+        </w:rPr>
+        <w:t xml:space="preserve">pure-Python</w:t>
+      </w:r>
+      <w:r>
+        <w:t xml:space="preserve"> </w:t>
+      </w:r>
+      <w:r>
+        <w:t xml:space="preserve">implementation (</w:t>
+      </w:r>
+      <w:r>
+        <w:rPr>
+          <w:rStyle w:val="VerbatimChar"/>
+        </w:rPr>
+        <w:t xml:space="preserve">kyber-py</w:t>
+      </w:r>
+      <w:r>
+        <w:t xml:space="preserve"> </w:t>
+      </w:r>
+      <w:r>
+        <w:t xml:space="preserve">/</w:t>
+      </w:r>
+      <w:r>
+        <w:t xml:space="preserve"> </w:t>
+      </w:r>
+      <w:r>
+        <w:rPr>
+          <w:rStyle w:val="VerbatimChar"/>
+        </w:rPr>
+        <w:t xml:space="preserve">dilithium-py</w:t>
+      </w:r>
+      <w:r>
+        <w:t xml:space="preserve">). Nothing to build, no C toolchain, no</w:t>
+      </w:r>
+      <w:r>
+        <w:t xml:space="preserve"> </w:t>
+      </w:r>
+      <w:r>
+        <w:rPr>
+          <w:rStyle w:val="VerbatimChar"/>
+        </w:rPr>
+        <w:t xml:space="preserve">cmake</w:t>
+      </w:r>
+      <w:r>
+        <w:t xml:space="preserve"> </w:t>
+      </w:r>
+      <w:r>
+        <w:t xml:space="preserve">— so a teammate cloning the repo never hits the</w:t>
+      </w:r>
+      <w:r>
+        <w:t xml:space="preserve"> </w:t>
+      </w:r>
+      <w:r>
+        <w:rPr>
+          <w:i/>
+          <w:iCs/>
+        </w:rPr>
+        <w:t xml:space="preserve">“No oqs shared libraries found”</w:t>
+      </w:r>
+      <w:r>
+        <w:t xml:space="preserve"> </w:t>
+      </w:r>
+      <w:r>
+        <w:t xml:space="preserve">wall.</w:t>
+      </w:r>
+      <w:r>
+        <w:t xml:space="preserve"> </w:t>
+      </w:r>
+      <w:r>
+        <w:rPr>
+          <w:rStyle w:val="VerbatimChar"/>
+        </w:rPr>
+        <w:t xml:space="preserve">GET /pqc/info</w:t>
+      </w:r>
+      <w:r>
+        <w:t xml:space="preserve"> </w:t>
+      </w:r>
+      <w:r>
+        <w:t xml:space="preserve">reports the active provider, and</w:t>
+      </w:r>
+      <w:r>
+        <w:t xml:space="preserve"> </w:t>
+      </w:r>
+      <w:r>
+        <w:rPr>
+          <w:rStyle w:val="VerbatimChar"/>
+        </w:rPr>
+        <w:t xml:space="preserve">PRAHARI_PQC=pure</w:t>
+      </w:r>
+      <w:r>
+        <w:t xml:space="preserve"> </w:t>
+      </w:r>
+      <w:r>
+        <w:t xml:space="preserve">forces the fallback for a reproducible demo. The two providers are interchangeable and the same FIPS algorithms and test suite cover both.</w:t>
+      </w:r>
+    </w:p>
+    <w:bookmarkStart w:id="46" w:name="credential-vault"/>
+    <w:p>
+      <w:pPr>
+        <w:pStyle w:val="Heading2"/>
+      </w:pPr>
+      <w:r>
+        <w:t xml:space="preserve">Credential vault</w:t>
+      </w:r>
+    </w:p>
+    <w:p>
+      <w:pPr>
+        <w:pStyle w:val="CaptionedFigure"/>
+      </w:pPr>
+      <w:r>
+        <w:drawing>
+          <wp:inline>
+            <wp:extent cx="5067300" cy="2026919"/>
+            <wp:effectExtent b="0" l="0" r="0" t="0"/>
+            <wp:docPr descr="Credential vault — a secret is sealed with AES-256-GCM under an ML-KEM-768 shared secret." title="" id="44" name="Picture"/>
+            <a:graphic>
+              <a:graphicData uri="http://schemas.openxmlformats.org/drawingml/2006/picture">
+                <pic:pic>
+                  <pic:nvPicPr>
+                    <pic:cNvPr descr="img/pqc_vault.png" id="45" name="Picture"/>
+                    <pic:cNvPicPr>
+                      <a:picLocks noChangeArrowheads="1" noChangeAspect="1"/>
+                    </pic:cNvPicPr>
+                  </pic:nvPicPr>
+                  <pic:blipFill>
+                    <a:blip r:embed="rId43"/>
                     <a:stretch>
                       <a:fillRect/>
                     </a:stretch>
@@ -3777,21 +4494,12 @@
         <w:t xml:space="preserve">the ML-KEM shared secret; decryption requires the vault’s KEM secret key. Data recorded today cannot be decrypted later, even by a quantum adversary.</w:t>
       </w:r>
     </w:p>
-    <w:bookmarkEnd w:id="40"/>
-    <w:bookmarkStart w:id="44" w:name="tamper-evident-audit-log"/>
+    <w:bookmarkEnd w:id="46"/>
+    <w:bookmarkStart w:id="50" w:name="tamper-evident-audit-log"/>
     <w:p>
       <w:pPr>
         <w:pStyle w:val="Heading2"/>
       </w:pPr>
-      <w:r>
-        <w:rPr>
-          <w:rStyle w:val="SectionNumber"/>
-        </w:rPr>
-        <w:t xml:space="preserve">9.2</w:t>
-      </w:r>
-      <w:r>
-        <w:tab/>
-      </w:r>
       <w:r>
         <w:t xml:space="preserve">Tamper-evident audit log</w:t>
       </w:r>
@@ -3805,18 +4513,18 @@
           <wp:inline>
             <wp:extent cx="5067300" cy="2026919"/>
             <wp:effectExtent b="0" l="0" r="0" t="0"/>
-            <wp:docPr descr="Audit chain — each entry hash-links the previous and is ML-DSA-65 signed; any edit fails verification." title="" id="42" name="Picture"/>
+            <wp:docPr descr="Audit chain — each entry hash-links the previous and is ML-DSA-65 signed; any edit fails verification." title="" id="48" name="Picture"/>
             <a:graphic>
               <a:graphicData uri="http://schemas.openxmlformats.org/drawingml/2006/picture">
                 <pic:pic>
                   <pic:nvPicPr>
-                    <pic:cNvPr descr="img/audit_chain.png" id="43" name="Picture"/>
+                    <pic:cNvPr descr="img/audit_chain.png" id="49" name="Picture"/>
                     <pic:cNvPicPr>
                       <a:picLocks noChangeArrowheads="1" noChangeAspect="1"/>
                     </pic:cNvPicPr>
                   </pic:nvPicPr>
                   <pic:blipFill>
-                    <a:blip r:embed="rId41"/>
+                    <a:blip r:embed="rId47"/>
                     <a:stretch>
                       <a:fillRect/>
                     </a:stretch>
@@ -3905,22 +4613,13 @@
         <w:t xml:space="preserve">then fails at the exact entry.</w:t>
       </w:r>
     </w:p>
-    <w:bookmarkEnd w:id="44"/>
-    <w:bookmarkEnd w:id="45"/>
-    <w:bookmarkStart w:id="46" w:name="authentication-and-authorization"/>
+    <w:bookmarkEnd w:id="50"/>
+    <w:bookmarkEnd w:id="51"/>
+    <w:bookmarkStart w:id="52" w:name="authentication-and-authorization"/>
     <w:p>
       <w:pPr>
         <w:pStyle w:val="Heading1"/>
       </w:pPr>
-      <w:r>
-        <w:rPr>
-          <w:rStyle w:val="SectionNumber"/>
-        </w:rPr>
-        <w:t xml:space="preserve">10</w:t>
-      </w:r>
-      <w:r>
-        <w:tab/>
-      </w:r>
       <w:r>
         <w:t xml:space="preserve">Authentication and Authorization</w:t>
       </w:r>
@@ -3930,7 +4629,7 @@
         <w:pStyle w:val="Compact"/>
         <w:numPr>
           <w:ilvl w:val="0"/>
-          <w:numId w:val="1007"/>
+          <w:numId w:val="1009"/>
         </w:numPr>
       </w:pPr>
       <w:r>
@@ -3964,7 +4663,7 @@
         <w:pStyle w:val="Compact"/>
         <w:numPr>
           <w:ilvl w:val="0"/>
-          <w:numId w:val="1007"/>
+          <w:numId w:val="1009"/>
         </w:numPr>
       </w:pPr>
       <w:r>
@@ -3986,7 +4685,7 @@
         <w:pStyle w:val="Compact"/>
         <w:numPr>
           <w:ilvl w:val="0"/>
-          <w:numId w:val="1007"/>
+          <w:numId w:val="1009"/>
         </w:numPr>
       </w:pPr>
       <w:r>
@@ -4056,21 +4755,12 @@
         <w:t xml:space="preserve">This layer is demo-grade by design; a production deployment swaps in the bank’s IdP/SSO behind the same dependency.</w:t>
       </w:r>
     </w:p>
-    <w:bookmarkEnd w:id="46"/>
-    <w:bookmarkStart w:id="47" w:name="api-reference"/>
+    <w:bookmarkEnd w:id="52"/>
+    <w:bookmarkStart w:id="53" w:name="api-reference"/>
     <w:p>
       <w:pPr>
         <w:pStyle w:val="Heading1"/>
       </w:pPr>
-      <w:r>
-        <w:rPr>
-          <w:rStyle w:val="SectionNumber"/>
-        </w:rPr>
-        <w:t xml:space="preserve">11</w:t>
-      </w:r>
-      <w:r>
-        <w:tab/>
-      </w:r>
       <w:r>
         <w:t xml:space="preserve">API Reference</w:t>
       </w:r>
@@ -4684,7 +5374,7 @@
               <w:pStyle w:val="Compact"/>
             </w:pPr>
             <w:r>
-              <w:t xml:space="preserve">maker-checker approval</w:t>
+              <w:t xml:space="preserve">approve / clear a held session</w:t>
             </w:r>
           </w:p>
         </w:tc>
@@ -4708,7 +5398,7 @@
               <w:pStyle w:val="Compact"/>
             </w:pPr>
             <w:r>
-              <w:t xml:space="preserve">/demo/scenario/{kind}</w:t>
+              <w:t xml:space="preserve">/soc/sessions/{id}/lock</w:t>
             </w:r>
           </w:p>
         </w:tc>
@@ -4730,7 +5420,7 @@
               <w:pStyle w:val="Compact"/>
             </w:pPr>
             <w:r>
-              <w:t xml:space="preserve">run scripted malicious / compromised / negligent</w:t>
+              <w:t xml:space="preserve">force-block session + disable account</w:t>
             </w:r>
           </w:p>
         </w:tc>
@@ -4754,7 +5444,7 @@
               <w:pStyle w:val="Compact"/>
             </w:pPr>
             <w:r>
-              <w:t xml:space="preserve">/demo/tamper</w:t>
+              <w:t xml:space="preserve">/soc/sessions/{id}/dismiss</w:t>
             </w:r>
           </w:p>
         </w:tc>
@@ -4776,7 +5466,7 @@
               <w:pStyle w:val="Compact"/>
             </w:pPr>
             <w:r>
-              <w:t xml:space="preserve">edit an audit entry (proves detection)</w:t>
+              <w:t xml:space="preserve">mark a flag reviewed (false-positive)</w:t>
             </w:r>
           </w:p>
         </w:tc>
@@ -4800,7 +5490,7 @@
               <w:pStyle w:val="Compact"/>
             </w:pPr>
             <w:r>
-              <w:t xml:space="preserve">/audit, /audit/verify</w:t>
+              <w:t xml:space="preserve">/soc/sessions/{id}/model</w:t>
             </w:r>
           </w:p>
         </w:tc>
@@ -4822,7 +5512,7 @@
               <w:pStyle w:val="Compact"/>
             </w:pPr>
             <w:r>
-              <w:t xml:space="preserve">list / verify the signed chain</w:t>
+              <w:t xml:space="preserve">UEBA feature breakdown (explainable)</w:t>
             </w:r>
           </w:p>
         </w:tc>
@@ -4846,29 +5536,29 @@
               <w:pStyle w:val="Compact"/>
             </w:pPr>
             <w:r>
-              <w:t xml:space="preserve">/pqc/info</w:t>
-            </w:r>
-          </w:p>
-        </w:tc>
-        <w:tc>
-          <w:tcPr/>
-          <w:p>
-            <w:pPr>
-              <w:pStyle w:val="Compact"/>
-            </w:pPr>
-            <w:r>
-              <w:t xml:space="preserve">any</w:t>
-            </w:r>
-          </w:p>
-        </w:tc>
-        <w:tc>
-          <w:tcPr/>
-          <w:p>
-            <w:pPr>
-              <w:pStyle w:val="Compact"/>
-            </w:pPr>
-            <w:r>
-              <w:t xml:space="preserve">active PQC provider and algorithms</w:t>
+              <w:t xml:space="preserve">/soc/sessions/{id}/trajectory</w:t>
+            </w:r>
+          </w:p>
+        </w:tc>
+        <w:tc>
+          <w:tcPr/>
+          <w:p>
+            <w:pPr>
+              <w:pStyle w:val="Compact"/>
+            </w:pPr>
+            <w:r>
+              <w:t xml:space="preserve">analyst</w:t>
+            </w:r>
+          </w:p>
+        </w:tc>
+        <w:tc>
+          <w:tcPr/>
+          <w:p>
+            <w:pPr>
+              <w:pStyle w:val="Compact"/>
+            </w:pPr>
+            <w:r>
+              <w:t xml:space="preserve">per-action score trajectory</w:t>
             </w:r>
           </w:p>
         </w:tc>
@@ -4881,18 +5571,18 @@
               <w:pStyle w:val="Compact"/>
             </w:pPr>
             <w:r>
-              <w:t xml:space="preserve">POST, GET</w:t>
-            </w:r>
-          </w:p>
-        </w:tc>
-        <w:tc>
-          <w:tcPr/>
-          <w:p>
-            <w:pPr>
-              <w:pStyle w:val="Compact"/>
-            </w:pPr>
-            <w:r>
-              <w:t xml:space="preserve">/vault/secrets</w:t>
+              <w:t xml:space="preserve">GET</w:t>
+            </w:r>
+          </w:p>
+        </w:tc>
+        <w:tc>
+          <w:tcPr/>
+          <w:p>
+            <w:pPr>
+              <w:pStyle w:val="Compact"/>
+            </w:pPr>
+            <w:r>
+              <w:t xml:space="preserve">/soc/metrics</w:t>
             </w:r>
           </w:p>
         </w:tc>
@@ -4914,7 +5604,7 @@
               <w:pStyle w:val="Compact"/>
             </w:pPr>
             <w:r>
-              <w:t xml:space="preserve">store / retrieve a PQC-wrapped secret</w:t>
+              <w:t xml:space="preserve">live impact metrics strip</w:t>
             </w:r>
           </w:p>
         </w:tc>
@@ -4927,40 +5617,40 @@
               <w:pStyle w:val="Compact"/>
             </w:pPr>
             <w:r>
-              <w:t xml:space="preserve">WS</w:t>
-            </w:r>
-          </w:p>
-        </w:tc>
-        <w:tc>
-          <w:tcPr/>
-          <w:p>
-            <w:pPr>
-              <w:pStyle w:val="Compact"/>
-            </w:pPr>
-            <w:r>
-              <w:t xml:space="preserve">/ws/feed</w:t>
-            </w:r>
-          </w:p>
-        </w:tc>
-        <w:tc>
-          <w:tcPr/>
-          <w:p>
-            <w:pPr>
-              <w:pStyle w:val="Compact"/>
-            </w:pPr>
-            <w:r>
-              <w:t xml:space="preserve">–</w:t>
-            </w:r>
-          </w:p>
-        </w:tc>
-        <w:tc>
-          <w:tcPr/>
-          <w:p>
-            <w:pPr>
-              <w:pStyle w:val="Compact"/>
-            </w:pPr>
-            <w:r>
-              <w:t xml:space="preserve">live activity / alert / tamper frames</w:t>
+              <w:t xml:space="preserve">GET</w:t>
+            </w:r>
+          </w:p>
+        </w:tc>
+        <w:tc>
+          <w:tcPr/>
+          <w:p>
+            <w:pPr>
+              <w:pStyle w:val="Compact"/>
+            </w:pPr>
+            <w:r>
+              <w:t xml:space="preserve">/bank/accounts, /transactions</w:t>
+            </w:r>
+          </w:p>
+        </w:tc>
+        <w:tc>
+          <w:tcPr/>
+          <w:p>
+            <w:pPr>
+              <w:pStyle w:val="Compact"/>
+            </w:pPr>
+            <w:r>
+              <w:t xml:space="preserve">employee</w:t>
+            </w:r>
+          </w:p>
+        </w:tc>
+        <w:tc>
+          <w:tcPr/>
+          <w:p>
+            <w:pPr>
+              <w:pStyle w:val="Compact"/>
+            </w:pPr>
+            <w:r>
+              <w:t xml:space="preserve">account list / ledger</w:t>
             </w:r>
           </w:p>
         </w:tc>
@@ -4984,6 +5674,466 @@
               <w:pStyle w:val="Compact"/>
             </w:pPr>
             <w:r>
+              <w:t xml:space="preserve">/bank/pending, /beneficiaries</w:t>
+            </w:r>
+          </w:p>
+        </w:tc>
+        <w:tc>
+          <w:tcPr/>
+          <w:p>
+            <w:pPr>
+              <w:pStyle w:val="Compact"/>
+            </w:pPr>
+            <w:r>
+              <w:t xml:space="preserve">employee</w:t>
+            </w:r>
+          </w:p>
+        </w:tc>
+        <w:tc>
+          <w:tcPr/>
+          <w:p>
+            <w:pPr>
+              <w:pStyle w:val="Compact"/>
+            </w:pPr>
+            <w:r>
+              <w:t xml:space="preserve">held queue / payees</w:t>
+            </w:r>
+          </w:p>
+        </w:tc>
+      </w:tr>
+      <w:tr>
+        <w:tc>
+          <w:tcPr/>
+          <w:p>
+            <w:pPr>
+              <w:pStyle w:val="Compact"/>
+            </w:pPr>
+            <w:r>
+              <w:t xml:space="preserve">POST</w:t>
+            </w:r>
+          </w:p>
+        </w:tc>
+        <w:tc>
+          <w:tcPr/>
+          <w:p>
+            <w:pPr>
+              <w:pStyle w:val="Compact"/>
+            </w:pPr>
+            <w:r>
+              <w:t xml:space="preserve">/bank/transfer</w:t>
+            </w:r>
+          </w:p>
+        </w:tc>
+        <w:tc>
+          <w:tcPr/>
+          <w:p>
+            <w:pPr>
+              <w:pStyle w:val="Compact"/>
+            </w:pPr>
+            <w:r>
+              <w:t xml:space="preserve">employee</w:t>
+            </w:r>
+          </w:p>
+        </w:tc>
+        <w:tc>
+          <w:tcPr/>
+          <w:p>
+            <w:pPr>
+              <w:pStyle w:val="Compact"/>
+            </w:pPr>
+            <w:r>
+              <w:t xml:space="preserve">submit a transfer -&gt; fraud + risk gated</w:t>
+            </w:r>
+          </w:p>
+        </w:tc>
+      </w:tr>
+      <w:tr>
+        <w:tc>
+          <w:tcPr/>
+          <w:p>
+            <w:pPr>
+              <w:pStyle w:val="Compact"/>
+            </w:pPr>
+            <w:r>
+              <w:t xml:space="preserve">POST</w:t>
+            </w:r>
+          </w:p>
+        </w:tc>
+        <w:tc>
+          <w:tcPr/>
+          <w:p>
+            <w:pPr>
+              <w:pStyle w:val="Compact"/>
+            </w:pPr>
+            <w:r>
+              <w:t xml:space="preserve">/bank/transactions/{id}/approve</w:t>
+            </w:r>
+          </w:p>
+        </w:tc>
+        <w:tc>
+          <w:tcPr/>
+          <w:p>
+            <w:pPr>
+              <w:pStyle w:val="Compact"/>
+            </w:pPr>
+            <w:r>
+              <w:t xml:space="preserve">employee</w:t>
+            </w:r>
+          </w:p>
+        </w:tc>
+        <w:tc>
+          <w:tcPr/>
+          <w:p>
+            <w:pPr>
+              <w:pStyle w:val="Compact"/>
+            </w:pPr>
+            <w:r>
+              <w:t xml:space="preserve">settle a held transfer (second officer)</w:t>
+            </w:r>
+          </w:p>
+        </w:tc>
+      </w:tr>
+      <w:tr>
+        <w:tc>
+          <w:tcPr/>
+          <w:p>
+            <w:pPr>
+              <w:pStyle w:val="Compact"/>
+            </w:pPr>
+            <w:r>
+              <w:t xml:space="preserve">POST</w:t>
+            </w:r>
+          </w:p>
+        </w:tc>
+        <w:tc>
+          <w:tcPr/>
+          <w:p>
+            <w:pPr>
+              <w:pStyle w:val="Compact"/>
+            </w:pPr>
+            <w:r>
+              <w:t xml:space="preserve">/bank/transactions/{id}/reject</w:t>
+            </w:r>
+          </w:p>
+        </w:tc>
+        <w:tc>
+          <w:tcPr/>
+          <w:p>
+            <w:pPr>
+              <w:pStyle w:val="Compact"/>
+            </w:pPr>
+            <w:r>
+              <w:t xml:space="preserve">employee</w:t>
+            </w:r>
+          </w:p>
+        </w:tc>
+        <w:tc>
+          <w:tcPr/>
+          <w:p>
+            <w:pPr>
+              <w:pStyle w:val="Compact"/>
+            </w:pPr>
+            <w:r>
+              <w:t xml:space="preserve">reverse a held transfer</w:t>
+            </w:r>
+          </w:p>
+        </w:tc>
+      </w:tr>
+      <w:tr>
+        <w:tc>
+          <w:tcPr/>
+          <w:p>
+            <w:pPr>
+              <w:pStyle w:val="Compact"/>
+            </w:pPr>
+            <w:r>
+              <w:t xml:space="preserve">POST</w:t>
+            </w:r>
+          </w:p>
+        </w:tc>
+        <w:tc>
+          <w:tcPr/>
+          <w:p>
+            <w:pPr>
+              <w:pStyle w:val="Compact"/>
+            </w:pPr>
+            <w:r>
+              <w:t xml:space="preserve">/demo/scenario/{kind}</w:t>
+            </w:r>
+          </w:p>
+        </w:tc>
+        <w:tc>
+          <w:tcPr/>
+          <w:p>
+            <w:pPr>
+              <w:pStyle w:val="Compact"/>
+            </w:pPr>
+            <w:r>
+              <w:t xml:space="preserve">analyst</w:t>
+            </w:r>
+          </w:p>
+        </w:tc>
+        <w:tc>
+          <w:tcPr/>
+          <w:p>
+            <w:pPr>
+              <w:pStyle w:val="Compact"/>
+            </w:pPr>
+            <w:r>
+              <w:t xml:space="preserve">run scripted malicious / compromised / negligent</w:t>
+            </w:r>
+          </w:p>
+        </w:tc>
+      </w:tr>
+      <w:tr>
+        <w:tc>
+          <w:tcPr/>
+          <w:p>
+            <w:pPr>
+              <w:pStyle w:val="Compact"/>
+            </w:pPr>
+            <w:r>
+              <w:t xml:space="preserve">POST</w:t>
+            </w:r>
+          </w:p>
+        </w:tc>
+        <w:tc>
+          <w:tcPr/>
+          <w:p>
+            <w:pPr>
+              <w:pStyle w:val="Compact"/>
+            </w:pPr>
+            <w:r>
+              <w:t xml:space="preserve">/demo/tamper</w:t>
+            </w:r>
+          </w:p>
+        </w:tc>
+        <w:tc>
+          <w:tcPr/>
+          <w:p>
+            <w:pPr>
+              <w:pStyle w:val="Compact"/>
+            </w:pPr>
+            <w:r>
+              <w:t xml:space="preserve">analyst</w:t>
+            </w:r>
+          </w:p>
+        </w:tc>
+        <w:tc>
+          <w:tcPr/>
+          <w:p>
+            <w:pPr>
+              <w:pStyle w:val="Compact"/>
+            </w:pPr>
+            <w:r>
+              <w:t xml:space="preserve">edit an audit entry (proves detection)</w:t>
+            </w:r>
+          </w:p>
+        </w:tc>
+      </w:tr>
+      <w:tr>
+        <w:tc>
+          <w:tcPr/>
+          <w:p>
+            <w:pPr>
+              <w:pStyle w:val="Compact"/>
+            </w:pPr>
+            <w:r>
+              <w:t xml:space="preserve">GET</w:t>
+            </w:r>
+          </w:p>
+        </w:tc>
+        <w:tc>
+          <w:tcPr/>
+          <w:p>
+            <w:pPr>
+              <w:pStyle w:val="Compact"/>
+            </w:pPr>
+            <w:r>
+              <w:t xml:space="preserve">/audit, /audit/verify</w:t>
+            </w:r>
+          </w:p>
+        </w:tc>
+        <w:tc>
+          <w:tcPr/>
+          <w:p>
+            <w:pPr>
+              <w:pStyle w:val="Compact"/>
+            </w:pPr>
+            <w:r>
+              <w:t xml:space="preserve">analyst</w:t>
+            </w:r>
+          </w:p>
+        </w:tc>
+        <w:tc>
+          <w:tcPr/>
+          <w:p>
+            <w:pPr>
+              <w:pStyle w:val="Compact"/>
+            </w:pPr>
+            <w:r>
+              <w:t xml:space="preserve">list / verify the signed chain</w:t>
+            </w:r>
+          </w:p>
+        </w:tc>
+      </w:tr>
+      <w:tr>
+        <w:tc>
+          <w:tcPr/>
+          <w:p>
+            <w:pPr>
+              <w:pStyle w:val="Compact"/>
+            </w:pPr>
+            <w:r>
+              <w:t xml:space="preserve">GET</w:t>
+            </w:r>
+          </w:p>
+        </w:tc>
+        <w:tc>
+          <w:tcPr/>
+          <w:p>
+            <w:pPr>
+              <w:pStyle w:val="Compact"/>
+            </w:pPr>
+            <w:r>
+              <w:t xml:space="preserve">/pqc/info</w:t>
+            </w:r>
+          </w:p>
+        </w:tc>
+        <w:tc>
+          <w:tcPr/>
+          <w:p>
+            <w:pPr>
+              <w:pStyle w:val="Compact"/>
+            </w:pPr>
+            <w:r>
+              <w:t xml:space="preserve">any</w:t>
+            </w:r>
+          </w:p>
+        </w:tc>
+        <w:tc>
+          <w:tcPr/>
+          <w:p>
+            <w:pPr>
+              <w:pStyle w:val="Compact"/>
+            </w:pPr>
+            <w:r>
+              <w:t xml:space="preserve">active PQC provider and algorithms</w:t>
+            </w:r>
+          </w:p>
+        </w:tc>
+      </w:tr>
+      <w:tr>
+        <w:tc>
+          <w:tcPr/>
+          <w:p>
+            <w:pPr>
+              <w:pStyle w:val="Compact"/>
+            </w:pPr>
+            <w:r>
+              <w:t xml:space="preserve">POST, GET</w:t>
+            </w:r>
+          </w:p>
+        </w:tc>
+        <w:tc>
+          <w:tcPr/>
+          <w:p>
+            <w:pPr>
+              <w:pStyle w:val="Compact"/>
+            </w:pPr>
+            <w:r>
+              <w:t xml:space="preserve">/vault/secrets</w:t>
+            </w:r>
+          </w:p>
+        </w:tc>
+        <w:tc>
+          <w:tcPr/>
+          <w:p>
+            <w:pPr>
+              <w:pStyle w:val="Compact"/>
+            </w:pPr>
+            <w:r>
+              <w:t xml:space="preserve">analyst</w:t>
+            </w:r>
+          </w:p>
+        </w:tc>
+        <w:tc>
+          <w:tcPr/>
+          <w:p>
+            <w:pPr>
+              <w:pStyle w:val="Compact"/>
+            </w:pPr>
+            <w:r>
+              <w:t xml:space="preserve">store / retrieve a PQC-wrapped secret</w:t>
+            </w:r>
+          </w:p>
+        </w:tc>
+      </w:tr>
+      <w:tr>
+        <w:tc>
+          <w:tcPr/>
+          <w:p>
+            <w:pPr>
+              <w:pStyle w:val="Compact"/>
+            </w:pPr>
+            <w:r>
+              <w:t xml:space="preserve">WS</w:t>
+            </w:r>
+          </w:p>
+        </w:tc>
+        <w:tc>
+          <w:tcPr/>
+          <w:p>
+            <w:pPr>
+              <w:pStyle w:val="Compact"/>
+            </w:pPr>
+            <w:r>
+              <w:t xml:space="preserve">/ws/feed</w:t>
+            </w:r>
+          </w:p>
+        </w:tc>
+        <w:tc>
+          <w:tcPr/>
+          <w:p>
+            <w:pPr>
+              <w:pStyle w:val="Compact"/>
+            </w:pPr>
+            <w:r>
+              <w:t xml:space="preserve">–</w:t>
+            </w:r>
+          </w:p>
+        </w:tc>
+        <w:tc>
+          <w:tcPr/>
+          <w:p>
+            <w:pPr>
+              <w:pStyle w:val="Compact"/>
+            </w:pPr>
+            <w:r>
+              <w:t xml:space="preserve">live activity / alert / tamper frames</w:t>
+            </w:r>
+          </w:p>
+        </w:tc>
+      </w:tr>
+      <w:tr>
+        <w:tc>
+          <w:tcPr/>
+          <w:p>
+            <w:pPr>
+              <w:pStyle w:val="Compact"/>
+            </w:pPr>
+            <w:r>
+              <w:t xml:space="preserve">GET</w:t>
+            </w:r>
+          </w:p>
+        </w:tc>
+        <w:tc>
+          <w:tcPr/>
+          <w:p>
+            <w:pPr>
+              <w:pStyle w:val="Compact"/>
+            </w:pPr>
+            <w:r>
               <w:t xml:space="preserve">/health</w:t>
             </w:r>
           </w:p>
@@ -5035,22 +6185,13 @@
         <w:t xml:space="preserve">(FastAPI / OpenAPI).</w:t>
       </w:r>
     </w:p>
-    <w:bookmarkEnd w:id="47"/>
-    <w:bookmarkStart w:id="48" w:name="frontend"/>
+    <w:bookmarkEnd w:id="53"/>
+    <w:bookmarkStart w:id="54" w:name="frontend"/>
     <w:p>
       <w:pPr>
         <w:pStyle w:val="Heading1"/>
       </w:pPr>
       <w:r>
-        <w:rPr>
-          <w:rStyle w:val="SectionNumber"/>
-        </w:rPr>
-        <w:t xml:space="preserve">12</w:t>
-      </w:r>
-      <w:r>
-        <w:tab/>
-      </w:r>
-      <w:r>
         <w:t xml:space="preserve">Frontend</w:t>
       </w:r>
     </w:p>
@@ -5075,311 +6216,6 @@
       </w:r>
       <w:r>
         <w:t xml:space="preserve">(same-origin, offline).</w:t>
-      </w:r>
-    </w:p>
-    <w:p>
-      <w:pPr>
-        <w:pStyle w:val="Compact"/>
-        <w:numPr>
-          <w:ilvl w:val="0"/>
-          <w:numId w:val="1008"/>
-        </w:numPr>
-      </w:pPr>
-      <w:r>
-        <w:rPr>
-          <w:b/>
-          <w:bCs/>
-        </w:rPr>
-        <w:t xml:space="preserve">Login</w:t>
-      </w:r>
-      <w:r>
-        <w:t xml:space="preserve"> </w:t>
-      </w:r>
-      <w:r>
-        <w:t xml:space="preserve">(</w:t>
-      </w:r>
-      <w:r>
-        <w:rPr>
-          <w:rStyle w:val="VerbatimChar"/>
-        </w:rPr>
-        <w:t xml:space="preserve">pages/Login.jsx</w:t>
-      </w:r>
-      <w:r>
-        <w:t xml:space="preserve">) — role-routed, with a demo-account helper.</w:t>
-      </w:r>
-    </w:p>
-    <w:p>
-      <w:pPr>
-        <w:pStyle w:val="Compact"/>
-        <w:numPr>
-          <w:ilvl w:val="0"/>
-          <w:numId w:val="1008"/>
-        </w:numPr>
-      </w:pPr>
-      <w:r>
-        <w:rPr>
-          <w:b/>
-          <w:bCs/>
-        </w:rPr>
-        <w:t xml:space="preserve">Employee Portal</w:t>
-      </w:r>
-      <w:r>
-        <w:t xml:space="preserve"> </w:t>
-      </w:r>
-      <w:r>
-        <w:t xml:space="preserve">(</w:t>
-      </w:r>
-      <w:r>
-        <w:rPr>
-          <w:rStyle w:val="VerbatimChar"/>
-        </w:rPr>
-        <w:t xml:space="preserve">pages/Portal.jsx</w:t>
-      </w:r>
-      <w:r>
-        <w:t xml:space="preserve">) — action console, connection badge, live risk gauge, activity timeline, MFA modal, maker-checker banner, and a full-screen BLOCK overlay.</w:t>
-      </w:r>
-    </w:p>
-    <w:p>
-      <w:pPr>
-        <w:pStyle w:val="Compact"/>
-        <w:numPr>
-          <w:ilvl w:val="0"/>
-          <w:numId w:val="1008"/>
-        </w:numPr>
-      </w:pPr>
-      <w:r>
-        <w:rPr>
-          <w:b/>
-          <w:bCs/>
-        </w:rPr>
-        <w:t xml:space="preserve">SOC Console</w:t>
-      </w:r>
-      <w:r>
-        <w:t xml:space="preserve"> </w:t>
-      </w:r>
-      <w:r>
-        <w:t xml:space="preserve">(</w:t>
-      </w:r>
-      <w:r>
-        <w:rPr>
-          <w:rStyle w:val="VerbatimChar"/>
-        </w:rPr>
-        <w:t xml:space="preserve">pages/SocConsole.jsx</w:t>
-      </w:r>
-      <w:r>
-        <w:t xml:space="preserve">) — three scenario buttons, an audit banner, and panels: live sessions (typed), risk gauge, why-flagged, alerts (typed), timeline, session recording (terminal replay), heatmap, and access review.</w:t>
-      </w:r>
-    </w:p>
-    <w:p>
-      <w:pPr>
-        <w:pStyle w:val="FirstParagraph"/>
-      </w:pPr>
-      <w:r>
-        <w:t xml:space="preserve">The colour system reserves status colours (good / warning / serious / critical), colour-codes insider types (malicious red, compromised blue, negligent amber), uses tabular numerics, flashes on new alerts, and never encodes meaning by colour alone.</w:t>
-      </w:r>
-    </w:p>
-    <w:bookmarkEnd w:id="48"/>
-    <w:bookmarkStart w:id="49" w:name="security-considerations"/>
-    <w:p>
-      <w:pPr>
-        <w:pStyle w:val="Heading1"/>
-      </w:pPr>
-      <w:r>
-        <w:rPr>
-          <w:rStyle w:val="SectionNumber"/>
-        </w:rPr>
-        <w:t xml:space="preserve">13</w:t>
-      </w:r>
-      <w:r>
-        <w:tab/>
-      </w:r>
-      <w:r>
-        <w:t xml:space="preserve">Security Considerations</w:t>
-      </w:r>
-    </w:p>
-    <w:p>
-      <w:pPr>
-        <w:pStyle w:val="Compact"/>
-        <w:numPr>
-          <w:ilvl w:val="0"/>
-          <w:numId w:val="1009"/>
-        </w:numPr>
-      </w:pPr>
-      <w:r>
-        <w:rPr>
-          <w:b/>
-          <w:bCs/>
-        </w:rPr>
-        <w:t xml:space="preserve">Data minimization</w:t>
-      </w:r>
-      <w:r>
-        <w:t xml:space="preserve"> </w:t>
-      </w:r>
-      <w:r>
-        <w:t xml:space="preserve">— scores on privileged-activity metadata; no customer PII required.</w:t>
-      </w:r>
-    </w:p>
-    <w:p>
-      <w:pPr>
-        <w:pStyle w:val="Compact"/>
-        <w:numPr>
-          <w:ilvl w:val="0"/>
-          <w:numId w:val="1009"/>
-        </w:numPr>
-      </w:pPr>
-      <w:r>
-        <w:rPr>
-          <w:b/>
-          <w:bCs/>
-        </w:rPr>
-        <w:t xml:space="preserve">Credential protection</w:t>
-      </w:r>
-      <w:r>
-        <w:t xml:space="preserve"> </w:t>
-      </w:r>
-      <w:r>
-        <w:t xml:space="preserve">— an ML-KEM-768-wrapped AES-256-GCM vault for privileged secrets.</w:t>
-      </w:r>
-    </w:p>
-    <w:p>
-      <w:pPr>
-        <w:pStyle w:val="Compact"/>
-        <w:numPr>
-          <w:ilvl w:val="0"/>
-          <w:numId w:val="1009"/>
-        </w:numPr>
-      </w:pPr>
-      <w:r>
-        <w:rPr>
-          <w:b/>
-          <w:bCs/>
-        </w:rPr>
-        <w:t xml:space="preserve">Audit integrity</w:t>
-      </w:r>
-      <w:r>
-        <w:t xml:space="preserve"> </w:t>
-      </w:r>
-      <w:r>
-        <w:t xml:space="preserve">— hash-chained and ML-DSA-65-signed entries; tampering is cryptographically evident.</w:t>
-      </w:r>
-    </w:p>
-    <w:p>
-      <w:pPr>
-        <w:pStyle w:val="Compact"/>
-        <w:numPr>
-          <w:ilvl w:val="0"/>
-          <w:numId w:val="1009"/>
-        </w:numPr>
-      </w:pPr>
-      <w:r>
-        <w:rPr>
-          <w:b/>
-          <w:bCs/>
-        </w:rPr>
-        <w:t xml:space="preserve">Enforcement</w:t>
-      </w:r>
-      <w:r>
-        <w:t xml:space="preserve"> </w:t>
-      </w:r>
-      <w:r>
-        <w:t xml:space="preserve">— server-side; blocked accounts stay locked; a challenged action is not persisted until actually allowed (no score-gaming, no bypass by re-login).</w:t>
-      </w:r>
-    </w:p>
-    <w:p>
-      <w:pPr>
-        <w:pStyle w:val="Compact"/>
-        <w:numPr>
-          <w:ilvl w:val="0"/>
-          <w:numId w:val="1009"/>
-        </w:numPr>
-      </w:pPr>
-      <w:r>
-        <w:rPr>
-          <w:b/>
-          <w:bCs/>
-        </w:rPr>
-        <w:t xml:space="preserve">Authorization</w:t>
-      </w:r>
-      <w:r>
-        <w:t xml:space="preserve"> </w:t>
-      </w:r>
-      <w:r>
-        <w:t xml:space="preserve">— role-gated APIs; analyst-only SOC and PQC endpoints.</w:t>
-      </w:r>
-    </w:p>
-    <w:p>
-      <w:pPr>
-        <w:pStyle w:val="Compact"/>
-        <w:numPr>
-          <w:ilvl w:val="0"/>
-          <w:numId w:val="1009"/>
-        </w:numPr>
-      </w:pPr>
-      <w:r>
-        <w:rPr>
-          <w:b/>
-          <w:bCs/>
-        </w:rPr>
-        <w:t xml:space="preserve">Offline by design</w:t>
-      </w:r>
-      <w:r>
-        <w:t xml:space="preserve"> </w:t>
-      </w:r>
-      <w:r>
-        <w:t xml:space="preserve">— no external calls at runtime; keys kept out of version control;</w:t>
-      </w:r>
-      <w:r>
-        <w:t xml:space="preserve"> </w:t>
-      </w:r>
-      <w:r>
-        <w:rPr>
-          <w:rStyle w:val="VerbatimChar"/>
-        </w:rPr>
-        <w:t xml:space="preserve">.env</w:t>
-      </w:r>
-      <w:r>
-        <w:t xml:space="preserve">-driven configuration; least-privilege demo accounts.</w:t>
-      </w:r>
-    </w:p>
-    <w:p>
-      <w:pPr>
-        <w:pStyle w:val="Compact"/>
-        <w:numPr>
-          <w:ilvl w:val="0"/>
-          <w:numId w:val="1009"/>
-        </w:numPr>
-      </w:pPr>
-      <w:r>
-        <w:rPr>
-          <w:b/>
-          <w:bCs/>
-        </w:rPr>
-        <w:t xml:space="preserve">Explainability and compliance</w:t>
-      </w:r>
-      <w:r>
-        <w:t xml:space="preserve"> </w:t>
-      </w:r>
-      <w:r>
-        <w:t xml:space="preserve">— every decision has a plain-English reason, an immutable trail, and access reviews for standing, dormant and expired grants.</w:t>
-      </w:r>
-    </w:p>
-    <w:bookmarkEnd w:id="49"/>
-    <w:bookmarkStart w:id="50" w:name="scalability"/>
-    <w:p>
-      <w:pPr>
-        <w:pStyle w:val="Heading1"/>
-      </w:pPr>
-      <w:r>
-        <w:rPr>
-          <w:rStyle w:val="SectionNumber"/>
-        </w:rPr>
-        <w:t xml:space="preserve">14</w:t>
-      </w:r>
-      <w:r>
-        <w:tab/>
-      </w:r>
-      <w:r>
-        <w:t xml:space="preserve">Scalability</w:t>
       </w:r>
     </w:p>
     <w:p>
@@ -5395,13 +6231,22 @@
           <w:b/>
           <w:bCs/>
         </w:rPr>
-        <w:t xml:space="preserve">Stateless scoring</w:t>
-      </w:r>
-      <w:r>
-        <w:t xml:space="preserve"> </w:t>
-      </w:r>
-      <w:r>
-        <w:t xml:space="preserve">— scale horizontally behind a load balancer; each request scores one session.</w:t>
+        <w:t xml:space="preserve">Login</w:t>
+      </w:r>
+      <w:r>
+        <w:t xml:space="preserve"> </w:t>
+      </w:r>
+      <w:r>
+        <w:t xml:space="preserve">(</w:t>
+      </w:r>
+      <w:r>
+        <w:rPr>
+          <w:rStyle w:val="VerbatimChar"/>
+        </w:rPr>
+        <w:t xml:space="preserve">pages/Login.jsx</w:t>
+      </w:r>
+      <w:r>
+        <w:t xml:space="preserve">) — role-routed, with a demo-account helper.</w:t>
       </w:r>
     </w:p>
     <w:p>
@@ -5417,13 +6262,38 @@
           <w:b/>
           <w:bCs/>
         </w:rPr>
-        <w:t xml:space="preserve">Storage</w:t>
-      </w:r>
-      <w:r>
-        <w:t xml:space="preserve"> </w:t>
-      </w:r>
-      <w:r>
-        <w:t xml:space="preserve">— SQLite to PostgreSQL by changing one connection string (pure ORM, no raw SQL).</w:t>
+        <w:t xml:space="preserve">Employee Portal</w:t>
+      </w:r>
+      <w:r>
+        <w:t xml:space="preserve"> </w:t>
+      </w:r>
+      <w:r>
+        <w:t xml:space="preserve">(</w:t>
+      </w:r>
+      <w:r>
+        <w:rPr>
+          <w:rStyle w:val="VerbatimChar"/>
+        </w:rPr>
+        <w:t xml:space="preserve">pages/Portal.jsx</w:t>
+      </w:r>
+      <w:r>
+        <w:t xml:space="preserve">) — a working banking desk (Accounts, Payments, Transactions, Approvals) with a fraud/high-value</w:t>
+      </w:r>
+      <w:r>
+        <w:t xml:space="preserve"> </w:t>
+      </w:r>
+      <w:r>
+        <w:rPr>
+          <w:b/>
+          <w:bCs/>
+        </w:rPr>
+        <w:t xml:space="preserve">flash banner</w:t>
+      </w:r>
+      <w:r>
+        <w:t xml:space="preserve"> </w:t>
+      </w:r>
+      <w:r>
+        <w:t xml:space="preserve">and live KPIs, plus the privileged-action console: connection badge, live risk gauge, activity timeline, MFA modal, maker-checker banner, and a full-screen BLOCK overlay.</w:t>
       </w:r>
     </w:p>
     <w:p>
@@ -5439,354 +6309,72 @@
           <w:b/>
           <w:bCs/>
         </w:rPr>
-        <w:t xml:space="preserve">Real-time fan-out</w:t>
-      </w:r>
-      <w:r>
-        <w:t xml:space="preserve"> </w:t>
-      </w:r>
-      <w:r>
-        <w:t xml:space="preserve">— WebSocket behind a Redis or Kafka broker to serve many SOC clients and high event throughput.</w:t>
-      </w:r>
-    </w:p>
-    <w:p>
-      <w:pPr>
-        <w:pStyle w:val="Compact"/>
-        <w:numPr>
-          <w:ilvl w:val="0"/>
-          <w:numId w:val="1010"/>
-        </w:numPr>
-      </w:pPr>
-      <w:r>
-        <w:rPr>
-          <w:b/>
-          <w:bCs/>
-        </w:rPr>
-        <w:t xml:space="preserve">Ingestion</w:t>
-      </w:r>
-      <w:r>
-        <w:t xml:space="preserve"> </w:t>
-      </w:r>
-      <w:r>
-        <w:t xml:space="preserve">— generalizes to enterprise PAM/SIEM feeds (millions of privileged events per day) on the same</w:t>
-      </w:r>
-      <w:r>
-        <w:t xml:space="preserve"> </w:t>
+        <w:t xml:space="preserve">SOC Console</w:t>
+      </w:r>
+      <w:r>
+        <w:t xml:space="preserve"> </w:t>
+      </w:r>
+      <w:r>
+        <w:t xml:space="preserve">(</w:t>
       </w:r>
       <w:r>
         <w:rPr>
           <w:rStyle w:val="VerbatimChar"/>
         </w:rPr>
-        <w:t xml:space="preserve">Event</w:t>
-      </w:r>
-      <w:r>
-        <w:t xml:space="preserve"> </w:t>
-      </w:r>
-      <w:r>
-        <w:t xml:space="preserve">schema.</w:t>
-      </w:r>
-    </w:p>
-    <w:p>
-      <w:pPr>
-        <w:pStyle w:val="Compact"/>
-        <w:numPr>
-          <w:ilvl w:val="0"/>
-          <w:numId w:val="1010"/>
-        </w:numPr>
-      </w:pPr>
-      <w:r>
-        <w:rPr>
-          <w:b/>
-          <w:bCs/>
-        </w:rPr>
-        <w:t xml:space="preserve">Machine learning</w:t>
-      </w:r>
-      <w:r>
-        <w:t xml:space="preserve"> </w:t>
-      </w:r>
-      <w:r>
-        <w:t xml:space="preserve">— models retrain per role and shift nightly; a feature store holds baselines; the UEBA interface accepts an autoencoder upgrade with no application changes.</w:t>
-      </w:r>
-    </w:p>
-    <w:p>
-      <w:pPr>
-        <w:pStyle w:val="Compact"/>
-        <w:numPr>
-          <w:ilvl w:val="0"/>
-          <w:numId w:val="1010"/>
-        </w:numPr>
-      </w:pPr>
-      <w:r>
-        <w:rPr>
-          <w:b/>
-          <w:bCs/>
-        </w:rPr>
-        <w:t xml:space="preserve">Post-quantum operations</w:t>
-      </w:r>
-      <w:r>
-        <w:t xml:space="preserve"> </w:t>
-      </w:r>
-      <w:r>
-        <w:t xml:space="preserve">— ML-KEM encapsulation and ML-DSA signing are sub-millisecond, negligible next to a database write.</w:t>
-      </w:r>
-    </w:p>
-    <w:bookmarkEnd w:id="50"/>
-    <w:bookmarkStart w:id="51" w:name="deployment-and-running"/>
+        <w:t xml:space="preserve">pages/SocConsole.jsx</w:t>
+      </w:r>
+      <w:r>
+        <w:t xml:space="preserve">) — three scenario buttons, an audit banner, an impact-metrics strip, one-click</w:t>
+      </w:r>
+      <w:r>
+        <w:t xml:space="preserve"> </w:t>
+      </w:r>
+      <w:r>
+        <w:rPr>
+          <w:b/>
+          <w:bCs/>
+        </w:rPr>
+        <w:t xml:space="preserve">Lock / Approve / Dismiss</w:t>
+      </w:r>
+      <w:r>
+        <w:t xml:space="preserve"> </w:t>
+      </w:r>
+      <w:r>
+        <w:t xml:space="preserve">response actions with toast feedback, an</w:t>
+      </w:r>
+      <w:r>
+        <w:t xml:space="preserve"> </w:t>
+      </w:r>
+      <w:r>
+        <w:rPr>
+          <w:b/>
+          <w:bCs/>
+        </w:rPr>
+        <w:t xml:space="preserve">AI Model Insights</w:t>
+      </w:r>
+      <w:r>
+        <w:t xml:space="preserve"> </w:t>
+      </w:r>
+      <w:r>
+        <w:t xml:space="preserve">panel (feature breakdown + baselines) and risk-trajectory sparkline, and panels: live sessions (typed), risk gauge, why-flagged, alerts (typed), timeline, session recording (terminal replay), heatmap, and access review.</w:t>
+      </w:r>
+    </w:p>
+    <w:p>
+      <w:pPr>
+        <w:pStyle w:val="FirstParagraph"/>
+      </w:pPr>
+      <w:r>
+        <w:t xml:space="preserve">The colour system reserves status colours (good / warning / serious / critical), colour-codes insider types (malicious red, compromised blue, negligent amber), uses tabular numerics, flashes on new alerts, and never encodes meaning by colour alone.</w:t>
+      </w:r>
+    </w:p>
+    <w:bookmarkEnd w:id="54"/>
+    <w:bookmarkStart w:id="55" w:name="security-considerations"/>
     <w:p>
       <w:pPr>
         <w:pStyle w:val="Heading1"/>
       </w:pPr>
       <w:r>
-        <w:rPr>
-          <w:rStyle w:val="SectionNumber"/>
-        </w:rPr>
-        <w:t xml:space="preserve">15</w:t>
-      </w:r>
-      <w:r>
-        <w:tab/>
-      </w:r>
-      <w:r>
-        <w:t xml:space="preserve">Deployment and Running</w:t>
-      </w:r>
-    </w:p>
-    <w:p>
-      <w:pPr>
-        <w:pStyle w:val="SourceCode"/>
-      </w:pPr>
-      <w:r>
-        <w:rPr>
-          <w:rStyle w:val="CommentTok"/>
-        </w:rPr>
-        <w:t xml:space="preserve"># Windows PowerShell</w:t>
-      </w:r>
-      <w:r>
-        <w:br/>
-      </w:r>
-      <w:r>
-        <w:rPr>
-          <w:rStyle w:val="OperatorTok"/>
-        </w:rPr>
-        <w:t xml:space="preserve">.</w:t>
-      </w:r>
-      <w:r>
-        <w:rPr>
-          <w:rStyle w:val="NormalTok"/>
-        </w:rPr>
-        <w:t xml:space="preserve">\run</w:t>
-      </w:r>
-      <w:r>
-        <w:rPr>
-          <w:rStyle w:val="OperatorTok"/>
-        </w:rPr>
-        <w:t xml:space="preserve">.</w:t>
-      </w:r>
-      <w:r>
-        <w:rPr>
-          <w:rStyle w:val="FunctionTok"/>
-        </w:rPr>
-        <w:t xml:space="preserve">ps1</w:t>
-      </w:r>
-      <w:r>
-        <w:rPr>
-          <w:rStyle w:val="NormalTok"/>
-        </w:rPr>
-        <w:t xml:space="preserve">              </w:t>
-      </w:r>
-      <w:r>
-        <w:rPr>
-          <w:rStyle w:val="CommentTok"/>
-        </w:rPr>
-        <w:t xml:space="preserve"># venv + deps + seeded DB + UI + API (offline)</w:t>
-      </w:r>
-      <w:r>
-        <w:br/>
-      </w:r>
-      <w:r>
-        <w:rPr>
-          <w:rStyle w:val="OperatorTok"/>
-        </w:rPr>
-        <w:t xml:space="preserve">.</w:t>
-      </w:r>
-      <w:r>
-        <w:rPr>
-          <w:rStyle w:val="NormalTok"/>
-        </w:rPr>
-        <w:t xml:space="preserve">\run</w:t>
-      </w:r>
-      <w:r>
-        <w:rPr>
-          <w:rStyle w:val="OperatorTok"/>
-        </w:rPr>
-        <w:t xml:space="preserve">.</w:t>
-      </w:r>
-      <w:r>
-        <w:rPr>
-          <w:rStyle w:val="FunctionTok"/>
-        </w:rPr>
-        <w:t xml:space="preserve">ps1</w:t>
-      </w:r>
-      <w:r>
-        <w:rPr>
-          <w:rStyle w:val="NormalTok"/>
-        </w:rPr>
-        <w:t xml:space="preserve"> </w:t>
-      </w:r>
-      <w:r>
-        <w:rPr>
-          <w:rStyle w:val="OperatorTok"/>
-        </w:rPr>
-        <w:t xml:space="preserve">-</w:t>
-      </w:r>
-      <w:r>
-        <w:rPr>
-          <w:rStyle w:val="NormalTok"/>
-        </w:rPr>
-        <w:t xml:space="preserve">Reset       </w:t>
-      </w:r>
-      <w:r>
-        <w:rPr>
-          <w:rStyle w:val="CommentTok"/>
-        </w:rPr>
-        <w:t xml:space="preserve"># wipe and reseed for a clean demo</w:t>
-      </w:r>
-    </w:p>
-    <w:p>
-      <w:pPr>
-        <w:pStyle w:val="SourceCode"/>
-      </w:pPr>
-      <w:r>
-        <w:rPr>
-          <w:rStyle w:val="CommentTok"/>
-        </w:rPr>
-        <w:t xml:space="preserve"># Git Bash / Linux / macOS</w:t>
-      </w:r>
-      <w:r>
-        <w:br/>
-      </w:r>
-      <w:r>
-        <w:rPr>
-          <w:rStyle w:val="ExtensionTok"/>
-        </w:rPr>
-        <w:t xml:space="preserve">./run.sh</w:t>
-      </w:r>
-      <w:r>
-        <w:rPr>
-          <w:rStyle w:val="NormalTok"/>
-        </w:rPr>
-        <w:t xml:space="preserve">               </w:t>
-      </w:r>
-      <w:r>
-        <w:rPr>
-          <w:rStyle w:val="CommentTok"/>
-        </w:rPr>
-        <w:t xml:space="preserve"># same, POSIX</w:t>
-      </w:r>
-      <w:r>
-        <w:br/>
-      </w:r>
-      <w:r>
-        <w:br/>
-      </w:r>
-      <w:r>
-        <w:rPr>
-          <w:rStyle w:val="ExtensionTok"/>
-        </w:rPr>
-        <w:t xml:space="preserve">docker</w:t>
-      </w:r>
-      <w:r>
-        <w:rPr>
-          <w:rStyle w:val="NormalTok"/>
-        </w:rPr>
-        <w:t xml:space="preserve"> compose up </w:t>
-      </w:r>
-      <w:r>
-        <w:rPr>
-          <w:rStyle w:val="AttributeTok"/>
-        </w:rPr>
-        <w:t xml:space="preserve">--build</w:t>
-      </w:r>
-      <w:r>
-        <w:rPr>
-          <w:rStyle w:val="NormalTok"/>
-        </w:rPr>
-        <w:t xml:space="preserve">      </w:t>
-      </w:r>
-      <w:r>
-        <w:rPr>
-          <w:rStyle w:val="CommentTok"/>
-        </w:rPr>
-        <w:t xml:space="preserve"># container alternative</w:t>
-      </w:r>
-    </w:p>
-    <w:p>
-      <w:pPr>
-        <w:pStyle w:val="FirstParagraph"/>
-      </w:pPr>
-      <w:r>
-        <w:t xml:space="preserve">Then open</w:t>
-      </w:r>
-      <w:r>
-        <w:t xml:space="preserve"> </w:t>
-      </w:r>
-      <w:r>
-        <w:rPr>
-          <w:rStyle w:val="VerbatimChar"/>
-        </w:rPr>
-        <w:t xml:space="preserve">http://127.0.0.1:8000</w:t>
-      </w:r>
-      <w:r>
-        <w:t xml:space="preserve">. The first run on a fresh machine needs internet once (pip install plus a one-time liboqs build); afterwards it is fully offline. Run tests with</w:t>
-      </w:r>
-      <w:r>
-        <w:t xml:space="preserve"> </w:t>
-      </w:r>
-      <w:r>
-        <w:rPr>
-          <w:rStyle w:val="VerbatimChar"/>
-        </w:rPr>
-        <w:t xml:space="preserve">.venv/Scripts/python -m pytest</w:t>
-      </w:r>
-      <w:r>
-        <w:t xml:space="preserve">.</w:t>
-      </w:r>
-    </w:p>
-    <w:bookmarkEnd w:id="51"/>
-    <w:bookmarkStart w:id="52" w:name="testing"/>
-    <w:p>
-      <w:pPr>
-        <w:pStyle w:val="Heading1"/>
-      </w:pPr>
-      <w:r>
-        <w:rPr>
-          <w:rStyle w:val="SectionNumber"/>
-        </w:rPr>
-        <w:t xml:space="preserve">16</w:t>
-      </w:r>
-      <w:r>
-        <w:tab/>
-      </w:r>
-      <w:r>
-        <w:t xml:space="preserve">Testing</w:t>
-      </w:r>
-    </w:p>
-    <w:p>
-      <w:pPr>
-        <w:pStyle w:val="FirstParagraph"/>
-      </w:pPr>
-      <w:r>
-        <w:t xml:space="preserve">The suite contains</w:t>
-      </w:r>
-      <w:r>
-        <w:t xml:space="preserve"> </w:t>
-      </w:r>
-      <w:r>
-        <w:rPr>
-          <w:b/>
-          <w:bCs/>
-        </w:rPr>
-        <w:t xml:space="preserve">31 pytest tests</w:t>
-      </w:r>
-      <w:r>
-        <w:t xml:space="preserve">, including:</w:t>
+        <w:t xml:space="preserve">Security Considerations</w:t>
       </w:r>
     </w:p>
     <w:p>
@@ -5802,13 +6390,13 @@
           <w:b/>
           <w:bCs/>
         </w:rPr>
-        <w:t xml:space="preserve">test_simulator</w:t>
-      </w:r>
-      <w:r>
-        <w:t xml:space="preserve"> </w:t>
-      </w:r>
-      <w:r>
-        <w:t xml:space="preserve">— user seeding, normal-day realism, determinism.</w:t>
+        <w:t xml:space="preserve">Data minimization</w:t>
+      </w:r>
+      <w:r>
+        <w:t xml:space="preserve"> </w:t>
+      </w:r>
+      <w:r>
+        <w:t xml:space="preserve">— scores on privileged-activity metadata; no customer PII required.</w:t>
       </w:r>
     </w:p>
     <w:p>
@@ -5824,13 +6412,13 @@
           <w:b/>
           <w:bCs/>
         </w:rPr>
-        <w:t xml:space="preserve">test_detection</w:t>
-      </w:r>
-      <w:r>
-        <w:t xml:space="preserve"> </w:t>
-      </w:r>
-      <w:r>
-        <w:t xml:space="preserve">— every rule, normal-versus-attack scoring, quiet-on-normal.</w:t>
+        <w:t xml:space="preserve">Credential protection</w:t>
+      </w:r>
+      <w:r>
+        <w:t xml:space="preserve"> </w:t>
+      </w:r>
+      <w:r>
+        <w:t xml:space="preserve">— an ML-KEM-768-wrapped AES-256-GCM vault for privileged secrets.</w:t>
       </w:r>
     </w:p>
     <w:p>
@@ -5846,13 +6434,13 @@
           <w:b/>
           <w:bCs/>
         </w:rPr>
-        <w:t xml:space="preserve">test_scenarios</w:t>
-      </w:r>
-      <w:r>
-        <w:t xml:space="preserve"> </w:t>
-      </w:r>
-      <w:r>
-        <w:t xml:space="preserve">— the three insider scenarios land on distinct, correct paths and the type-aware policy holds (negligence never auto-blocks), on an independent seed.</w:t>
+        <w:t xml:space="preserve">Audit integrity</w:t>
+      </w:r>
+      <w:r>
+        <w:t xml:space="preserve"> </w:t>
+      </w:r>
+      <w:r>
+        <w:t xml:space="preserve">— hash-chained and ML-DSA-65-signed entries; tampering is cryptographically evident.</w:t>
       </w:r>
     </w:p>
     <w:p>
@@ -5868,13 +6456,13 @@
           <w:b/>
           <w:bCs/>
         </w:rPr>
-        <w:t xml:space="preserve">test_phase3</w:t>
-      </w:r>
-      <w:r>
-        <w:t xml:space="preserve"> </w:t>
-      </w:r>
-      <w:r>
-        <w:t xml:space="preserve">— attack block, alert, and the WebSocket loop.</w:t>
+        <w:t xml:space="preserve">Enforcement</w:t>
+      </w:r>
+      <w:r>
+        <w:t xml:space="preserve"> </w:t>
+      </w:r>
+      <w:r>
+        <w:t xml:space="preserve">— server-side; blocked accounts stay locked; a challenged action is not persisted until actually allowed (no score-gaming, no bypass by re-login).</w:t>
       </w:r>
     </w:p>
     <w:p>
@@ -5890,13 +6478,13 @@
           <w:b/>
           <w:bCs/>
         </w:rPr>
-        <w:t xml:space="preserve">test_portal</w:t>
-      </w:r>
-      <w:r>
-        <w:t xml:space="preserve"> </w:t>
-      </w:r>
-      <w:r>
-        <w:t xml:space="preserve">— authentication, role gating, live enforcement, MFA without event stacking, and blocked-stays-locked.</w:t>
+        <w:t xml:space="preserve">Authorization</w:t>
+      </w:r>
+      <w:r>
+        <w:t xml:space="preserve"> </w:t>
+      </w:r>
+      <w:r>
+        <w:t xml:space="preserve">— role-gated APIs; analyst-only SOC and PQC endpoints.</w:t>
       </w:r>
     </w:p>
     <w:p>
@@ -5912,52 +6500,57 @@
           <w:b/>
           <w:bCs/>
         </w:rPr>
-        <w:t xml:space="preserve">test_pqc</w:t>
-      </w:r>
-      <w:r>
-        <w:t xml:space="preserve"> </w:t>
-      </w:r>
-      <w:r>
-        <w:t xml:space="preserve">— KEM round-trip, sign/verify with forgery rejection, vault round-trip, and audit chain clean / tamper / signature-forgery.</w:t>
-      </w:r>
-    </w:p>
-    <w:bookmarkEnd w:id="52"/>
-    <w:bookmarkStart w:id="53" w:name="demo-walkthrough"/>
+        <w:t xml:space="preserve">Offline by design</w:t>
+      </w:r>
+      <w:r>
+        <w:t xml:space="preserve"> </w:t>
+      </w:r>
+      <w:r>
+        <w:t xml:space="preserve">— no external calls at runtime; keys kept out of version control;</w:t>
+      </w:r>
+      <w:r>
+        <w:t xml:space="preserve"> </w:t>
+      </w:r>
+      <w:r>
+        <w:rPr>
+          <w:rStyle w:val="VerbatimChar"/>
+        </w:rPr>
+        <w:t xml:space="preserve">.env</w:t>
+      </w:r>
+      <w:r>
+        <w:t xml:space="preserve">-driven configuration; least-privilege demo accounts.</w:t>
+      </w:r>
+    </w:p>
+    <w:p>
+      <w:pPr>
+        <w:pStyle w:val="Compact"/>
+        <w:numPr>
+          <w:ilvl w:val="0"/>
+          <w:numId w:val="1011"/>
+        </w:numPr>
+      </w:pPr>
+      <w:r>
+        <w:rPr>
+          <w:b/>
+          <w:bCs/>
+        </w:rPr>
+        <w:t xml:space="preserve">Explainability and compliance</w:t>
+      </w:r>
+      <w:r>
+        <w:t xml:space="preserve"> </w:t>
+      </w:r>
+      <w:r>
+        <w:t xml:space="preserve">— every decision has a plain-English reason, an immutable trail, and access reviews for standing, dormant and expired grants.</w:t>
+      </w:r>
+    </w:p>
+    <w:bookmarkEnd w:id="55"/>
+    <w:bookmarkStart w:id="56" w:name="scalability"/>
     <w:p>
       <w:pPr>
         <w:pStyle w:val="Heading1"/>
       </w:pPr>
       <w:r>
-        <w:rPr>
-          <w:rStyle w:val="SectionNumber"/>
-        </w:rPr>
-        <w:t xml:space="preserve">17</w:t>
-      </w:r>
-      <w:r>
-        <w:tab/>
-      </w:r>
-      <w:r>
-        <w:t xml:space="preserve">Demo Walkthrough</w:t>
-      </w:r>
-    </w:p>
-    <w:p>
-      <w:pPr>
-        <w:pStyle w:val="FirstParagraph"/>
-      </w:pPr>
-      <w:r>
-        <w:t xml:space="preserve">Full narration is in</w:t>
-      </w:r>
-      <w:r>
-        <w:t xml:space="preserve"> </w:t>
-      </w:r>
-      <w:r>
-        <w:rPr>
-          <w:rStyle w:val="VerbatimChar"/>
-        </w:rPr>
-        <w:t xml:space="preserve">DEMO_SCRIPT.md</w:t>
-      </w:r>
-      <w:r>
-        <w:t xml:space="preserve">. In brief (two browser windows, side by side):</w:t>
+        <w:t xml:space="preserve">Scalability</w:t>
       </w:r>
     </w:p>
     <w:p>
@@ -5973,22 +6566,13 @@
           <w:b/>
           <w:bCs/>
         </w:rPr>
-        <w:t xml:space="preserve">SOC Console</w:t>
-      </w:r>
-      <w:r>
-        <w:t xml:space="preserve"> </w:t>
-      </w:r>
-      <w:r>
-        <w:t xml:space="preserve">(</w:t>
-      </w:r>
-      <w:r>
-        <w:rPr>
-          <w:rStyle w:val="VerbatimChar"/>
-        </w:rPr>
-        <w:t xml:space="preserve">soc_admin</w:t>
-      </w:r>
-      <w:r>
-        <w:t xml:space="preserve">) — quiet, with a green heatmap.</w:t>
+        <w:t xml:space="preserve">Stateless scoring</w:t>
+      </w:r>
+      <w:r>
+        <w:t xml:space="preserve"> </w:t>
+      </w:r>
+      <w:r>
+        <w:t xml:space="preserve">— scale horizontally behind a load balancer; each request scores one session.</w:t>
       </w:r>
     </w:p>
     <w:p>
@@ -6004,34 +6588,13 @@
           <w:b/>
           <w:bCs/>
         </w:rPr>
-        <w:t xml:space="preserve">Employee Portal</w:t>
-      </w:r>
-      <w:r>
-        <w:t xml:space="preserve"> </w:t>
-      </w:r>
-      <w:r>
-        <w:t xml:space="preserve">(</w:t>
-      </w:r>
-      <w:r>
-        <w:rPr>
-          <w:rStyle w:val="VerbatimChar"/>
-        </w:rPr>
-        <w:t xml:space="preserve">rmehta</w:t>
-      </w:r>
-      <w:r>
-        <w:t xml:space="preserve">) — a normal query is ALLOWED; an export of 1000 records triggers STEP-UP MFA (code</w:t>
-      </w:r>
-      <w:r>
-        <w:t xml:space="preserve"> </w:t>
-      </w:r>
-      <w:r>
-        <w:rPr>
-          <w:rStyle w:val="VerbatimChar"/>
-        </w:rPr>
-        <w:t xml:space="preserve">246810</w:t>
-      </w:r>
-      <w:r>
-        <w:t xml:space="preserve">).</w:t>
+        <w:t xml:space="preserve">Storage</w:t>
+      </w:r>
+      <w:r>
+        <w:t xml:space="preserve"> </w:t>
+      </w:r>
+      <w:r>
+        <w:t xml:space="preserve">— SQLite to PostgreSQL by changing one connection string (pure ORM, no raw SQL).</w:t>
       </w:r>
     </w:p>
     <w:p>
@@ -6047,22 +6610,13 @@
           <w:b/>
           <w:bCs/>
         </w:rPr>
-        <w:t xml:space="preserve">Attacker</w:t>
-      </w:r>
-      <w:r>
-        <w:t xml:space="preserve"> </w:t>
-      </w:r>
-      <w:r>
-        <w:t xml:space="preserve">(</w:t>
-      </w:r>
-      <w:r>
-        <w:rPr>
-          <w:rStyle w:val="VerbatimChar"/>
-        </w:rPr>
-        <w:t xml:space="preserve">ext_dsouza</w:t>
-      </w:r>
-      <w:r>
-        <w:t xml:space="preserve">) — escalate then export 5000 records -&gt; full-screen BLOCK; the account is locked.</w:t>
+        <w:t xml:space="preserve">Real-time fan-out</w:t>
+      </w:r>
+      <w:r>
+        <w:t xml:space="preserve"> </w:t>
+      </w:r>
+      <w:r>
+        <w:t xml:space="preserve">— WebSocket behind a Redis or Kafka broker to serve many SOC clients and high event throughput.</w:t>
       </w:r>
     </w:p>
     <w:p>
@@ -6078,13 +6632,13 @@
           <w:b/>
           <w:bCs/>
         </w:rPr>
-        <w:t xml:space="preserve">SOC lights up</w:t>
-      </w:r>
-      <w:r>
-        <w:t xml:space="preserve"> </w:t>
-      </w:r>
-      <w:r>
-        <w:t xml:space="preserve">— a red live session at 100, a flashed CRITICAL alert tagged</w:t>
+        <w:t xml:space="preserve">Ingestion</w:t>
+      </w:r>
+      <w:r>
+        <w:t xml:space="preserve"> </w:t>
+      </w:r>
+      <w:r>
+        <w:t xml:space="preserve">— generalizes to enterprise PAM/SIEM feeds (millions of privileged events per day) on the same</w:t>
       </w:r>
       <w:r>
         <w:t xml:space="preserve"> </w:t>
@@ -6093,10 +6647,13 @@
         <w:rPr>
           <w:rStyle w:val="VerbatimChar"/>
         </w:rPr>
-        <w:t xml:space="preserve">malicious</w:t>
-      </w:r>
-      <w:r>
-        <w:t xml:space="preserve">, the why-flagged panel, the session replay (export struck through as DENIED), and a red heatmap cell.</w:t>
+        <w:t xml:space="preserve">Event</w:t>
+      </w:r>
+      <w:r>
+        <w:t xml:space="preserve"> </w:t>
+      </w:r>
+      <w:r>
+        <w:t xml:space="preserve">schema.</w:t>
       </w:r>
     </w:p>
     <w:p>
@@ -6112,13 +6669,13 @@
           <w:b/>
           <w:bCs/>
         </w:rPr>
-        <w:t xml:space="preserve">Two more insider types</w:t>
-      </w:r>
-      <w:r>
-        <w:t xml:space="preserve"> </w:t>
-      </w:r>
-      <w:r>
-        <w:t xml:space="preserve">— the SOC buttons run Compromised -&gt; MFA and Negligent -&gt; maker-checker, each correctly typed.</w:t>
+        <w:t xml:space="preserve">Machine learning</w:t>
+      </w:r>
+      <w:r>
+        <w:t xml:space="preserve"> </w:t>
+      </w:r>
+      <w:r>
+        <w:t xml:space="preserve">— models retrain per role and shift nightly; a feature store holds baselines; the UEBA interface accepts an autoencoder upgrade with no application changes.</w:t>
       </w:r>
     </w:p>
     <w:p>
@@ -6134,54 +6691,313 @@
           <w:b/>
           <w:bCs/>
         </w:rPr>
-        <w:t xml:space="preserve">PAM access review</w:t>
-      </w:r>
-      <w:r>
-        <w:t xml:space="preserve"> </w:t>
-      </w:r>
-      <w:r>
-        <w:t xml:space="preserve">— dormant, vendor and expired flags.</w:t>
-      </w:r>
-    </w:p>
-    <w:p>
-      <w:pPr>
-        <w:pStyle w:val="Compact"/>
-        <w:numPr>
-          <w:ilvl w:val="0"/>
-          <w:numId w:val="1012"/>
-        </w:numPr>
-      </w:pPr>
-      <w:r>
-        <w:rPr>
-          <w:b/>
-          <w:bCs/>
-        </w:rPr>
-        <w:t xml:space="preserve">Quantum-safe evidence</w:t>
-      </w:r>
-      <w:r>
-        <w:t xml:space="preserve"> </w:t>
-      </w:r>
-      <w:r>
-        <w:t xml:space="preserve">— Verify Chain (green) then Tamper (red, FAILED at the exact entry).</w:t>
-      </w:r>
-    </w:p>
-    <w:bookmarkEnd w:id="53"/>
-    <w:bookmarkStart w:id="54" w:name="roadmap"/>
+        <w:t xml:space="preserve">Post-quantum operations</w:t>
+      </w:r>
+      <w:r>
+        <w:t xml:space="preserve"> </w:t>
+      </w:r>
+      <w:r>
+        <w:t xml:space="preserve">— ML-KEM encapsulation and ML-DSA signing are sub-millisecond, negligible next to a database write.</w:t>
+      </w:r>
+    </w:p>
+    <w:bookmarkEnd w:id="56"/>
+    <w:bookmarkStart w:id="57" w:name="deployment-and-running"/>
     <w:p>
       <w:pPr>
         <w:pStyle w:val="Heading1"/>
       </w:pPr>
       <w:r>
-        <w:rPr>
-          <w:rStyle w:val="SectionNumber"/>
-        </w:rPr>
-        <w:t xml:space="preserve">18</w:t>
-      </w:r>
-      <w:r>
-        <w:tab/>
-      </w:r>
-      <w:r>
-        <w:t xml:space="preserve">Roadmap</w:t>
+        <w:t xml:space="preserve">Deployment and Running</w:t>
+      </w:r>
+    </w:p>
+    <w:p>
+      <w:pPr>
+        <w:pStyle w:val="SourceCode"/>
+      </w:pPr>
+      <w:r>
+        <w:rPr>
+          <w:rStyle w:val="CommentTok"/>
+        </w:rPr>
+        <w:t xml:space="preserve"># Windows PowerShell</w:t>
+      </w:r>
+      <w:r>
+        <w:br/>
+      </w:r>
+      <w:r>
+        <w:rPr>
+          <w:rStyle w:val="OperatorTok"/>
+        </w:rPr>
+        <w:t xml:space="preserve">.</w:t>
+      </w:r>
+      <w:r>
+        <w:rPr>
+          <w:rStyle w:val="NormalTok"/>
+        </w:rPr>
+        <w:t xml:space="preserve">\run</w:t>
+      </w:r>
+      <w:r>
+        <w:rPr>
+          <w:rStyle w:val="OperatorTok"/>
+        </w:rPr>
+        <w:t xml:space="preserve">.</w:t>
+      </w:r>
+      <w:r>
+        <w:rPr>
+          <w:rStyle w:val="FunctionTok"/>
+        </w:rPr>
+        <w:t xml:space="preserve">ps1</w:t>
+      </w:r>
+      <w:r>
+        <w:rPr>
+          <w:rStyle w:val="NormalTok"/>
+        </w:rPr>
+        <w:t xml:space="preserve">              </w:t>
+      </w:r>
+      <w:r>
+        <w:rPr>
+          <w:rStyle w:val="CommentTok"/>
+        </w:rPr>
+        <w:t xml:space="preserve"># venv + deps + seeded DB + UI + API (offline)</w:t>
+      </w:r>
+      <w:r>
+        <w:br/>
+      </w:r>
+      <w:r>
+        <w:rPr>
+          <w:rStyle w:val="OperatorTok"/>
+        </w:rPr>
+        <w:t xml:space="preserve">.</w:t>
+      </w:r>
+      <w:r>
+        <w:rPr>
+          <w:rStyle w:val="NormalTok"/>
+        </w:rPr>
+        <w:t xml:space="preserve">\run</w:t>
+      </w:r>
+      <w:r>
+        <w:rPr>
+          <w:rStyle w:val="OperatorTok"/>
+        </w:rPr>
+        <w:t xml:space="preserve">.</w:t>
+      </w:r>
+      <w:r>
+        <w:rPr>
+          <w:rStyle w:val="FunctionTok"/>
+        </w:rPr>
+        <w:t xml:space="preserve">ps1</w:t>
+      </w:r>
+      <w:r>
+        <w:rPr>
+          <w:rStyle w:val="NormalTok"/>
+        </w:rPr>
+        <w:t xml:space="preserve"> </w:t>
+      </w:r>
+      <w:r>
+        <w:rPr>
+          <w:rStyle w:val="OperatorTok"/>
+        </w:rPr>
+        <w:t xml:space="preserve">-</w:t>
+      </w:r>
+      <w:r>
+        <w:rPr>
+          <w:rStyle w:val="NormalTok"/>
+        </w:rPr>
+        <w:t xml:space="preserve">Reset       </w:t>
+      </w:r>
+      <w:r>
+        <w:rPr>
+          <w:rStyle w:val="CommentTok"/>
+        </w:rPr>
+        <w:t xml:space="preserve"># wipe and reseed for a clean demo</w:t>
+      </w:r>
+    </w:p>
+    <w:p>
+      <w:pPr>
+        <w:pStyle w:val="SourceCode"/>
+      </w:pPr>
+      <w:r>
+        <w:rPr>
+          <w:rStyle w:val="CommentTok"/>
+        </w:rPr>
+        <w:t xml:space="preserve"># Git Bash / Linux / macOS</w:t>
+      </w:r>
+      <w:r>
+        <w:br/>
+      </w:r>
+      <w:r>
+        <w:rPr>
+          <w:rStyle w:val="ExtensionTok"/>
+        </w:rPr>
+        <w:t xml:space="preserve">./run.sh</w:t>
+      </w:r>
+      <w:r>
+        <w:rPr>
+          <w:rStyle w:val="NormalTok"/>
+        </w:rPr>
+        <w:t xml:space="preserve">               </w:t>
+      </w:r>
+      <w:r>
+        <w:rPr>
+          <w:rStyle w:val="CommentTok"/>
+        </w:rPr>
+        <w:t xml:space="preserve"># same, POSIX</w:t>
+      </w:r>
+      <w:r>
+        <w:br/>
+      </w:r>
+      <w:r>
+        <w:br/>
+      </w:r>
+      <w:r>
+        <w:rPr>
+          <w:rStyle w:val="ExtensionTok"/>
+        </w:rPr>
+        <w:t xml:space="preserve">docker</w:t>
+      </w:r>
+      <w:r>
+        <w:rPr>
+          <w:rStyle w:val="NormalTok"/>
+        </w:rPr>
+        <w:t xml:space="preserve"> compose up </w:t>
+      </w:r>
+      <w:r>
+        <w:rPr>
+          <w:rStyle w:val="AttributeTok"/>
+        </w:rPr>
+        <w:t xml:space="preserve">--build</w:t>
+      </w:r>
+      <w:r>
+        <w:rPr>
+          <w:rStyle w:val="NormalTok"/>
+        </w:rPr>
+        <w:t xml:space="preserve">      </w:t>
+      </w:r>
+      <w:r>
+        <w:rPr>
+          <w:rStyle w:val="CommentTok"/>
+        </w:rPr>
+        <w:t xml:space="preserve"># container alternative</w:t>
+      </w:r>
+    </w:p>
+    <w:p>
+      <w:pPr>
+        <w:pStyle w:val="FirstParagraph"/>
+      </w:pPr>
+      <w:r>
+        <w:t xml:space="preserve">Then open</w:t>
+      </w:r>
+      <w:r>
+        <w:t xml:space="preserve"> </w:t>
+      </w:r>
+      <w:r>
+        <w:rPr>
+          <w:rStyle w:val="VerbatimChar"/>
+        </w:rPr>
+        <w:t xml:space="preserve">http://127.0.0.1:8000</w:t>
+      </w:r>
+      <w:r>
+        <w:t xml:space="preserve">. The first run on a fresh machine needs internet once for</w:t>
+      </w:r>
+      <w:r>
+        <w:t xml:space="preserve"> </w:t>
+      </w:r>
+      <w:r>
+        <w:rPr>
+          <w:rStyle w:val="VerbatimChar"/>
+        </w:rPr>
+        <w:t xml:space="preserve">pip install</w:t>
+      </w:r>
+      <w:r>
+        <w:t xml:space="preserve"> </w:t>
+      </w:r>
+      <w:r>
+        <w:t xml:space="preserve">— there is</w:t>
+      </w:r>
+      <w:r>
+        <w:t xml:space="preserve"> </w:t>
+      </w:r>
+      <w:r>
+        <w:rPr>
+          <w:b/>
+          <w:bCs/>
+        </w:rPr>
+        <w:t xml:space="preserve">no compiler step</w:t>
+      </w:r>
+      <w:r>
+        <w:t xml:space="preserve"> </w:t>
+      </w:r>
+      <w:r>
+        <w:t xml:space="preserve">(the post-quantum layer ships a pure-Python fallback); afterwards it is fully offline. For a two-computer LAN demo the server binds</w:t>
+      </w:r>
+      <w:r>
+        <w:t xml:space="preserve"> </w:t>
+      </w:r>
+      <w:r>
+        <w:rPr>
+          <w:rStyle w:val="VerbatimChar"/>
+        </w:rPr>
+        <w:t xml:space="preserve">0.0.0.0</w:t>
+      </w:r>
+      <w:r>
+        <w:t xml:space="preserve"> </w:t>
+      </w:r>
+      <w:r>
+        <w:t xml:space="preserve">so a second machine reaches it at</w:t>
+      </w:r>
+      <w:r>
+        <w:t xml:space="preserve"> </w:t>
+      </w:r>
+      <w:r>
+        <w:rPr>
+          <w:rStyle w:val="VerbatimChar"/>
+        </w:rPr>
+        <w:t xml:space="preserve">http://&lt;host-ip&gt;:8000</w:t>
+      </w:r>
+      <w:r>
+        <w:t xml:space="preserve">. Run tests with</w:t>
+      </w:r>
+      <w:r>
+        <w:t xml:space="preserve"> </w:t>
+      </w:r>
+      <w:r>
+        <w:rPr>
+          <w:rStyle w:val="VerbatimChar"/>
+        </w:rPr>
+        <w:t xml:space="preserve">.venv/Scripts/python -m pytest</w:t>
+      </w:r>
+      <w:r>
+        <w:t xml:space="preserve">.</w:t>
+      </w:r>
+    </w:p>
+    <w:bookmarkEnd w:id="57"/>
+    <w:bookmarkStart w:id="58" w:name="testing"/>
+    <w:p>
+      <w:pPr>
+        <w:pStyle w:val="Heading1"/>
+      </w:pPr>
+      <w:r>
+        <w:t xml:space="preserve">Testing</w:t>
+      </w:r>
+    </w:p>
+    <w:p>
+      <w:pPr>
+        <w:pStyle w:val="FirstParagraph"/>
+      </w:pPr>
+      <w:r>
+        <w:t xml:space="preserve">The suite contains</w:t>
+      </w:r>
+      <w:r>
+        <w:t xml:space="preserve"> </w:t>
+      </w:r>
+      <w:r>
+        <w:rPr>
+          <w:b/>
+          <w:bCs/>
+        </w:rPr>
+        <w:t xml:space="preserve">40 pytest tests</w:t>
+      </w:r>
+      <w:r>
+        <w:t xml:space="preserve">, including:</w:t>
       </w:r>
     </w:p>
     <w:p>
@@ -6197,13 +7013,13 @@
           <w:b/>
           <w:bCs/>
         </w:rPr>
-        <w:t xml:space="preserve">PS2 correlation</w:t>
-      </w:r>
-      <w:r>
-        <w:t xml:space="preserve"> </w:t>
-      </w:r>
-      <w:r>
-        <w:t xml:space="preserve">— link a privileged record-change to a suspicious downstream transaction.</w:t>
+        <w:t xml:space="preserve">test_simulator</w:t>
+      </w:r>
+      <w:r>
+        <w:t xml:space="preserve"> </w:t>
+      </w:r>
+      <w:r>
+        <w:t xml:space="preserve">— user seeding, normal-day realism, determinism.</w:t>
       </w:r>
     </w:p>
     <w:p>
@@ -6219,13 +7035,13 @@
           <w:b/>
           <w:bCs/>
         </w:rPr>
-        <w:t xml:space="preserve">Just-in-time access</w:t>
-      </w:r>
-      <w:r>
-        <w:t xml:space="preserve"> </w:t>
-      </w:r>
-      <w:r>
-        <w:t xml:space="preserve">and automated entitlement reviews.</w:t>
+        <w:t xml:space="preserve">test_detection</w:t>
+      </w:r>
+      <w:r>
+        <w:t xml:space="preserve"> </w:t>
+      </w:r>
+      <w:r>
+        <w:t xml:space="preserve">— every rule, normal-versus-attack scoring, quiet-on-normal.</w:t>
       </w:r>
     </w:p>
     <w:p>
@@ -6241,13 +7057,13 @@
           <w:b/>
           <w:bCs/>
         </w:rPr>
-        <w:t xml:space="preserve">Autoencoder</w:t>
-      </w:r>
-      <w:r>
-        <w:t xml:space="preserve"> </w:t>
-      </w:r>
-      <w:r>
-        <w:t xml:space="preserve">UEBA upgrade behind the same interface.</w:t>
+        <w:t xml:space="preserve">test_scenarios</w:t>
+      </w:r>
+      <w:r>
+        <w:t xml:space="preserve"> </w:t>
+      </w:r>
+      <w:r>
+        <w:t xml:space="preserve">— the three insider scenarios land on distinct, correct paths and the type-aware policy holds (negligence never auto-blocks), on an independent seed.</w:t>
       </w:r>
     </w:p>
     <w:p>
@@ -6263,13 +7079,13 @@
           <w:b/>
           <w:bCs/>
         </w:rPr>
-        <w:t xml:space="preserve">Enterprise integrations</w:t>
-      </w:r>
-      <w:r>
-        <w:t xml:space="preserve"> </w:t>
-      </w:r>
-      <w:r>
-        <w:t xml:space="preserve">— CyberArk / BeyondTrust PAM, Splunk / QRadar SIEM, IdP / SSO.</w:t>
+        <w:t xml:space="preserve">test_phase3</w:t>
+      </w:r>
+      <w:r>
+        <w:t xml:space="preserve"> </w:t>
+      </w:r>
+      <w:r>
+        <w:t xml:space="preserve">— attack block, alert, and the WebSocket loop.</w:t>
       </w:r>
     </w:p>
     <w:p>
@@ -6285,6 +7101,450 @@
           <w:b/>
           <w:bCs/>
         </w:rPr>
+        <w:t xml:space="preserve">test_portal</w:t>
+      </w:r>
+      <w:r>
+        <w:t xml:space="preserve"> </w:t>
+      </w:r>
+      <w:r>
+        <w:t xml:space="preserve">— authentication, role gating, live enforcement, MFA without event stacking, and blocked-stays-locked.</w:t>
+      </w:r>
+    </w:p>
+    <w:p>
+      <w:pPr>
+        <w:pStyle w:val="Compact"/>
+        <w:numPr>
+          <w:ilvl w:val="0"/>
+          <w:numId w:val="1013"/>
+        </w:numPr>
+      </w:pPr>
+      <w:r>
+        <w:rPr>
+          <w:b/>
+          <w:bCs/>
+        </w:rPr>
+        <w:t xml:space="preserve">test_pqc</w:t>
+      </w:r>
+      <w:r>
+        <w:t xml:space="preserve"> </w:t>
+      </w:r>
+      <w:r>
+        <w:t xml:space="preserve">— KEM round-trip, sign/verify with forgery rejection, vault round-trip, and audit chain clean / tamper / signature-forgery (run against both PQC providers).</w:t>
+      </w:r>
+    </w:p>
+    <w:p>
+      <w:pPr>
+        <w:pStyle w:val="Compact"/>
+        <w:numPr>
+          <w:ilvl w:val="0"/>
+          <w:numId w:val="1013"/>
+        </w:numPr>
+      </w:pPr>
+      <w:r>
+        <w:rPr>
+          <w:b/>
+          <w:bCs/>
+        </w:rPr>
+        <w:t xml:space="preserve">test_bank</w:t>
+      </w:r>
+      <w:r>
+        <w:t xml:space="preserve"> </w:t>
+      </w:r>
+      <w:r>
+        <w:t xml:space="preserve">— transfers move money, high-value holds, watchlist / huge-amount / high-risk-session transfers flag, held transfers settle on approval, and insufficient-funds / frozen-account transfers are refused.</w:t>
+      </w:r>
+    </w:p>
+    <w:bookmarkEnd w:id="58"/>
+    <w:bookmarkStart w:id="59" w:name="demo-walkthrough"/>
+    <w:p>
+      <w:pPr>
+        <w:pStyle w:val="Heading1"/>
+      </w:pPr>
+      <w:r>
+        <w:t xml:space="preserve">Demo Walkthrough</w:t>
+      </w:r>
+    </w:p>
+    <w:p>
+      <w:pPr>
+        <w:pStyle w:val="FirstParagraph"/>
+      </w:pPr>
+      <w:r>
+        <w:t xml:space="preserve">Full narration is in</w:t>
+      </w:r>
+      <w:r>
+        <w:t xml:space="preserve"> </w:t>
+      </w:r>
+      <w:r>
+        <w:rPr>
+          <w:rStyle w:val="VerbatimChar"/>
+        </w:rPr>
+        <w:t xml:space="preserve">DEMO_SCRIPT.md</w:t>
+      </w:r>
+      <w:r>
+        <w:t xml:space="preserve">. In brief (two browser windows, side by side):</w:t>
+      </w:r>
+    </w:p>
+    <w:p>
+      <w:pPr>
+        <w:pStyle w:val="Compact"/>
+        <w:numPr>
+          <w:ilvl w:val="0"/>
+          <w:numId w:val="1014"/>
+        </w:numPr>
+      </w:pPr>
+      <w:r>
+        <w:rPr>
+          <w:b/>
+          <w:bCs/>
+        </w:rPr>
+        <w:t xml:space="preserve">SOC Console</w:t>
+      </w:r>
+      <w:r>
+        <w:t xml:space="preserve"> </w:t>
+      </w:r>
+      <w:r>
+        <w:t xml:space="preserve">(</w:t>
+      </w:r>
+      <w:r>
+        <w:rPr>
+          <w:rStyle w:val="VerbatimChar"/>
+        </w:rPr>
+        <w:t xml:space="preserve">soc_admin</w:t>
+      </w:r>
+      <w:r>
+        <w:t xml:space="preserve">) — quiet, with a green heatmap.</w:t>
+      </w:r>
+    </w:p>
+    <w:p>
+      <w:pPr>
+        <w:pStyle w:val="Compact"/>
+        <w:numPr>
+          <w:ilvl w:val="0"/>
+          <w:numId w:val="1014"/>
+        </w:numPr>
+      </w:pPr>
+      <w:r>
+        <w:rPr>
+          <w:b/>
+          <w:bCs/>
+        </w:rPr>
+        <w:t xml:space="preserve">Employee Portal</w:t>
+      </w:r>
+      <w:r>
+        <w:t xml:space="preserve"> </w:t>
+      </w:r>
+      <w:r>
+        <w:t xml:space="preserve">(</w:t>
+      </w:r>
+      <w:r>
+        <w:rPr>
+          <w:rStyle w:val="VerbatimChar"/>
+        </w:rPr>
+        <w:t xml:space="preserve">rmehta</w:t>
+      </w:r>
+      <w:r>
+        <w:t xml:space="preserve">) — a normal query is ALLOWED; an export of 1000 records triggers STEP-UP MFA (code</w:t>
+      </w:r>
+      <w:r>
+        <w:t xml:space="preserve"> </w:t>
+      </w:r>
+      <w:r>
+        <w:rPr>
+          <w:rStyle w:val="VerbatimChar"/>
+        </w:rPr>
+        <w:t xml:space="preserve">246810</w:t>
+      </w:r>
+      <w:r>
+        <w:t xml:space="preserve">). On the</w:t>
+      </w:r>
+      <w:r>
+        <w:t xml:space="preserve"> </w:t>
+      </w:r>
+      <w:r>
+        <w:rPr>
+          <w:b/>
+          <w:bCs/>
+        </w:rPr>
+        <w:t xml:space="preserve">banking desk</w:t>
+      </w:r>
+      <w:r>
+        <w:t xml:space="preserve">, a small transfer clears instantly, a high-value one is</w:t>
+      </w:r>
+      <w:r>
+        <w:t xml:space="preserve"> </w:t>
+      </w:r>
+      <w:r>
+        <w:rPr>
+          <w:b/>
+          <w:bCs/>
+        </w:rPr>
+        <w:t xml:space="preserve">HELD</w:t>
+      </w:r>
+      <w:r>
+        <w:t xml:space="preserve"> </w:t>
+      </w:r>
+      <w:r>
+        <w:t xml:space="preserve">for maker-checker, and a transfer to a watchlisted payee is</w:t>
+      </w:r>
+      <w:r>
+        <w:t xml:space="preserve"> </w:t>
+      </w:r>
+      <w:r>
+        <w:rPr>
+          <w:b/>
+          <w:bCs/>
+        </w:rPr>
+        <w:t xml:space="preserve">FLAGGED</w:t>
+      </w:r>
+      <w:r>
+        <w:t xml:space="preserve"> </w:t>
+      </w:r>
+      <w:r>
+        <w:t xml:space="preserve">and flashes a banner — surfacing as a CRITICAL alert in the SOC.</w:t>
+      </w:r>
+    </w:p>
+    <w:p>
+      <w:pPr>
+        <w:pStyle w:val="Compact"/>
+        <w:numPr>
+          <w:ilvl w:val="0"/>
+          <w:numId w:val="1014"/>
+        </w:numPr>
+      </w:pPr>
+      <w:r>
+        <w:rPr>
+          <w:b/>
+          <w:bCs/>
+        </w:rPr>
+        <w:t xml:space="preserve">Attacker</w:t>
+      </w:r>
+      <w:r>
+        <w:t xml:space="preserve"> </w:t>
+      </w:r>
+      <w:r>
+        <w:t xml:space="preserve">(</w:t>
+      </w:r>
+      <w:r>
+        <w:rPr>
+          <w:rStyle w:val="VerbatimChar"/>
+        </w:rPr>
+        <w:t xml:space="preserve">ext_dsouza</w:t>
+      </w:r>
+      <w:r>
+        <w:t xml:space="preserve">) — escalate then export 5000 records -&gt; full-screen BLOCK; the account is locked.</w:t>
+      </w:r>
+    </w:p>
+    <w:p>
+      <w:pPr>
+        <w:pStyle w:val="Compact"/>
+        <w:numPr>
+          <w:ilvl w:val="0"/>
+          <w:numId w:val="1014"/>
+        </w:numPr>
+      </w:pPr>
+      <w:r>
+        <w:rPr>
+          <w:b/>
+          <w:bCs/>
+        </w:rPr>
+        <w:t xml:space="preserve">SOC lights up</w:t>
+      </w:r>
+      <w:r>
+        <w:t xml:space="preserve"> </w:t>
+      </w:r>
+      <w:r>
+        <w:t xml:space="preserve">— a red live session at 100, a flashed CRITICAL alert tagged</w:t>
+      </w:r>
+      <w:r>
+        <w:t xml:space="preserve"> </w:t>
+      </w:r>
+      <w:r>
+        <w:rPr>
+          <w:rStyle w:val="VerbatimChar"/>
+        </w:rPr>
+        <w:t xml:space="preserve">malicious</w:t>
+      </w:r>
+      <w:r>
+        <w:t xml:space="preserve">, the why-flagged panel, the session replay (export struck through as DENIED), and a red heatmap cell.</w:t>
+      </w:r>
+    </w:p>
+    <w:p>
+      <w:pPr>
+        <w:pStyle w:val="Compact"/>
+        <w:numPr>
+          <w:ilvl w:val="0"/>
+          <w:numId w:val="1014"/>
+        </w:numPr>
+      </w:pPr>
+      <w:r>
+        <w:rPr>
+          <w:b/>
+          <w:bCs/>
+        </w:rPr>
+        <w:t xml:space="preserve">Two more insider types</w:t>
+      </w:r>
+      <w:r>
+        <w:t xml:space="preserve"> </w:t>
+      </w:r>
+      <w:r>
+        <w:t xml:space="preserve">— the SOC buttons run Compromised -&gt; MFA and Negligent -&gt; maker-checker, each correctly typed.</w:t>
+      </w:r>
+    </w:p>
+    <w:p>
+      <w:pPr>
+        <w:pStyle w:val="Compact"/>
+        <w:numPr>
+          <w:ilvl w:val="0"/>
+          <w:numId w:val="1014"/>
+        </w:numPr>
+      </w:pPr>
+      <w:r>
+        <w:rPr>
+          <w:b/>
+          <w:bCs/>
+        </w:rPr>
+        <w:t xml:space="preserve">PAM access review</w:t>
+      </w:r>
+      <w:r>
+        <w:t xml:space="preserve"> </w:t>
+      </w:r>
+      <w:r>
+        <w:t xml:space="preserve">— dormant, vendor and expired flags.</w:t>
+      </w:r>
+    </w:p>
+    <w:p>
+      <w:pPr>
+        <w:pStyle w:val="Compact"/>
+        <w:numPr>
+          <w:ilvl w:val="0"/>
+          <w:numId w:val="1014"/>
+        </w:numPr>
+      </w:pPr>
+      <w:r>
+        <w:rPr>
+          <w:b/>
+          <w:bCs/>
+        </w:rPr>
+        <w:t xml:space="preserve">Quantum-safe evidence</w:t>
+      </w:r>
+      <w:r>
+        <w:t xml:space="preserve"> </w:t>
+      </w:r>
+      <w:r>
+        <w:t xml:space="preserve">— Verify Chain (green) then Tamper (red, FAILED at the exact entry).</w:t>
+      </w:r>
+    </w:p>
+    <w:bookmarkEnd w:id="59"/>
+    <w:bookmarkStart w:id="60" w:name="roadmap"/>
+    <w:p>
+      <w:pPr>
+        <w:pStyle w:val="Heading1"/>
+      </w:pPr>
+      <w:r>
+        <w:t xml:space="preserve">Roadmap</w:t>
+      </w:r>
+    </w:p>
+    <w:p>
+      <w:pPr>
+        <w:pStyle w:val="Compact"/>
+        <w:numPr>
+          <w:ilvl w:val="0"/>
+          <w:numId w:val="1015"/>
+        </w:numPr>
+      </w:pPr>
+      <w:r>
+        <w:rPr>
+          <w:b/>
+          <w:bCs/>
+        </w:rPr>
+        <w:t xml:space="preserve">PS2 correlation</w:t>
+      </w:r>
+      <w:r>
+        <w:t xml:space="preserve"> </w:t>
+      </w:r>
+      <w:r>
+        <w:t xml:space="preserve">— link a privileged record-change to a suspicious downstream transaction.</w:t>
+      </w:r>
+    </w:p>
+    <w:p>
+      <w:pPr>
+        <w:pStyle w:val="Compact"/>
+        <w:numPr>
+          <w:ilvl w:val="0"/>
+          <w:numId w:val="1015"/>
+        </w:numPr>
+      </w:pPr>
+      <w:r>
+        <w:rPr>
+          <w:b/>
+          <w:bCs/>
+        </w:rPr>
+        <w:t xml:space="preserve">Just-in-time access</w:t>
+      </w:r>
+      <w:r>
+        <w:t xml:space="preserve"> </w:t>
+      </w:r>
+      <w:r>
+        <w:t xml:space="preserve">and automated entitlement reviews.</w:t>
+      </w:r>
+    </w:p>
+    <w:p>
+      <w:pPr>
+        <w:pStyle w:val="Compact"/>
+        <w:numPr>
+          <w:ilvl w:val="0"/>
+          <w:numId w:val="1015"/>
+        </w:numPr>
+      </w:pPr>
+      <w:r>
+        <w:rPr>
+          <w:b/>
+          <w:bCs/>
+        </w:rPr>
+        <w:t xml:space="preserve">Autoencoder</w:t>
+      </w:r>
+      <w:r>
+        <w:t xml:space="preserve"> </w:t>
+      </w:r>
+      <w:r>
+        <w:t xml:space="preserve">UEBA upgrade behind the same interface.</w:t>
+      </w:r>
+    </w:p>
+    <w:p>
+      <w:pPr>
+        <w:pStyle w:val="Compact"/>
+        <w:numPr>
+          <w:ilvl w:val="0"/>
+          <w:numId w:val="1015"/>
+        </w:numPr>
+      </w:pPr>
+      <w:r>
+        <w:rPr>
+          <w:b/>
+          <w:bCs/>
+        </w:rPr>
+        <w:t xml:space="preserve">Enterprise integrations</w:t>
+      </w:r>
+      <w:r>
+        <w:t xml:space="preserve"> </w:t>
+      </w:r>
+      <w:r>
+        <w:t xml:space="preserve">— CyberArk / BeyondTrust PAM, Splunk / QRadar SIEM, IdP / SSO.</w:t>
+      </w:r>
+    </w:p>
+    <w:p>
+      <w:pPr>
+        <w:pStyle w:val="Compact"/>
+        <w:numPr>
+          <w:ilvl w:val="0"/>
+          <w:numId w:val="1015"/>
+        </w:numPr>
+      </w:pPr>
+      <w:r>
+        <w:rPr>
+          <w:b/>
+          <w:bCs/>
+        </w:rPr>
         <w:t xml:space="preserve">Workforce-wide insider-risk scoring</w:t>
       </w:r>
       <w:r>
@@ -6294,22 +7554,13 @@
         <w:t xml:space="preserve">beyond privileged accounts.</w:t>
       </w:r>
     </w:p>
-    <w:bookmarkEnd w:id="54"/>
-    <w:bookmarkStart w:id="55" w:name="repository-map"/>
+    <w:bookmarkEnd w:id="60"/>
+    <w:bookmarkStart w:id="61" w:name="repository-map"/>
     <w:p>
       <w:pPr>
         <w:pStyle w:val="Heading1"/>
       </w:pPr>
       <w:r>
-        <w:rPr>
-          <w:rStyle w:val="SectionNumber"/>
-        </w:rPr>
-        <w:t xml:space="preserve">19</w:t>
-      </w:r>
-      <w:r>
-        <w:tab/>
-      </w:r>
-      <w:r>
         <w:t xml:space="preserve">Repository Map</w:t>
       </w:r>
     </w:p>
@@ -6357,6 +7608,15 @@
         <w:rPr>
           <w:rStyle w:val="VerbatimChar"/>
         </w:rPr>
+        <w:t xml:space="preserve">    bank.py               core-banking engine (transfers, maker-checker, fraud)</w:t>
+      </w:r>
+      <w:r>
+        <w:br/>
+      </w:r>
+      <w:r>
+        <w:rPr>
+          <w:rStyle w:val="VerbatimChar"/>
+        </w:rPr>
         <w:t xml:space="preserve">    pam.py                session-command recording + access review</w:t>
       </w:r>
       <w:r>
@@ -6447,7 +7707,7 @@
         <w:rPr>
           <w:rStyle w:val="VerbatimChar"/>
         </w:rPr>
-        <w:t xml:space="preserve">    security/pqc.py       ML-KEM-768 / ML-DSA-65 abstraction</w:t>
+        <w:t xml:space="preserve">    security/pqc.py       ML-KEM-768 / ML-DSA-65 (native or pure-Python)</w:t>
       </w:r>
       <w:r>
         <w:br/>
@@ -6492,7 +7752,7 @@
         <w:rPr>
           <w:rStyle w:val="VerbatimChar"/>
         </w:rPr>
-        <w:t xml:space="preserve">  tests/                  31 pytest tests</w:t>
+        <w:t xml:space="preserve">  tests/                  40 pytest tests</w:t>
       </w:r>
       <w:r>
         <w:br/>
@@ -6534,7 +7794,7 @@
         <w:t xml:space="preserve">Prahari — the sentinel for privileged access. Detect with AI and rules, explain every decision, respond in real time, and keep the proof quantum-safe.</w:t>
       </w:r>
     </w:p>
-    <w:bookmarkEnd w:id="55"/>
+    <w:bookmarkEnd w:id="61"/>
     <w:sectPr>
       <w:footnotePr>
         <w:numRestart w:val="eachSect"/>
@@ -6870,6 +8130,12 @@
     <w:abstractNumId w:val="991"/>
   </w:num>
   <w:num w:numId="1012">
+    <w:abstractNumId w:val="991"/>
+  </w:num>
+  <w:num w:numId="1013">
+    <w:abstractNumId w:val="991"/>
+  </w:num>
+  <w:num w:numId="1014">
     <w:abstractNumId w:val="99411"/>
     <w:lvlOverride w:ilvl="0">
       <w:startOverride w:val="1"/>
@@ -6899,7 +8165,7 @@
       <w:startOverride w:val="1"/>
     </w:lvlOverride>
   </w:num>
-  <w:num w:numId="1013">
+  <w:num w:numId="1015">
     <w:abstractNumId w:val="991"/>
   </w:num>
 </w:numbering>

</xml_diff>

<commit_message>
Judge-ready: complete demo guide + docs covering the full PS1 surface
- DEMO_SCRIPT.md rewritten as the complete demo & usage manual: PS1
  scorecard, setup (two-computer, no-compiler), how to use every feature
  (risk-based login, banking desk, action console, credential vault, JIT,
  every SOC view), an 8-minute timed judge script hitting all six outcomes,
  Q&A answers, numbers to quote, troubleshooting
- Technical doc + presentation guide updated: risk-based authentication,
  JIT access, credential checkout, measured AI benchmark, signed incident
  reports; API reference + tests + roadmap + repo map refreshed; 54 tests
- Data-model diagram regenerated with all 11 entities (JitGrant,
  CredentialCheckout) in a 4-row layout with a PAM-workflows note
- Both PDFs + DOCX rebuilt (8 diagrams embedded each)
</commit_message>
<xml_diff>
--- a/DOCS/Prahari_Documentation.docx
+++ b/DOCS/Prahari_Documentation.docx
@@ -287,6 +287,95 @@
     <w:p>
       <w:pPr>
         <w:pStyle w:val="FirstParagraph"/>
+      </w:pPr>
+      <w:r>
+        <w:t xml:space="preserve">Risk-based control runs</w:t>
+      </w:r>
+      <w:r>
+        <w:t xml:space="preserve"> </w:t>
+      </w:r>
+      <w:r>
+        <w:rPr>
+          <w:b/>
+          <w:bCs/>
+        </w:rPr>
+        <w:t xml:space="preserve">from the front door to the last artefact</w:t>
+      </w:r>
+      <w:r>
+        <w:t xml:space="preserve">: a risky account must pass</w:t>
+      </w:r>
+      <w:r>
+        <w:t xml:space="preserve"> </w:t>
+      </w:r>
+      <w:r>
+        <w:rPr>
+          <w:b/>
+          <w:bCs/>
+        </w:rPr>
+        <w:t xml:space="preserve">step-up MFA at login</w:t>
+      </w:r>
+      <w:r>
+        <w:t xml:space="preserve">; privilege elevation needs an approved, auto-expiring</w:t>
+      </w:r>
+      <w:r>
+        <w:t xml:space="preserve"> </w:t>
+      </w:r>
+      <w:r>
+        <w:rPr>
+          <w:b/>
+          <w:bCs/>
+        </w:rPr>
+        <w:t xml:space="preserve">just-in-time (JIT) grant</w:t>
+      </w:r>
+      <w:r>
+        <w:t xml:space="preserve">; privileged secrets are released only through a</w:t>
+      </w:r>
+      <w:r>
+        <w:t xml:space="preserve"> </w:t>
+      </w:r>
+      <w:r>
+        <w:rPr>
+          <w:b/>
+          <w:bCs/>
+        </w:rPr>
+        <w:t xml:space="preserve">time-boxed, risk-gated credential checkout</w:t>
+      </w:r>
+      <w:r>
+        <w:t xml:space="preserve"> </w:t>
+      </w:r>
+      <w:r>
+        <w:t xml:space="preserve">from the quantum-safe vault; and every incident can be exported as an</w:t>
+      </w:r>
+      <w:r>
+        <w:t xml:space="preserve"> </w:t>
+      </w:r>
+      <w:r>
+        <w:rPr>
+          <w:b/>
+          <w:bCs/>
+        </w:rPr>
+        <w:t xml:space="preserve">ML-DSA-signed evidence pack</w:t>
+      </w:r>
+      <w:r>
+        <w:t xml:space="preserve">. The detector is</w:t>
+      </w:r>
+      <w:r>
+        <w:t xml:space="preserve"> </w:t>
+      </w:r>
+      <w:r>
+        <w:rPr>
+          <w:b/>
+          <w:bCs/>
+        </w:rPr>
+        <w:t xml:space="preserve">measured, not just claimed</w:t>
+      </w:r>
+      <w:r>
+        <w:t xml:space="preserve">: on a held-out benchmark it detects 100% of the scripted attacks with the correct response and type, with zero false blocks on benign sessions.</w:t>
+      </w:r>
+    </w:p>
+    <w:p>
+      <w:pPr>
+        <w:pStyle w:val="BodyText"/>
       </w:pPr>
       <w:r>
         <w:t xml:space="preserve">It ships as a real two-sided product: an</w:t>
@@ -1130,7 +1219,7 @@
               <w:pStyle w:val="Compact"/>
             </w:pPr>
             <w:r>
-              <w:t xml:space="preserve">pytest (40 tests)</w:t>
+              <w:t xml:space="preserve">pytest (54 tests)</w:t>
             </w:r>
           </w:p>
         </w:tc>
@@ -1151,7 +1240,7 @@
         <w:pStyle w:val="FirstParagraph"/>
       </w:pPr>
       <w:r>
-        <w:t xml:space="preserve">Nine ORM entities capture the workforce, their recorded sessions and actions, the detection output, the post-quantum artefacts, and the core-banking ledger.</w:t>
+        <w:t xml:space="preserve">Eleven ORM entities capture the workforce, their recorded sessions and actions, the detection output, the post-quantum artefacts, the core-banking ledger, and the PAM workflows.</w:t>
       </w:r>
     </w:p>
     <w:p>
@@ -1161,9 +1250,9 @@
       <w:r>
         <w:drawing>
           <wp:inline>
-            <wp:extent cx="5334000" cy="3758803"/>
+            <wp:extent cx="5334000" cy="4381130"/>
             <wp:effectExtent b="0" l="0" r="0" t="0"/>
-            <wp:docPr descr="Entity model — users, sessions, events, recorded commands, alerts, audit entries, vault items, and the bank accounts and transactions." title="" id="17" name="Picture"/>
+            <wp:docPr descr="Entity model — the activity spine, detection output, quantum-safe evidence, core-banking ledger, and the JIT-grant and credential-checkout workflows." title="" id="17" name="Picture"/>
             <a:graphic>
               <a:graphicData uri="http://schemas.openxmlformats.org/drawingml/2006/picture">
                 <pic:pic>
@@ -1182,7 +1271,7 @@
                   <pic:spPr bwMode="auto">
                     <a:xfrm>
                       <a:off x="0" y="0"/>
-                      <a:ext cx="5334000" cy="3758803"/>
+                      <a:ext cx="5334000" cy="4381130"/>
                     </a:xfrm>
                     <a:prstGeom prst="rect">
                       <a:avLst/>
@@ -1206,13 +1295,59 @@
         <w:pStyle w:val="ImageCaption"/>
       </w:pPr>
       <w:r>
-        <w:t xml:space="preserve">Entity model — users, sessions, events, recorded commands, alerts, audit entries, vault items, and the bank accounts and transactions.</w:t>
+        <w:t xml:space="preserve">Entity model — the activity spine, detection output, quantum-safe evidence, core-banking ledger, and the JIT-grant and credential-checkout workflows.</w:t>
       </w:r>
     </w:p>
     <w:p>
       <w:pPr>
         <w:pStyle w:val="BodyText"/>
       </w:pPr>
+      <w:r>
+        <w:rPr>
+          <w:rStyle w:val="VerbatimChar"/>
+        </w:rPr>
+        <w:t xml:space="preserve">JitGrant</w:t>
+      </w:r>
+      <w:r>
+        <w:t xml:space="preserve"> </w:t>
+      </w:r>
+      <w:r>
+        <w:t xml:space="preserve">and</w:t>
+      </w:r>
+      <w:r>
+        <w:t xml:space="preserve"> </w:t>
+      </w:r>
+      <w:r>
+        <w:rPr>
+          <w:rStyle w:val="VerbatimChar"/>
+        </w:rPr>
+        <w:t xml:space="preserve">CredentialCheckout</w:t>
+      </w:r>
+      <w:r>
+        <w:t xml:space="preserve"> </w:t>
+      </w:r>
+      <w:r>
+        <w:t xml:space="preserve">are the</w:t>
+      </w:r>
+      <w:r>
+        <w:t xml:space="preserve"> </w:t>
+      </w:r>
+      <w:r>
+        <w:rPr>
+          <w:b/>
+          <w:bCs/>
+        </w:rPr>
+        <w:t xml:space="preserve">PAM workflows</w:t>
+      </w:r>
+      <w:r>
+        <w:t xml:space="preserve"> </w:t>
+      </w:r>
+      <w:r>
+        <w:t xml:space="preserve">(just-in-time elevation and vault checkout — see below);</w:t>
+      </w:r>
+      <w:r>
+        <w:t xml:space="preserve"> </w:t>
+      </w:r>
       <w:r>
         <w:rPr>
           <w:rStyle w:val="VerbatimChar"/>
@@ -1637,7 +1772,7 @@
       </w:tr>
     </w:tbl>
     <w:bookmarkEnd w:id="19"/>
-    <w:bookmarkStart w:id="26" w:name="detection-engine"/>
+    <w:bookmarkStart w:id="27" w:name="detection-engine"/>
     <w:p>
       <w:pPr>
         <w:pStyle w:val="Heading1"/>
@@ -2347,6 +2482,53 @@
           <w:b/>
           <w:bCs/>
         </w:rPr>
+        <w:t xml:space="preserve">JIT-aware escalation.</w:t>
+      </w:r>
+      <w:r>
+        <w:t xml:space="preserve"> </w:t>
+      </w:r>
+      <w:r>
+        <w:t xml:space="preserve">A privilege change covered by an</w:t>
+      </w:r>
+      <w:r>
+        <w:t xml:space="preserve"> </w:t>
+      </w:r>
+      <w:r>
+        <w:rPr>
+          <w:b/>
+          <w:bCs/>
+        </w:rPr>
+        <w:t xml:space="preserve">ACTIVE just-in-time grant</w:t>
+      </w:r>
+      <w:r>
+        <w:t xml:space="preserve"> </w:t>
+      </w:r>
+      <w:r>
+        <w:t xml:space="preserve">(approved by an analyst, time-boxed, auto-expiring) is</w:t>
+      </w:r>
+      <w:r>
+        <w:t xml:space="preserve"> </w:t>
+      </w:r>
+      <w:r>
+        <w:rPr>
+          <w:i/>
+          <w:iCs/>
+        </w:rPr>
+        <w:t xml:space="preserve">sanctioned</w:t>
+      </w:r>
+      <w:r>
+        <w:t xml:space="preserve">: PRIVILEGE_ESCALATION does not fire for that one resource, and the reason list says so. The moment the grant expires, the rule re-arms — so the same click is an alarm again.</w:t>
+      </w:r>
+    </w:p>
+    <w:p>
+      <w:pPr>
+        <w:pStyle w:val="BodyText"/>
+      </w:pPr>
+      <w:r>
+        <w:rPr>
+          <w:b/>
+          <w:bCs/>
+        </w:rPr>
         <w:t xml:space="preserve">Device disambiguation.</w:t>
       </w:r>
       <w:r>
@@ -2553,7 +2735,7 @@
       </w:r>
     </w:p>
     <w:bookmarkEnd w:id="21"/>
-    <w:bookmarkStart w:id="25" w:name="risk-scoring"/>
+    <w:bookmarkStart w:id="22" w:name="risk-scoring"/>
     <w:p>
       <w:pPr>
         <w:pStyle w:val="Heading2"/>
@@ -2741,6 +2923,221 @@
         <w:t xml:space="preserve">panel) and the insider type.</w:t>
       </w:r>
     </w:p>
+    <w:bookmarkEnd w:id="22"/>
+    <w:bookmarkStart w:id="26" w:name="measured-performance"/>
+    <w:p>
+      <w:pPr>
+        <w:pStyle w:val="Heading2"/>
+      </w:pPr>
+      <w:r>
+        <w:t xml:space="preserve">Measured performance</w:t>
+      </w:r>
+    </w:p>
+    <w:p>
+      <w:pPr>
+        <w:pStyle w:val="FirstParagraph"/>
+      </w:pPr>
+      <w:r>
+        <w:t xml:space="preserve">The detector is benchmarked on a</w:t>
+      </w:r>
+      <w:r>
+        <w:t xml:space="preserve"> </w:t>
+      </w:r>
+      <w:r>
+        <w:rPr>
+          <w:b/>
+          <w:bCs/>
+        </w:rPr>
+        <w:t xml:space="preserve">held-out sandbox</w:t>
+      </w:r>
+      <w:r>
+        <w:t xml:space="preserve"> </w:t>
+      </w:r>
+      <w:r>
+        <w:t xml:space="preserve">(30 days of simulated benign privileged activity on an independent seed, plus the three scripted attack patterns — ground truth exact by construction, nothing touches the live database):</w:t>
+      </w:r>
+    </w:p>
+    <w:tbl>
+      <w:tblPr>
+        <w:tblStyle w:val="Table"/>
+        <w:tblW w:type="pct" w:w="5000"/>
+        <w:tblLayout w:type="fixed"/>
+        <w:tblLook w:firstRow="1" w:lastRow="0" w:firstColumn="0" w:lastColumn="0" w:noHBand="0" w:noVBand="0" w:val="0020"/>
+      </w:tblPr>
+      <w:tblGrid>
+        <w:gridCol w:w="3960"/>
+        <w:gridCol w:w="3960"/>
+      </w:tblGrid>
+      <w:tr>
+        <w:trPr>
+          <w:tblHeader w:val="on"/>
+        </w:trPr>
+        <w:tc>
+          <w:tcPr/>
+          <w:p>
+            <w:pPr>
+              <w:pStyle w:val="Compact"/>
+            </w:pPr>
+            <w:r>
+              <w:t xml:space="preserve">Metric</w:t>
+            </w:r>
+          </w:p>
+        </w:tc>
+        <w:tc>
+          <w:tcPr/>
+          <w:p>
+            <w:pPr>
+              <w:pStyle w:val="Compact"/>
+            </w:pPr>
+            <w:r>
+              <w:t xml:space="preserve">Result</w:t>
+            </w:r>
+          </w:p>
+        </w:tc>
+      </w:tr>
+      <w:tr>
+        <w:tc>
+          <w:tcPr/>
+          <w:p>
+            <w:pPr>
+              <w:pStyle w:val="Compact"/>
+            </w:pPr>
+            <w:r>
+              <w:t xml:space="preserve">Attack detection rate</w:t>
+            </w:r>
+          </w:p>
+        </w:tc>
+        <w:tc>
+          <w:tcPr/>
+          <w:p>
+            <w:pPr>
+              <w:pStyle w:val="Compact"/>
+            </w:pPr>
+            <w:r>
+              <w:rPr>
+                <w:b/>
+                <w:bCs/>
+              </w:rPr>
+              <w:t xml:space="preserve">100%</w:t>
+            </w:r>
+            <w:r>
+              <w:t xml:space="preserve"> </w:t>
+            </w:r>
+            <w:r>
+              <w:t xml:space="preserve">(3/3, each with the correct response</w:t>
+            </w:r>
+            <w:r>
+              <w:t xml:space="preserve"> </w:t>
+            </w:r>
+            <w:r>
+              <w:rPr>
+                <w:i/>
+                <w:iCs/>
+              </w:rPr>
+              <w:t xml:space="preserve">and</w:t>
+            </w:r>
+            <w:r>
+              <w:t xml:space="preserve"> </w:t>
+            </w:r>
+            <w:r>
+              <w:t xml:space="preserve">insider type)</w:t>
+            </w:r>
+          </w:p>
+        </w:tc>
+      </w:tr>
+      <w:tr>
+        <w:tc>
+          <w:tcPr/>
+          <w:p>
+            <w:pPr>
+              <w:pStyle w:val="Compact"/>
+            </w:pPr>
+            <w:r>
+              <w:t xml:space="preserve">False blocks on benign sessions</w:t>
+            </w:r>
+          </w:p>
+        </w:tc>
+        <w:tc>
+          <w:tcPr/>
+          <w:p>
+            <w:pPr>
+              <w:pStyle w:val="Compact"/>
+            </w:pPr>
+            <w:r>
+              <w:rPr>
+                <w:b/>
+                <w:bCs/>
+              </w:rPr>
+              <w:t xml:space="preserve">0</w:t>
+            </w:r>
+            <w:r>
+              <w:t xml:space="preserve"> </w:t>
+            </w:r>
+            <w:r>
+              <w:t xml:space="preserve">of 230</w:t>
+            </w:r>
+          </w:p>
+        </w:tc>
+      </w:tr>
+      <w:tr>
+        <w:tc>
+          <w:tcPr/>
+          <w:p>
+            <w:pPr>
+              <w:pStyle w:val="Compact"/>
+            </w:pPr>
+            <w:r>
+              <w:t xml:space="preserve">False-alarm rate (any challenge/hold)</w:t>
+            </w:r>
+          </w:p>
+        </w:tc>
+        <w:tc>
+          <w:tcPr/>
+          <w:p>
+            <w:pPr>
+              <w:pStyle w:val="Compact"/>
+            </w:pPr>
+            <w:r>
+              <w:rPr>
+                <w:b/>
+                <w:bCs/>
+              </w:rPr>
+              <w:t xml:space="preserve">1.7%</w:t>
+            </w:r>
+          </w:p>
+        </w:tc>
+      </w:tr>
+    </w:tbl>
+    <w:p>
+      <w:pPr>
+        <w:pStyle w:val="BodyText"/>
+      </w:pPr>
+      <w:r>
+        <w:t xml:space="preserve">The numbers are live in the SOC (</w:t>
+      </w:r>
+      <w:r>
+        <w:rPr>
+          <w:i/>
+          <w:iCs/>
+        </w:rPr>
+        <w:t xml:space="preserve">AI Model Insights -&gt; Measured Performance</w:t>
+      </w:r>
+      <w:r>
+        <w:t xml:space="preserve">) and via</w:t>
+      </w:r>
+      <w:r>
+        <w:t xml:space="preserve"> </w:t>
+      </w:r>
+      <w:r>
+        <w:rPr>
+          <w:rStyle w:val="VerbatimChar"/>
+        </w:rPr>
+        <w:t xml:space="preserve">GET /soc/model/eval</w:t>
+      </w:r>
+      <w:r>
+        <w:t xml:space="preserve">; the benchmark itself is a regression test in the suite.</w:t>
+      </w:r>
+    </w:p>
     <w:p>
       <w:pPr>
         <w:pStyle w:val="CaptionedFigure"/>
@@ -2750,18 +3147,18 @@
           <wp:inline>
             <wp:extent cx="5334000" cy="2561431"/>
             <wp:effectExtent b="0" l="0" r="0" t="0"/>
-            <wp:docPr descr="Scoring pipeline — rules and UEBA fuse into a 0–100 score that maps onto the response ladder." title="" id="23" name="Picture"/>
+            <wp:docPr descr="Scoring pipeline — rules and UEBA fuse into a 0–100 score that maps onto the response ladder." title="" id="24" name="Picture"/>
             <a:graphic>
               <a:graphicData uri="http://schemas.openxmlformats.org/drawingml/2006/picture">
                 <pic:pic>
                   <pic:nvPicPr>
-                    <pic:cNvPr descr="img/scoring.png" id="24" name="Picture"/>
+                    <pic:cNvPr descr="img/scoring.png" id="25" name="Picture"/>
                     <pic:cNvPicPr>
                       <a:picLocks noChangeArrowheads="1" noChangeAspect="1"/>
                     </pic:cNvPicPr>
                   </pic:nvPicPr>
                   <pic:blipFill>
-                    <a:blip r:embed="rId22"/>
+                    <a:blip r:embed="rId23"/>
                     <a:stretch>
                       <a:fillRect/>
                     </a:stretch>
@@ -2796,9 +3193,9 @@
         <w:t xml:space="preserve">Scoring pipeline — rules and UEBA fuse into a 0–100 score that maps onto the response ladder.</w:t>
       </w:r>
     </w:p>
-    <w:bookmarkEnd w:id="25"/>
     <w:bookmarkEnd w:id="26"/>
-    <w:bookmarkStart w:id="30" w:name="the-three-insider-types"/>
+    <w:bookmarkEnd w:id="27"/>
+    <w:bookmarkStart w:id="31" w:name="the-three-insider-types"/>
     <w:p>
       <w:pPr>
         <w:pStyle w:val="Heading1"/>
@@ -2840,18 +3237,18 @@
           <wp:inline>
             <wp:extent cx="5334000" cy="2903140"/>
             <wp:effectExtent b="0" l="0" r="0" t="0"/>
-            <wp:docPr descr="Three insider types — one engine, three distinct, correctly-typed responses." title="" id="28" name="Picture"/>
+            <wp:docPr descr="Three insider types — one engine, three distinct, correctly-typed responses." title="" id="29" name="Picture"/>
             <a:graphic>
               <a:graphicData uri="http://schemas.openxmlformats.org/drawingml/2006/picture">
                 <pic:pic>
                   <pic:nvPicPr>
-                    <pic:cNvPr descr="img/insider_types.png" id="29" name="Picture"/>
+                    <pic:cNvPr descr="img/insider_types.png" id="30" name="Picture"/>
                     <pic:cNvPicPr>
                       <a:picLocks noChangeArrowheads="1" noChangeAspect="1"/>
                     </pic:cNvPicPr>
                   </pic:nvPicPr>
                   <pic:blipFill>
-                    <a:blip r:embed="rId27"/>
+                    <a:blip r:embed="rId28"/>
                     <a:stretch>
                       <a:fillRect/>
                     </a:stretch>
@@ -3183,8 +3580,8 @@
         <w:t xml:space="preserve">.</w:t>
       </w:r>
     </w:p>
-    <w:bookmarkEnd w:id="30"/>
-    <w:bookmarkStart w:id="38" w:name="adaptive-response-and-pam"/>
+    <w:bookmarkEnd w:id="31"/>
+    <w:bookmarkStart w:id="43" w:name="adaptive-response-and-pam"/>
     <w:p>
       <w:pPr>
         <w:pStyle w:val="Heading1"/>
@@ -3193,7 +3590,7 @@
         <w:t xml:space="preserve">Adaptive Response and PAM</w:t>
       </w:r>
     </w:p>
-    <w:bookmarkStart w:id="34" w:name="live-enforcement"/>
+    <w:bookmarkStart w:id="35" w:name="live-enforcement"/>
     <w:p>
       <w:pPr>
         <w:pStyle w:val="Heading2"/>
@@ -3245,18 +3642,18 @@
           <wp:inline>
             <wp:extent cx="5334000" cy="2817018"/>
             <wp:effectExtent b="0" l="0" r="0" t="0"/>
-            <wp:docPr descr="Live enforcement — every action is scored and routed to one of four responses before it takes effect." title="" id="32" name="Picture"/>
+            <wp:docPr descr="Live enforcement — every action is scored and routed to one of four responses before it takes effect." title="" id="33" name="Picture"/>
             <a:graphic>
               <a:graphicData uri="http://schemas.openxmlformats.org/drawingml/2006/picture">
                 <pic:pic>
                   <pic:nvPicPr>
-                    <pic:cNvPr descr="img/live_sequence.png" id="33" name="Picture"/>
+                    <pic:cNvPr descr="img/live_sequence.png" id="34" name="Picture"/>
                     <pic:cNvPicPr>
                       <a:picLocks noChangeArrowheads="1" noChangeAspect="1"/>
                     </pic:cNvPicPr>
                   </pic:nvPicPr>
                   <pic:blipFill>
-                    <a:blip r:embed="rId31"/>
+                    <a:blip r:embed="rId32"/>
                     <a:stretch>
                       <a:fillRect/>
                     </a:stretch>
@@ -3381,8 +3778,8 @@
         <w:t xml:space="preserve">The API refuses to execute; the UI overlay is cosmetic.</w:t>
       </w:r>
     </w:p>
-    <w:bookmarkEnd w:id="34"/>
-    <w:bookmarkStart w:id="35" w:name="pam-surface"/>
+    <w:bookmarkEnd w:id="35"/>
+    <w:bookmarkStart w:id="36" w:name="pam-surface"/>
     <w:p>
       <w:pPr>
         <w:pStyle w:val="Heading2"/>
@@ -3500,8 +3897,288 @@
         <w:t xml:space="preserve">) — an analyst approves a held session; the approval is written to the signed audit log.</w:t>
       </w:r>
     </w:p>
-    <w:bookmarkEnd w:id="35"/>
-    <w:bookmarkStart w:id="36" w:name="analyst-response-actions"/>
+    <w:bookmarkEnd w:id="36"/>
+    <w:bookmarkStart w:id="37" w:name="X0b3076914694d6eb592a9b3f5d365c48ae32229"/>
+    <w:p>
+      <w:pPr>
+        <w:pStyle w:val="Heading2"/>
+      </w:pPr>
+      <w:r>
+        <w:t xml:space="preserve">Just-in-time (JIT) access — no standing privilege</w:t>
+      </w:r>
+    </w:p>
+    <w:p>
+      <w:pPr>
+        <w:pStyle w:val="FirstParagraph"/>
+      </w:pPr>
+      <w:r>
+        <w:t xml:space="preserve">Privilege elevation is a</w:t>
+      </w:r>
+      <w:r>
+        <w:t xml:space="preserve"> </w:t>
+      </w:r>
+      <w:r>
+        <w:rPr>
+          <w:b/>
+          <w:bCs/>
+        </w:rPr>
+        <w:t xml:space="preserve">workflow, not a right</w:t>
+      </w:r>
+      <w:r>
+        <w:t xml:space="preserve">: an employee requests elevation for</w:t>
+      </w:r>
+      <w:r>
+        <w:t xml:space="preserve"> </w:t>
+      </w:r>
+      <w:r>
+        <w:rPr>
+          <w:b/>
+          <w:bCs/>
+        </w:rPr>
+        <w:t xml:space="preserve">one resource</w:t>
+      </w:r>
+      <w:r>
+        <w:t xml:space="preserve"> </w:t>
+      </w:r>
+      <w:r>
+        <w:t xml:space="preserve">with a business justification and a duration (max 60 minutes); an SOC analyst approves or denies it from the</w:t>
+      </w:r>
+      <w:r>
+        <w:t xml:space="preserve"> </w:t>
+      </w:r>
+      <w:r>
+        <w:rPr>
+          <w:b/>
+          <w:bCs/>
+        </w:rPr>
+        <w:t xml:space="preserve">JIT &amp; Credentials</w:t>
+      </w:r>
+      <w:r>
+        <w:t xml:space="preserve"> </w:t>
+      </w:r>
+      <w:r>
+        <w:t xml:space="preserve">queue; an approved grant is</w:t>
+      </w:r>
+      <w:r>
+        <w:t xml:space="preserve"> </w:t>
+      </w:r>
+      <w:r>
+        <w:rPr>
+          <w:b/>
+          <w:bCs/>
+        </w:rPr>
+        <w:t xml:space="preserve">time-boxed and auto-expires</w:t>
+      </w:r>
+      <w:r>
+        <w:t xml:space="preserve">. While ACTIVE, the grant</w:t>
+      </w:r>
+      <w:r>
+        <w:t xml:space="preserve"> </w:t>
+      </w:r>
+      <w:r>
+        <w:rPr>
+          <w:i/>
+          <w:iCs/>
+        </w:rPr>
+        <w:t xml:space="preserve">sanctions</w:t>
+      </w:r>
+      <w:r>
+        <w:t xml:space="preserve"> </w:t>
+      </w:r>
+      <w:r>
+        <w:t xml:space="preserve">escalation on exactly that resource (see the rule engine above); on expiry the engine re-arms automatically. Every request, decision, and expiry is sealed to the signed audit log.</w:t>
+      </w:r>
+    </w:p>
+    <w:bookmarkEnd w:id="37"/>
+    <w:bookmarkStart w:id="38" w:name="Xffe0b2459272372ae98819955d8ffd39154c2cb"/>
+    <w:p>
+      <w:pPr>
+        <w:pStyle w:val="Heading2"/>
+      </w:pPr>
+      <w:r>
+        <w:t xml:space="preserve">Credential checkout — the vault as a workflow</w:t>
+      </w:r>
+    </w:p>
+    <w:p>
+      <w:pPr>
+        <w:pStyle w:val="FirstParagraph"/>
+      </w:pPr>
+      <w:r>
+        <w:t xml:space="preserve">Privileged secrets (database root, payment-gateway key, SWIFT passphrase) live</w:t>
+      </w:r>
+      <w:r>
+        <w:t xml:space="preserve"> </w:t>
+      </w:r>
+      <w:r>
+        <w:rPr>
+          <w:b/>
+          <w:bCs/>
+        </w:rPr>
+        <w:t xml:space="preserve">ML-KEM-768-sealed</w:t>
+      </w:r>
+      <w:r>
+        <w:t xml:space="preserve"> </w:t>
+      </w:r>
+      <w:r>
+        <w:t xml:space="preserve">in the vault and are released only through a checkout: a</w:t>
+      </w:r>
+      <w:r>
+        <w:t xml:space="preserve"> </w:t>
+      </w:r>
+      <w:r>
+        <w:rPr>
+          <w:b/>
+          <w:bCs/>
+        </w:rPr>
+        <w:t xml:space="preserve">5-minute lease</w:t>
+      </w:r>
+      <w:r>
+        <w:t xml:space="preserve"> </w:t>
+      </w:r>
+      <w:r>
+        <w:t xml:space="preserve">with a live countdown, signed into the audit chain. The same risk score that drives session enforcement gates the vault — a session at</w:t>
+      </w:r>
+      <w:r>
+        <w:t xml:space="preserve"> </w:t>
+      </w:r>
+      <w:r>
+        <w:rPr>
+          <w:b/>
+          <w:bCs/>
+        </w:rPr>
+        <w:t xml:space="preserve">risk &gt;= 70 or blocked is refused</w:t>
+      </w:r>
+      <w:r>
+        <w:t xml:space="preserve">, the refusal raises a CRITICAL SOC alert,</w:t>
+      </w:r>
+      <w:r>
+        <w:t xml:space="preserve"> </w:t>
+      </w:r>
+      <w:r>
+        <w:rPr>
+          <w:b/>
+          <w:bCs/>
+        </w:rPr>
+        <w:t xml:space="preserve">and the refusal itself is recorded as evidence</w:t>
+      </w:r>
+      <w:r>
+        <w:t xml:space="preserve">. The SOC sees every checkout and denial (</w:t>
+      </w:r>
+      <w:r>
+        <w:rPr>
+          <w:rStyle w:val="VerbatimChar"/>
+        </w:rPr>
+        <w:t xml:space="preserve">GET /soc/checkouts</w:t>
+      </w:r>
+      <w:r>
+        <w:t xml:space="preserve">).</w:t>
+      </w:r>
+    </w:p>
+    <w:bookmarkEnd w:id="38"/>
+    <w:bookmarkStart w:id="39" w:name="risk-based-authentication-adaptive-login"/>
+    <w:p>
+      <w:pPr>
+        <w:pStyle w:val="Heading2"/>
+      </w:pPr>
+      <w:r>
+        <w:t xml:space="preserve">Risk-based authentication (adaptive login)</w:t>
+      </w:r>
+    </w:p>
+    <w:p>
+      <w:pPr>
+        <w:pStyle w:val="FirstParagraph"/>
+      </w:pPr>
+      <w:r>
+        <w:t xml:space="preserve">A correct password is not enough for a risky account. At login, Prahari checks the same context signals the detection engine scores —</w:t>
+      </w:r>
+      <w:r>
+        <w:t xml:space="preserve"> </w:t>
+      </w:r>
+      <w:r>
+        <w:rPr>
+          <w:b/>
+          <w:bCs/>
+        </w:rPr>
+        <w:t xml:space="preserve">dormant account, expired access grant, unrecognized network/device</w:t>
+      </w:r>
+      <w:r>
+        <w:t xml:space="preserve"> </w:t>
+      </w:r>
+      <w:r>
+        <w:t xml:space="preserve">— and any hit demands the</w:t>
+      </w:r>
+      <w:r>
+        <w:t xml:space="preserve"> </w:t>
+      </w:r>
+      <w:r>
+        <w:rPr>
+          <w:b/>
+          <w:bCs/>
+        </w:rPr>
+        <w:t xml:space="preserve">step-up MFA code before a token is issued</w:t>
+      </w:r>
+      <w:r>
+        <w:t xml:space="preserve">. Challenges, failures (which also alert the SOC), and verifications are all written to the signed audit chain.</w:t>
+      </w:r>
+    </w:p>
+    <w:bookmarkEnd w:id="39"/>
+    <w:bookmarkStart w:id="40" w:name="signed-incident-reports"/>
+    <w:p>
+      <w:pPr>
+        <w:pStyle w:val="Heading2"/>
+      </w:pPr>
+      <w:r>
+        <w:t xml:space="preserve">Signed incident reports</w:t>
+      </w:r>
+    </w:p>
+    <w:p>
+      <w:pPr>
+        <w:pStyle w:val="FirstParagraph"/>
+      </w:pPr>
+      <w:r>
+        <w:rPr>
+          <w:rStyle w:val="VerbatimChar"/>
+        </w:rPr>
+        <w:t xml:space="preserve">GET /soc/sessions/{id}/report</w:t>
+      </w:r>
+      <w:r>
+        <w:t xml:space="preserve"> </w:t>
+      </w:r>
+      <w:r>
+        <w:t xml:space="preserve">(the SOC’s</w:t>
+      </w:r>
+      <w:r>
+        <w:t xml:space="preserve"> </w:t>
+      </w:r>
+      <w:r>
+        <w:rPr>
+          <w:b/>
+          <w:bCs/>
+        </w:rPr>
+        <w:t xml:space="preserve">Evidence pack</w:t>
+      </w:r>
+      <w:r>
+        <w:t xml:space="preserve"> </w:t>
+      </w:r>
+      <w:r>
+        <w:t xml:space="preserve">button) exports a self-contained incident document — session facts, recorded command transcript, per-action risk trajectory, model insights, alerts, audit extract, and chain status — whose canonical JSON is</w:t>
+      </w:r>
+      <w:r>
+        <w:t xml:space="preserve"> </w:t>
+      </w:r>
+      <w:r>
+        <w:rPr>
+          <w:b/>
+          <w:bCs/>
+        </w:rPr>
+        <w:t xml:space="preserve">hashed and ML-DSA-65-signed</w:t>
+      </w:r>
+      <w:r>
+        <w:t xml:space="preserve">, so the exported file is itself verifiable evidence a bank can hand to compliance.</w:t>
+      </w:r>
+    </w:p>
+    <w:bookmarkEnd w:id="40"/>
+    <w:bookmarkStart w:id="41" w:name="analyst-response-actions"/>
     <w:p>
       <w:pPr>
         <w:pStyle w:val="Heading2"/>
@@ -3611,8 +4288,8 @@
         <w:t xml:space="preserve">) — marks a flag as a reviewed false-positive and clears it from the live board.</w:t>
       </w:r>
     </w:p>
-    <w:bookmarkEnd w:id="36"/>
-    <w:bookmarkStart w:id="37" w:name="explainable-model-view"/>
+    <w:bookmarkEnd w:id="41"/>
+    <w:bookmarkStart w:id="42" w:name="explainable-model-view"/>
     <w:p>
       <w:pPr>
         <w:pStyle w:val="Heading2"/>
@@ -3727,9 +4404,9 @@
         <w:t xml:space="preserve">) — a live strip of program impact: sessions watched, threats blocked, money held or flagged, and mean time to decision.</w:t>
       </w:r>
     </w:p>
-    <w:bookmarkEnd w:id="37"/>
-    <w:bookmarkEnd w:id="38"/>
-    <w:bookmarkStart w:id="42" w:name="core-banking-operations"/>
+    <w:bookmarkEnd w:id="42"/>
+    <w:bookmarkEnd w:id="43"/>
+    <w:bookmarkStart w:id="47" w:name="core-banking-operations"/>
     <w:p>
       <w:pPr>
         <w:pStyle w:val="Heading1"/>
@@ -3789,18 +4466,18 @@
           <wp:inline>
             <wp:extent cx="5334000" cy="2219721"/>
             <wp:effectExtent b="0" l="0" r="0" t="0"/>
-            <wp:docPr descr="Core-banking flow — a transfer is checked for fraud and privileged-session risk, then cleared, held for maker-checker, or flagged." title="" id="40" name="Picture"/>
+            <wp:docPr descr="Core-banking flow — a transfer is checked for fraud and privileged-session risk, then cleared, held for maker-checker, or flagged." title="" id="45" name="Picture"/>
             <a:graphic>
               <a:graphicData uri="http://schemas.openxmlformats.org/drawingml/2006/picture">
                 <pic:pic>
                   <pic:nvPicPr>
-                    <pic:cNvPr descr="img/bank_flow.png" id="41" name="Picture"/>
+                    <pic:cNvPr descr="img/bank_flow.png" id="46" name="Picture"/>
                     <pic:cNvPicPr>
                       <a:picLocks noChangeArrowheads="1" noChangeAspect="1"/>
                     </pic:cNvPicPr>
                   </pic:nvPicPr>
                   <pic:blipFill>
-                    <a:blip r:embed="rId39"/>
+                    <a:blip r:embed="rId44"/>
                     <a:stretch>
                       <a:fillRect/>
                     </a:stretch>
@@ -4146,8 +4823,8 @@
         <w:t xml:space="preserve">in the portal and surfaces as a typed alert in the SOC, closing the loop between the banking floor and the analyst.</w:t>
       </w:r>
     </w:p>
-    <w:bookmarkEnd w:id="42"/>
-    <w:bookmarkStart w:id="51" w:name="post-quantum-security-layer"/>
+    <w:bookmarkEnd w:id="47"/>
+    <w:bookmarkStart w:id="56" w:name="post-quantum-security-layer"/>
     <w:p>
       <w:pPr>
         <w:pStyle w:val="Heading1"/>
@@ -4406,7 +5083,7 @@
         <w:t xml:space="preserve">forces the fallback for a reproducible demo. The two providers are interchangeable and the same FIPS algorithms and test suite cover both.</w:t>
       </w:r>
     </w:p>
-    <w:bookmarkStart w:id="46" w:name="credential-vault"/>
+    <w:bookmarkStart w:id="51" w:name="credential-vault"/>
     <w:p>
       <w:pPr>
         <w:pStyle w:val="Heading2"/>
@@ -4424,18 +5101,18 @@
           <wp:inline>
             <wp:extent cx="5067300" cy="2026919"/>
             <wp:effectExtent b="0" l="0" r="0" t="0"/>
-            <wp:docPr descr="Credential vault — a secret is sealed with AES-256-GCM under an ML-KEM-768 shared secret." title="" id="44" name="Picture"/>
+            <wp:docPr descr="Credential vault — a secret is sealed with AES-256-GCM under an ML-KEM-768 shared secret." title="" id="49" name="Picture"/>
             <a:graphic>
               <a:graphicData uri="http://schemas.openxmlformats.org/drawingml/2006/picture">
                 <pic:pic>
                   <pic:nvPicPr>
-                    <pic:cNvPr descr="img/pqc_vault.png" id="45" name="Picture"/>
+                    <pic:cNvPr descr="img/pqc_vault.png" id="50" name="Picture"/>
                     <pic:cNvPicPr>
                       <a:picLocks noChangeArrowheads="1" noChangeAspect="1"/>
                     </pic:cNvPicPr>
                   </pic:nvPicPr>
                   <pic:blipFill>
-                    <a:blip r:embed="rId43"/>
+                    <a:blip r:embed="rId48"/>
                     <a:stretch>
                       <a:fillRect/>
                     </a:stretch>
@@ -4494,8 +5171,8 @@
         <w:t xml:space="preserve">the ML-KEM shared secret; decryption requires the vault’s KEM secret key. Data recorded today cannot be decrypted later, even by a quantum adversary.</w:t>
       </w:r>
     </w:p>
-    <w:bookmarkEnd w:id="46"/>
-    <w:bookmarkStart w:id="50" w:name="tamper-evident-audit-log"/>
+    <w:bookmarkEnd w:id="51"/>
+    <w:bookmarkStart w:id="55" w:name="tamper-evident-audit-log"/>
     <w:p>
       <w:pPr>
         <w:pStyle w:val="Heading2"/>
@@ -4513,18 +5190,18 @@
           <wp:inline>
             <wp:extent cx="5067300" cy="2026919"/>
             <wp:effectExtent b="0" l="0" r="0" t="0"/>
-            <wp:docPr descr="Audit chain — each entry hash-links the previous and is ML-DSA-65 signed; any edit fails verification." title="" id="48" name="Picture"/>
+            <wp:docPr descr="Audit chain — each entry hash-links the previous and is ML-DSA-65 signed; any edit fails verification." title="" id="53" name="Picture"/>
             <a:graphic>
               <a:graphicData uri="http://schemas.openxmlformats.org/drawingml/2006/picture">
                 <pic:pic>
                   <pic:nvPicPr>
-                    <pic:cNvPr descr="img/audit_chain.png" id="49" name="Picture"/>
+                    <pic:cNvPr descr="img/audit_chain.png" id="54" name="Picture"/>
                     <pic:cNvPicPr>
                       <a:picLocks noChangeArrowheads="1" noChangeAspect="1"/>
                     </pic:cNvPicPr>
                   </pic:nvPicPr>
                   <pic:blipFill>
-                    <a:blip r:embed="rId47"/>
+                    <a:blip r:embed="rId52"/>
                     <a:stretch>
                       <a:fillRect/>
                     </a:stretch>
@@ -4613,9 +5290,9 @@
         <w:t xml:space="preserve">then fails at the exact entry.</w:t>
       </w:r>
     </w:p>
-    <w:bookmarkEnd w:id="50"/>
-    <w:bookmarkEnd w:id="51"/>
-    <w:bookmarkStart w:id="52" w:name="authentication-and-authorization"/>
+    <w:bookmarkEnd w:id="55"/>
+    <w:bookmarkEnd w:id="56"/>
+    <w:bookmarkStart w:id="57" w:name="authentication-and-authorization"/>
     <w:p>
       <w:pPr>
         <w:pStyle w:val="Heading1"/>
@@ -4671,13 +5348,13 @@
           <w:b/>
           <w:bCs/>
         </w:rPr>
-        <w:t xml:space="preserve">Tokens</w:t>
-      </w:r>
-      <w:r>
-        <w:t xml:space="preserve"> </w:t>
-      </w:r>
-      <w:r>
-        <w:t xml:space="preserve">— compact HMAC-SHA256-signed, JWT-like tokens with expiry, verified on every request.</w:t>
+        <w:t xml:space="preserve">Risk-based login</w:t>
+      </w:r>
+      <w:r>
+        <w:t xml:space="preserve"> </w:t>
+      </w:r>
+      <w:r>
+        <w:t xml:space="preserve">— dormant / expired / unrecognized-context accounts must pass step-up MFA at the door before any token is issued (audit-chained; failures alert the SOC).</w:t>
       </w:r>
     </w:p>
     <w:p>
@@ -4693,6 +5370,28 @@
           <w:b/>
           <w:bCs/>
         </w:rPr>
+        <w:t xml:space="preserve">Tokens</w:t>
+      </w:r>
+      <w:r>
+        <w:t xml:space="preserve"> </w:t>
+      </w:r>
+      <w:r>
+        <w:t xml:space="preserve">— compact HMAC-SHA256-signed, JWT-like tokens with expiry, verified on every request.</w:t>
+      </w:r>
+    </w:p>
+    <w:p>
+      <w:pPr>
+        <w:pStyle w:val="Compact"/>
+        <w:numPr>
+          <w:ilvl w:val="0"/>
+          <w:numId w:val="1009"/>
+        </w:numPr>
+      </w:pPr>
+      <w:r>
+        <w:rPr>
+          <w:b/>
+          <w:bCs/>
+        </w:rPr>
         <w:t xml:space="preserve">Roles</w:t>
       </w:r>
       <w:r>
@@ -4755,8 +5454,8 @@
         <w:t xml:space="preserve">This layer is demo-grade by design; a production deployment swaps in the bank’s IdP/SSO behind the same dependency.</w:t>
       </w:r>
     </w:p>
-    <w:bookmarkEnd w:id="52"/>
-    <w:bookmarkStart w:id="53" w:name="api-reference"/>
+    <w:bookmarkEnd w:id="57"/>
+    <w:bookmarkStart w:id="58" w:name="api-reference"/>
     <w:p>
       <w:pPr>
         <w:pStyle w:val="Heading1"/>
@@ -4868,7 +5567,7 @@
               <w:pStyle w:val="Compact"/>
             </w:pPr>
             <w:r>
-              <w:t xml:space="preserve">issue token (username / password)</w:t>
+              <w:t xml:space="preserve">issue token; risky accounts get an MFA challenge first</w:t>
             </w:r>
           </w:p>
         </w:tc>
@@ -5582,7 +6281,7 @@
               <w:pStyle w:val="Compact"/>
             </w:pPr>
             <w:r>
-              <w:t xml:space="preserve">/soc/metrics</w:t>
+              <w:t xml:space="preserve">/soc/sessions/{id}/report</w:t>
             </w:r>
           </w:p>
         </w:tc>
@@ -5604,7 +6303,7 @@
               <w:pStyle w:val="Compact"/>
             </w:pPr>
             <w:r>
-              <w:t xml:space="preserve">live impact metrics strip</w:t>
+              <w:t xml:space="preserve">ML-DSA-signed incident evidence pack</w:t>
             </w:r>
           </w:p>
         </w:tc>
@@ -5628,29 +6327,29 @@
               <w:pStyle w:val="Compact"/>
             </w:pPr>
             <w:r>
-              <w:t xml:space="preserve">/bank/accounts, /transactions</w:t>
-            </w:r>
-          </w:p>
-        </w:tc>
-        <w:tc>
-          <w:tcPr/>
-          <w:p>
-            <w:pPr>
-              <w:pStyle w:val="Compact"/>
-            </w:pPr>
-            <w:r>
-              <w:t xml:space="preserve">employee</w:t>
-            </w:r>
-          </w:p>
-        </w:tc>
-        <w:tc>
-          <w:tcPr/>
-          <w:p>
-            <w:pPr>
-              <w:pStyle w:val="Compact"/>
-            </w:pPr>
-            <w:r>
-              <w:t xml:space="preserve">account list / ledger</w:t>
+              <w:t xml:space="preserve">/soc/model/eval</w:t>
+            </w:r>
+          </w:p>
+        </w:tc>
+        <w:tc>
+          <w:tcPr/>
+          <w:p>
+            <w:pPr>
+              <w:pStyle w:val="Compact"/>
+            </w:pPr>
+            <w:r>
+              <w:t xml:space="preserve">analyst</w:t>
+            </w:r>
+          </w:p>
+        </w:tc>
+        <w:tc>
+          <w:tcPr/>
+          <w:p>
+            <w:pPr>
+              <w:pStyle w:val="Compact"/>
+            </w:pPr>
+            <w:r>
+              <w:t xml:space="preserve">measured detector performance (held-out benchmark)</w:t>
             </w:r>
           </w:p>
         </w:tc>
@@ -5674,29 +6373,29 @@
               <w:pStyle w:val="Compact"/>
             </w:pPr>
             <w:r>
-              <w:t xml:space="preserve">/bank/pending, /beneficiaries</w:t>
-            </w:r>
-          </w:p>
-        </w:tc>
-        <w:tc>
-          <w:tcPr/>
-          <w:p>
-            <w:pPr>
-              <w:pStyle w:val="Compact"/>
-            </w:pPr>
-            <w:r>
-              <w:t xml:space="preserve">employee</w:t>
-            </w:r>
-          </w:p>
-        </w:tc>
-        <w:tc>
-          <w:tcPr/>
-          <w:p>
-            <w:pPr>
-              <w:pStyle w:val="Compact"/>
-            </w:pPr>
-            <w:r>
-              <w:t xml:space="preserve">held queue / payees</w:t>
+              <w:t xml:space="preserve">/soc/metrics</w:t>
+            </w:r>
+          </w:p>
+        </w:tc>
+        <w:tc>
+          <w:tcPr/>
+          <w:p>
+            <w:pPr>
+              <w:pStyle w:val="Compact"/>
+            </w:pPr>
+            <w:r>
+              <w:t xml:space="preserve">analyst</w:t>
+            </w:r>
+          </w:p>
+        </w:tc>
+        <w:tc>
+          <w:tcPr/>
+          <w:p>
+            <w:pPr>
+              <w:pStyle w:val="Compact"/>
+            </w:pPr>
+            <w:r>
+              <w:t xml:space="preserve">live impact metrics strip</w:t>
             </w:r>
           </w:p>
         </w:tc>
@@ -5709,40 +6408,40 @@
               <w:pStyle w:val="Compact"/>
             </w:pPr>
             <w:r>
-              <w:t xml:space="preserve">POST</w:t>
-            </w:r>
-          </w:p>
-        </w:tc>
-        <w:tc>
-          <w:tcPr/>
-          <w:p>
-            <w:pPr>
-              <w:pStyle w:val="Compact"/>
-            </w:pPr>
-            <w:r>
-              <w:t xml:space="preserve">/bank/transfer</w:t>
-            </w:r>
-          </w:p>
-        </w:tc>
-        <w:tc>
-          <w:tcPr/>
-          <w:p>
-            <w:pPr>
-              <w:pStyle w:val="Compact"/>
-            </w:pPr>
-            <w:r>
-              <w:t xml:space="preserve">employee</w:t>
-            </w:r>
-          </w:p>
-        </w:tc>
-        <w:tc>
-          <w:tcPr/>
-          <w:p>
-            <w:pPr>
-              <w:pStyle w:val="Compact"/>
-            </w:pPr>
-            <w:r>
-              <w:t xml:space="preserve">submit a transfer -&gt; fraud + risk gated</w:t>
+              <w:t xml:space="preserve">GET</w:t>
+            </w:r>
+          </w:p>
+        </w:tc>
+        <w:tc>
+          <w:tcPr/>
+          <w:p>
+            <w:pPr>
+              <w:pStyle w:val="Compact"/>
+            </w:pPr>
+            <w:r>
+              <w:t xml:space="preserve">/soc/jit</w:t>
+            </w:r>
+          </w:p>
+        </w:tc>
+        <w:tc>
+          <w:tcPr/>
+          <w:p>
+            <w:pPr>
+              <w:pStyle w:val="Compact"/>
+            </w:pPr>
+            <w:r>
+              <w:t xml:space="preserve">analyst</w:t>
+            </w:r>
+          </w:p>
+        </w:tc>
+        <w:tc>
+          <w:tcPr/>
+          <w:p>
+            <w:pPr>
+              <w:pStyle w:val="Compact"/>
+            </w:pPr>
+            <w:r>
+              <w:t xml:space="preserve">JIT approval queue</w:t>
             </w:r>
           </w:p>
         </w:tc>
@@ -5766,29 +6465,29 @@
               <w:pStyle w:val="Compact"/>
             </w:pPr>
             <w:r>
-              <w:t xml:space="preserve">/bank/transactions/{id}/approve</w:t>
-            </w:r>
-          </w:p>
-        </w:tc>
-        <w:tc>
-          <w:tcPr/>
-          <w:p>
-            <w:pPr>
-              <w:pStyle w:val="Compact"/>
-            </w:pPr>
-            <w:r>
-              <w:t xml:space="preserve">employee</w:t>
-            </w:r>
-          </w:p>
-        </w:tc>
-        <w:tc>
-          <w:tcPr/>
-          <w:p>
-            <w:pPr>
-              <w:pStyle w:val="Compact"/>
-            </w:pPr>
-            <w:r>
-              <w:t xml:space="preserve">settle a held transfer (second officer)</w:t>
+              <w:t xml:space="preserve">/soc/jit/{id}/approve, /deny</w:t>
+            </w:r>
+          </w:p>
+        </w:tc>
+        <w:tc>
+          <w:tcPr/>
+          <w:p>
+            <w:pPr>
+              <w:pStyle w:val="Compact"/>
+            </w:pPr>
+            <w:r>
+              <w:t xml:space="preserve">analyst</w:t>
+            </w:r>
+          </w:p>
+        </w:tc>
+        <w:tc>
+          <w:tcPr/>
+          <w:p>
+            <w:pPr>
+              <w:pStyle w:val="Compact"/>
+            </w:pPr>
+            <w:r>
+              <w:t xml:space="preserve">decide a JIT elevation request</w:t>
             </w:r>
           </w:p>
         </w:tc>
@@ -5801,40 +6500,40 @@
               <w:pStyle w:val="Compact"/>
             </w:pPr>
             <w:r>
-              <w:t xml:space="preserve">POST</w:t>
-            </w:r>
-          </w:p>
-        </w:tc>
-        <w:tc>
-          <w:tcPr/>
-          <w:p>
-            <w:pPr>
-              <w:pStyle w:val="Compact"/>
-            </w:pPr>
-            <w:r>
-              <w:t xml:space="preserve">/bank/transactions/{id}/reject</w:t>
-            </w:r>
-          </w:p>
-        </w:tc>
-        <w:tc>
-          <w:tcPr/>
-          <w:p>
-            <w:pPr>
-              <w:pStyle w:val="Compact"/>
-            </w:pPr>
-            <w:r>
-              <w:t xml:space="preserve">employee</w:t>
-            </w:r>
-          </w:p>
-        </w:tc>
-        <w:tc>
-          <w:tcPr/>
-          <w:p>
-            <w:pPr>
-              <w:pStyle w:val="Compact"/>
-            </w:pPr>
-            <w:r>
-              <w:t xml:space="preserve">reverse a held transfer</w:t>
+              <w:t xml:space="preserve">GET</w:t>
+            </w:r>
+          </w:p>
+        </w:tc>
+        <w:tc>
+          <w:tcPr/>
+          <w:p>
+            <w:pPr>
+              <w:pStyle w:val="Compact"/>
+            </w:pPr>
+            <w:r>
+              <w:t xml:space="preserve">/soc/checkouts</w:t>
+            </w:r>
+          </w:p>
+        </w:tc>
+        <w:tc>
+          <w:tcPr/>
+          <w:p>
+            <w:pPr>
+              <w:pStyle w:val="Compact"/>
+            </w:pPr>
+            <w:r>
+              <w:t xml:space="preserve">analyst</w:t>
+            </w:r>
+          </w:p>
+        </w:tc>
+        <w:tc>
+          <w:tcPr/>
+          <w:p>
+            <w:pPr>
+              <w:pStyle w:val="Compact"/>
+            </w:pPr>
+            <w:r>
+              <w:t xml:space="preserve">every credential checkout and refusal</w:t>
             </w:r>
           </w:p>
         </w:tc>
@@ -5858,29 +6557,29 @@
               <w:pStyle w:val="Compact"/>
             </w:pPr>
             <w:r>
-              <w:t xml:space="preserve">/demo/scenario/{kind}</w:t>
-            </w:r>
-          </w:p>
-        </w:tc>
-        <w:tc>
-          <w:tcPr/>
-          <w:p>
-            <w:pPr>
-              <w:pStyle w:val="Compact"/>
-            </w:pPr>
-            <w:r>
-              <w:t xml:space="preserve">analyst</w:t>
-            </w:r>
-          </w:p>
-        </w:tc>
-        <w:tc>
-          <w:tcPr/>
-          <w:p>
-            <w:pPr>
-              <w:pStyle w:val="Compact"/>
-            </w:pPr>
-            <w:r>
-              <w:t xml:space="preserve">run scripted malicious / compromised / negligent</w:t>
+              <w:t xml:space="preserve">/jit/request</w:t>
+            </w:r>
+          </w:p>
+        </w:tc>
+        <w:tc>
+          <w:tcPr/>
+          <w:p>
+            <w:pPr>
+              <w:pStyle w:val="Compact"/>
+            </w:pPr>
+            <w:r>
+              <w:t xml:space="preserve">employee</w:t>
+            </w:r>
+          </w:p>
+        </w:tc>
+        <w:tc>
+          <w:tcPr/>
+          <w:p>
+            <w:pPr>
+              <w:pStyle w:val="Compact"/>
+            </w:pPr>
+            <w:r>
+              <w:t xml:space="preserve">request time-boxed elevation (justified)</w:t>
             </w:r>
           </w:p>
         </w:tc>
@@ -5893,40 +6592,40 @@
               <w:pStyle w:val="Compact"/>
             </w:pPr>
             <w:r>
-              <w:t xml:space="preserve">POST</w:t>
-            </w:r>
-          </w:p>
-        </w:tc>
-        <w:tc>
-          <w:tcPr/>
-          <w:p>
-            <w:pPr>
-              <w:pStyle w:val="Compact"/>
-            </w:pPr>
-            <w:r>
-              <w:t xml:space="preserve">/demo/tamper</w:t>
-            </w:r>
-          </w:p>
-        </w:tc>
-        <w:tc>
-          <w:tcPr/>
-          <w:p>
-            <w:pPr>
-              <w:pStyle w:val="Compact"/>
-            </w:pPr>
-            <w:r>
-              <w:t xml:space="preserve">analyst</w:t>
-            </w:r>
-          </w:p>
-        </w:tc>
-        <w:tc>
-          <w:tcPr/>
-          <w:p>
-            <w:pPr>
-              <w:pStyle w:val="Compact"/>
-            </w:pPr>
-            <w:r>
-              <w:t xml:space="preserve">edit an audit entry (proves detection)</w:t>
+              <w:t xml:space="preserve">GET</w:t>
+            </w:r>
+          </w:p>
+        </w:tc>
+        <w:tc>
+          <w:tcPr/>
+          <w:p>
+            <w:pPr>
+              <w:pStyle w:val="Compact"/>
+            </w:pPr>
+            <w:r>
+              <w:t xml:space="preserve">/jit/mine</w:t>
+            </w:r>
+          </w:p>
+        </w:tc>
+        <w:tc>
+          <w:tcPr/>
+          <w:p>
+            <w:pPr>
+              <w:pStyle w:val="Compact"/>
+            </w:pPr>
+            <w:r>
+              <w:t xml:space="preserve">employee</w:t>
+            </w:r>
+          </w:p>
+        </w:tc>
+        <w:tc>
+          <w:tcPr/>
+          <w:p>
+            <w:pPr>
+              <w:pStyle w:val="Compact"/>
+            </w:pPr>
+            <w:r>
+              <w:t xml:space="preserve">my JIT grants with live status/expiry</w:t>
             </w:r>
           </w:p>
         </w:tc>
@@ -5950,29 +6649,29 @@
               <w:pStyle w:val="Compact"/>
             </w:pPr>
             <w:r>
-              <w:t xml:space="preserve">/audit, /audit/verify</w:t>
-            </w:r>
-          </w:p>
-        </w:tc>
-        <w:tc>
-          <w:tcPr/>
-          <w:p>
-            <w:pPr>
-              <w:pStyle w:val="Compact"/>
-            </w:pPr>
-            <w:r>
-              <w:t xml:space="preserve">analyst</w:t>
-            </w:r>
-          </w:p>
-        </w:tc>
-        <w:tc>
-          <w:tcPr/>
-          <w:p>
-            <w:pPr>
-              <w:pStyle w:val="Compact"/>
-            </w:pPr>
-            <w:r>
-              <w:t xml:space="preserve">list / verify the signed chain</w:t>
+              <w:t xml:space="preserve">/vault/credentials</w:t>
+            </w:r>
+          </w:p>
+        </w:tc>
+        <w:tc>
+          <w:tcPr/>
+          <w:p>
+            <w:pPr>
+              <w:pStyle w:val="Compact"/>
+            </w:pPr>
+            <w:r>
+              <w:t xml:space="preserve">employee</w:t>
+            </w:r>
+          </w:p>
+        </w:tc>
+        <w:tc>
+          <w:tcPr/>
+          <w:p>
+            <w:pPr>
+              <w:pStyle w:val="Compact"/>
+            </w:pPr>
+            <w:r>
+              <w:t xml:space="preserve">the credential desk + my checkout history</w:t>
             </w:r>
           </w:p>
         </w:tc>
@@ -5985,40 +6684,40 @@
               <w:pStyle w:val="Compact"/>
             </w:pPr>
             <w:r>
-              <w:t xml:space="preserve">GET</w:t>
-            </w:r>
-          </w:p>
-        </w:tc>
-        <w:tc>
-          <w:tcPr/>
-          <w:p>
-            <w:pPr>
-              <w:pStyle w:val="Compact"/>
-            </w:pPr>
-            <w:r>
-              <w:t xml:space="preserve">/pqc/info</w:t>
-            </w:r>
-          </w:p>
-        </w:tc>
-        <w:tc>
-          <w:tcPr/>
-          <w:p>
-            <w:pPr>
-              <w:pStyle w:val="Compact"/>
-            </w:pPr>
-            <w:r>
-              <w:t xml:space="preserve">any</w:t>
-            </w:r>
-          </w:p>
-        </w:tc>
-        <w:tc>
-          <w:tcPr/>
-          <w:p>
-            <w:pPr>
-              <w:pStyle w:val="Compact"/>
-            </w:pPr>
-            <w:r>
-              <w:t xml:space="preserve">active PQC provider and algorithms</w:t>
+              <w:t xml:space="preserve">POST</w:t>
+            </w:r>
+          </w:p>
+        </w:tc>
+        <w:tc>
+          <w:tcPr/>
+          <w:p>
+            <w:pPr>
+              <w:pStyle w:val="Compact"/>
+            </w:pPr>
+            <w:r>
+              <w:t xml:space="preserve">/vault/checkout</w:t>
+            </w:r>
+          </w:p>
+        </w:tc>
+        <w:tc>
+          <w:tcPr/>
+          <w:p>
+            <w:pPr>
+              <w:pStyle w:val="Compact"/>
+            </w:pPr>
+            <w:r>
+              <w:t xml:space="preserve">employee</w:t>
+            </w:r>
+          </w:p>
+        </w:tc>
+        <w:tc>
+          <w:tcPr/>
+          <w:p>
+            <w:pPr>
+              <w:pStyle w:val="Compact"/>
+            </w:pPr>
+            <w:r>
+              <w:t xml:space="preserve">risk-gated, time-boxed secret checkout</w:t>
             </w:r>
           </w:p>
         </w:tc>
@@ -6031,40 +6730,40 @@
               <w:pStyle w:val="Compact"/>
             </w:pPr>
             <w:r>
-              <w:t xml:space="preserve">POST, GET</w:t>
-            </w:r>
-          </w:p>
-        </w:tc>
-        <w:tc>
-          <w:tcPr/>
-          <w:p>
-            <w:pPr>
-              <w:pStyle w:val="Compact"/>
-            </w:pPr>
-            <w:r>
-              <w:t xml:space="preserve">/vault/secrets</w:t>
-            </w:r>
-          </w:p>
-        </w:tc>
-        <w:tc>
-          <w:tcPr/>
-          <w:p>
-            <w:pPr>
-              <w:pStyle w:val="Compact"/>
-            </w:pPr>
-            <w:r>
-              <w:t xml:space="preserve">analyst</w:t>
-            </w:r>
-          </w:p>
-        </w:tc>
-        <w:tc>
-          <w:tcPr/>
-          <w:p>
-            <w:pPr>
-              <w:pStyle w:val="Compact"/>
-            </w:pPr>
-            <w:r>
-              <w:t xml:space="preserve">store / retrieve a PQC-wrapped secret</w:t>
+              <w:t xml:space="preserve">GET</w:t>
+            </w:r>
+          </w:p>
+        </w:tc>
+        <w:tc>
+          <w:tcPr/>
+          <w:p>
+            <w:pPr>
+              <w:pStyle w:val="Compact"/>
+            </w:pPr>
+            <w:r>
+              <w:t xml:space="preserve">/bank/accounts, /transactions</w:t>
+            </w:r>
+          </w:p>
+        </w:tc>
+        <w:tc>
+          <w:tcPr/>
+          <w:p>
+            <w:pPr>
+              <w:pStyle w:val="Compact"/>
+            </w:pPr>
+            <w:r>
+              <w:t xml:space="preserve">employee</w:t>
+            </w:r>
+          </w:p>
+        </w:tc>
+        <w:tc>
+          <w:tcPr/>
+          <w:p>
+            <w:pPr>
+              <w:pStyle w:val="Compact"/>
+            </w:pPr>
+            <w:r>
+              <w:t xml:space="preserve">account list / ledger</w:t>
             </w:r>
           </w:p>
         </w:tc>
@@ -6077,40 +6776,40 @@
               <w:pStyle w:val="Compact"/>
             </w:pPr>
             <w:r>
-              <w:t xml:space="preserve">WS</w:t>
-            </w:r>
-          </w:p>
-        </w:tc>
-        <w:tc>
-          <w:tcPr/>
-          <w:p>
-            <w:pPr>
-              <w:pStyle w:val="Compact"/>
-            </w:pPr>
-            <w:r>
-              <w:t xml:space="preserve">/ws/feed</w:t>
-            </w:r>
-          </w:p>
-        </w:tc>
-        <w:tc>
-          <w:tcPr/>
-          <w:p>
-            <w:pPr>
-              <w:pStyle w:val="Compact"/>
-            </w:pPr>
-            <w:r>
-              <w:t xml:space="preserve">–</w:t>
-            </w:r>
-          </w:p>
-        </w:tc>
-        <w:tc>
-          <w:tcPr/>
-          <w:p>
-            <w:pPr>
-              <w:pStyle w:val="Compact"/>
-            </w:pPr>
-            <w:r>
-              <w:t xml:space="preserve">live activity / alert / tamper frames</w:t>
+              <w:t xml:space="preserve">GET</w:t>
+            </w:r>
+          </w:p>
+        </w:tc>
+        <w:tc>
+          <w:tcPr/>
+          <w:p>
+            <w:pPr>
+              <w:pStyle w:val="Compact"/>
+            </w:pPr>
+            <w:r>
+              <w:t xml:space="preserve">/bank/pending, /beneficiaries</w:t>
+            </w:r>
+          </w:p>
+        </w:tc>
+        <w:tc>
+          <w:tcPr/>
+          <w:p>
+            <w:pPr>
+              <w:pStyle w:val="Compact"/>
+            </w:pPr>
+            <w:r>
+              <w:t xml:space="preserve">employee</w:t>
+            </w:r>
+          </w:p>
+        </w:tc>
+        <w:tc>
+          <w:tcPr/>
+          <w:p>
+            <w:pPr>
+              <w:pStyle w:val="Compact"/>
+            </w:pPr>
+            <w:r>
+              <w:t xml:space="preserve">held queue / payees</w:t>
             </w:r>
           </w:p>
         </w:tc>
@@ -6123,6 +6822,420 @@
               <w:pStyle w:val="Compact"/>
             </w:pPr>
             <w:r>
+              <w:t xml:space="preserve">POST</w:t>
+            </w:r>
+          </w:p>
+        </w:tc>
+        <w:tc>
+          <w:tcPr/>
+          <w:p>
+            <w:pPr>
+              <w:pStyle w:val="Compact"/>
+            </w:pPr>
+            <w:r>
+              <w:t xml:space="preserve">/bank/transfer</w:t>
+            </w:r>
+          </w:p>
+        </w:tc>
+        <w:tc>
+          <w:tcPr/>
+          <w:p>
+            <w:pPr>
+              <w:pStyle w:val="Compact"/>
+            </w:pPr>
+            <w:r>
+              <w:t xml:space="preserve">employee</w:t>
+            </w:r>
+          </w:p>
+        </w:tc>
+        <w:tc>
+          <w:tcPr/>
+          <w:p>
+            <w:pPr>
+              <w:pStyle w:val="Compact"/>
+            </w:pPr>
+            <w:r>
+              <w:t xml:space="preserve">submit a transfer -&gt; fraud + risk gated</w:t>
+            </w:r>
+          </w:p>
+        </w:tc>
+      </w:tr>
+      <w:tr>
+        <w:tc>
+          <w:tcPr/>
+          <w:p>
+            <w:pPr>
+              <w:pStyle w:val="Compact"/>
+            </w:pPr>
+            <w:r>
+              <w:t xml:space="preserve">POST</w:t>
+            </w:r>
+          </w:p>
+        </w:tc>
+        <w:tc>
+          <w:tcPr/>
+          <w:p>
+            <w:pPr>
+              <w:pStyle w:val="Compact"/>
+            </w:pPr>
+            <w:r>
+              <w:t xml:space="preserve">/bank/transactions/{id}/approve</w:t>
+            </w:r>
+          </w:p>
+        </w:tc>
+        <w:tc>
+          <w:tcPr/>
+          <w:p>
+            <w:pPr>
+              <w:pStyle w:val="Compact"/>
+            </w:pPr>
+            <w:r>
+              <w:t xml:space="preserve">employee</w:t>
+            </w:r>
+          </w:p>
+        </w:tc>
+        <w:tc>
+          <w:tcPr/>
+          <w:p>
+            <w:pPr>
+              <w:pStyle w:val="Compact"/>
+            </w:pPr>
+            <w:r>
+              <w:t xml:space="preserve">settle a held transfer (second officer)</w:t>
+            </w:r>
+          </w:p>
+        </w:tc>
+      </w:tr>
+      <w:tr>
+        <w:tc>
+          <w:tcPr/>
+          <w:p>
+            <w:pPr>
+              <w:pStyle w:val="Compact"/>
+            </w:pPr>
+            <w:r>
+              <w:t xml:space="preserve">POST</w:t>
+            </w:r>
+          </w:p>
+        </w:tc>
+        <w:tc>
+          <w:tcPr/>
+          <w:p>
+            <w:pPr>
+              <w:pStyle w:val="Compact"/>
+            </w:pPr>
+            <w:r>
+              <w:t xml:space="preserve">/bank/transactions/{id}/reject</w:t>
+            </w:r>
+          </w:p>
+        </w:tc>
+        <w:tc>
+          <w:tcPr/>
+          <w:p>
+            <w:pPr>
+              <w:pStyle w:val="Compact"/>
+            </w:pPr>
+            <w:r>
+              <w:t xml:space="preserve">employee</w:t>
+            </w:r>
+          </w:p>
+        </w:tc>
+        <w:tc>
+          <w:tcPr/>
+          <w:p>
+            <w:pPr>
+              <w:pStyle w:val="Compact"/>
+            </w:pPr>
+            <w:r>
+              <w:t xml:space="preserve">reverse a held transfer</w:t>
+            </w:r>
+          </w:p>
+        </w:tc>
+      </w:tr>
+      <w:tr>
+        <w:tc>
+          <w:tcPr/>
+          <w:p>
+            <w:pPr>
+              <w:pStyle w:val="Compact"/>
+            </w:pPr>
+            <w:r>
+              <w:t xml:space="preserve">POST</w:t>
+            </w:r>
+          </w:p>
+        </w:tc>
+        <w:tc>
+          <w:tcPr/>
+          <w:p>
+            <w:pPr>
+              <w:pStyle w:val="Compact"/>
+            </w:pPr>
+            <w:r>
+              <w:t xml:space="preserve">/demo/scenario/{kind}</w:t>
+            </w:r>
+          </w:p>
+        </w:tc>
+        <w:tc>
+          <w:tcPr/>
+          <w:p>
+            <w:pPr>
+              <w:pStyle w:val="Compact"/>
+            </w:pPr>
+            <w:r>
+              <w:t xml:space="preserve">analyst</w:t>
+            </w:r>
+          </w:p>
+        </w:tc>
+        <w:tc>
+          <w:tcPr/>
+          <w:p>
+            <w:pPr>
+              <w:pStyle w:val="Compact"/>
+            </w:pPr>
+            <w:r>
+              <w:t xml:space="preserve">run scripted malicious / compromised / negligent</w:t>
+            </w:r>
+          </w:p>
+        </w:tc>
+      </w:tr>
+      <w:tr>
+        <w:tc>
+          <w:tcPr/>
+          <w:p>
+            <w:pPr>
+              <w:pStyle w:val="Compact"/>
+            </w:pPr>
+            <w:r>
+              <w:t xml:space="preserve">POST</w:t>
+            </w:r>
+          </w:p>
+        </w:tc>
+        <w:tc>
+          <w:tcPr/>
+          <w:p>
+            <w:pPr>
+              <w:pStyle w:val="Compact"/>
+            </w:pPr>
+            <w:r>
+              <w:t xml:space="preserve">/demo/tamper</w:t>
+            </w:r>
+          </w:p>
+        </w:tc>
+        <w:tc>
+          <w:tcPr/>
+          <w:p>
+            <w:pPr>
+              <w:pStyle w:val="Compact"/>
+            </w:pPr>
+            <w:r>
+              <w:t xml:space="preserve">analyst</w:t>
+            </w:r>
+          </w:p>
+        </w:tc>
+        <w:tc>
+          <w:tcPr/>
+          <w:p>
+            <w:pPr>
+              <w:pStyle w:val="Compact"/>
+            </w:pPr>
+            <w:r>
+              <w:t xml:space="preserve">edit an audit entry (proves detection)</w:t>
+            </w:r>
+          </w:p>
+        </w:tc>
+      </w:tr>
+      <w:tr>
+        <w:tc>
+          <w:tcPr/>
+          <w:p>
+            <w:pPr>
+              <w:pStyle w:val="Compact"/>
+            </w:pPr>
+            <w:r>
+              <w:t xml:space="preserve">GET</w:t>
+            </w:r>
+          </w:p>
+        </w:tc>
+        <w:tc>
+          <w:tcPr/>
+          <w:p>
+            <w:pPr>
+              <w:pStyle w:val="Compact"/>
+            </w:pPr>
+            <w:r>
+              <w:t xml:space="preserve">/audit, /audit/verify</w:t>
+            </w:r>
+          </w:p>
+        </w:tc>
+        <w:tc>
+          <w:tcPr/>
+          <w:p>
+            <w:pPr>
+              <w:pStyle w:val="Compact"/>
+            </w:pPr>
+            <w:r>
+              <w:t xml:space="preserve">analyst</w:t>
+            </w:r>
+          </w:p>
+        </w:tc>
+        <w:tc>
+          <w:tcPr/>
+          <w:p>
+            <w:pPr>
+              <w:pStyle w:val="Compact"/>
+            </w:pPr>
+            <w:r>
+              <w:t xml:space="preserve">list / verify the signed chain</w:t>
+            </w:r>
+          </w:p>
+        </w:tc>
+      </w:tr>
+      <w:tr>
+        <w:tc>
+          <w:tcPr/>
+          <w:p>
+            <w:pPr>
+              <w:pStyle w:val="Compact"/>
+            </w:pPr>
+            <w:r>
+              <w:t xml:space="preserve">GET</w:t>
+            </w:r>
+          </w:p>
+        </w:tc>
+        <w:tc>
+          <w:tcPr/>
+          <w:p>
+            <w:pPr>
+              <w:pStyle w:val="Compact"/>
+            </w:pPr>
+            <w:r>
+              <w:t xml:space="preserve">/pqc/info</w:t>
+            </w:r>
+          </w:p>
+        </w:tc>
+        <w:tc>
+          <w:tcPr/>
+          <w:p>
+            <w:pPr>
+              <w:pStyle w:val="Compact"/>
+            </w:pPr>
+            <w:r>
+              <w:t xml:space="preserve">any</w:t>
+            </w:r>
+          </w:p>
+        </w:tc>
+        <w:tc>
+          <w:tcPr/>
+          <w:p>
+            <w:pPr>
+              <w:pStyle w:val="Compact"/>
+            </w:pPr>
+            <w:r>
+              <w:t xml:space="preserve">active PQC provider and algorithms</w:t>
+            </w:r>
+          </w:p>
+        </w:tc>
+      </w:tr>
+      <w:tr>
+        <w:tc>
+          <w:tcPr/>
+          <w:p>
+            <w:pPr>
+              <w:pStyle w:val="Compact"/>
+            </w:pPr>
+            <w:r>
+              <w:t xml:space="preserve">POST, GET</w:t>
+            </w:r>
+          </w:p>
+        </w:tc>
+        <w:tc>
+          <w:tcPr/>
+          <w:p>
+            <w:pPr>
+              <w:pStyle w:val="Compact"/>
+            </w:pPr>
+            <w:r>
+              <w:t xml:space="preserve">/vault/secrets</w:t>
+            </w:r>
+          </w:p>
+        </w:tc>
+        <w:tc>
+          <w:tcPr/>
+          <w:p>
+            <w:pPr>
+              <w:pStyle w:val="Compact"/>
+            </w:pPr>
+            <w:r>
+              <w:t xml:space="preserve">analyst</w:t>
+            </w:r>
+          </w:p>
+        </w:tc>
+        <w:tc>
+          <w:tcPr/>
+          <w:p>
+            <w:pPr>
+              <w:pStyle w:val="Compact"/>
+            </w:pPr>
+            <w:r>
+              <w:t xml:space="preserve">store / retrieve a PQC-wrapped secret</w:t>
+            </w:r>
+          </w:p>
+        </w:tc>
+      </w:tr>
+      <w:tr>
+        <w:tc>
+          <w:tcPr/>
+          <w:p>
+            <w:pPr>
+              <w:pStyle w:val="Compact"/>
+            </w:pPr>
+            <w:r>
+              <w:t xml:space="preserve">WS</w:t>
+            </w:r>
+          </w:p>
+        </w:tc>
+        <w:tc>
+          <w:tcPr/>
+          <w:p>
+            <w:pPr>
+              <w:pStyle w:val="Compact"/>
+            </w:pPr>
+            <w:r>
+              <w:t xml:space="preserve">/ws/feed</w:t>
+            </w:r>
+          </w:p>
+        </w:tc>
+        <w:tc>
+          <w:tcPr/>
+          <w:p>
+            <w:pPr>
+              <w:pStyle w:val="Compact"/>
+            </w:pPr>
+            <w:r>
+              <w:t xml:space="preserve">–</w:t>
+            </w:r>
+          </w:p>
+        </w:tc>
+        <w:tc>
+          <w:tcPr/>
+          <w:p>
+            <w:pPr>
+              <w:pStyle w:val="Compact"/>
+            </w:pPr>
+            <w:r>
+              <w:t xml:space="preserve">live activity / alert / tamper frames</w:t>
+            </w:r>
+          </w:p>
+        </w:tc>
+      </w:tr>
+      <w:tr>
+        <w:tc>
+          <w:tcPr/>
+          <w:p>
+            <w:pPr>
+              <w:pStyle w:val="Compact"/>
+            </w:pPr>
+            <w:r>
               <w:t xml:space="preserve">GET</w:t>
             </w:r>
           </w:p>
@@ -6185,8 +7298,8 @@
         <w:t xml:space="preserve">(FastAPI / OpenAPI).</w:t>
       </w:r>
     </w:p>
-    <w:bookmarkEnd w:id="53"/>
-    <w:bookmarkStart w:id="54" w:name="frontend"/>
+    <w:bookmarkEnd w:id="58"/>
+    <w:bookmarkStart w:id="59" w:name="frontend"/>
     <w:p>
       <w:pPr>
         <w:pStyle w:val="Heading1"/>
@@ -6367,8 +7480,8 @@
         <w:t xml:space="preserve">The colour system reserves status colours (good / warning / serious / critical), colour-codes insider types (malicious red, compromised blue, negligent amber), uses tabular numerics, flashes on new alerts, and never encodes meaning by colour alone.</w:t>
       </w:r>
     </w:p>
-    <w:bookmarkEnd w:id="54"/>
-    <w:bookmarkStart w:id="55" w:name="security-considerations"/>
+    <w:bookmarkEnd w:id="59"/>
+    <w:bookmarkStart w:id="60" w:name="security-considerations"/>
     <w:p>
       <w:pPr>
         <w:pStyle w:val="Heading1"/>
@@ -6543,8 +7656,8 @@
         <w:t xml:space="preserve">— every decision has a plain-English reason, an immutable trail, and access reviews for standing, dormant and expired grants.</w:t>
       </w:r>
     </w:p>
-    <w:bookmarkEnd w:id="55"/>
-    <w:bookmarkStart w:id="56" w:name="scalability"/>
+    <w:bookmarkEnd w:id="60"/>
+    <w:bookmarkStart w:id="61" w:name="scalability"/>
     <w:p>
       <w:pPr>
         <w:pStyle w:val="Heading1"/>
@@ -6700,8 +7813,8 @@
         <w:t xml:space="preserve">— ML-KEM encapsulation and ML-DSA signing are sub-millisecond, negligible next to a database write.</w:t>
       </w:r>
     </w:p>
-    <w:bookmarkEnd w:id="56"/>
-    <w:bookmarkStart w:id="57" w:name="deployment-and-running"/>
+    <w:bookmarkEnd w:id="61"/>
+    <w:bookmarkStart w:id="62" w:name="deployment-and-running"/>
     <w:p>
       <w:pPr>
         <w:pStyle w:val="Heading1"/>
@@ -6969,8 +8082,8 @@
         <w:t xml:space="preserve">.</w:t>
       </w:r>
     </w:p>
-    <w:bookmarkEnd w:id="57"/>
-    <w:bookmarkStart w:id="58" w:name="testing"/>
+    <w:bookmarkEnd w:id="62"/>
+    <w:bookmarkStart w:id="63" w:name="testing"/>
     <w:p>
       <w:pPr>
         <w:pStyle w:val="Heading1"/>
@@ -6994,7 +8107,7 @@
           <w:b/>
           <w:bCs/>
         </w:rPr>
-        <w:t xml:space="preserve">40 pytest tests</w:t>
+        <w:t xml:space="preserve">54 pytest tests</w:t>
       </w:r>
       <w:r>
         <w:t xml:space="preserve">, including:</w:t>
@@ -7154,8 +8267,30 @@
         <w:t xml:space="preserve">— transfers move money, high-value holds, watchlist / huge-amount / high-risk-session transfers flag, held transfers settle on approval, and insufficient-funds / frozen-account transfers are refused.</w:t>
       </w:r>
     </w:p>
-    <w:bookmarkEnd w:id="58"/>
-    <w:bookmarkStart w:id="59" w:name="demo-walkthrough"/>
+    <w:p>
+      <w:pPr>
+        <w:pStyle w:val="Compact"/>
+        <w:numPr>
+          <w:ilvl w:val="0"/>
+          <w:numId w:val="1013"/>
+        </w:numPr>
+      </w:pPr>
+      <w:r>
+        <w:rPr>
+          <w:b/>
+          <w:bCs/>
+        </w:rPr>
+        <w:t xml:space="preserve">test_pam_plus</w:t>
+      </w:r>
+      <w:r>
+        <w:t xml:space="preserve"> </w:t>
+      </w:r>
+      <w:r>
+        <w:t xml:space="preserve">— risk-based login (challenge / wrong-code alert / verified token), credential checkout (lease, high-risk refusal recorded as evidence, expiry, SOC oversight), the full JIT lifecycle (request -&gt; approve -&gt; sanctioned escalation -&gt; auto-expiry -&gt; re-armed rule), the measured-performance benchmark, and the signed incident report (signature verifies; tampered report fails).</w:t>
+      </w:r>
+    </w:p>
+    <w:bookmarkEnd w:id="63"/>
+    <w:bookmarkStart w:id="64" w:name="demo-walkthrough"/>
     <w:p>
       <w:pPr>
         <w:pStyle w:val="Heading1"/>
@@ -7212,7 +8347,7 @@
         <w:t xml:space="preserve">soc_admin</w:t>
       </w:r>
       <w:r>
-        <w:t xml:space="preserve">) — quiet, with a green heatmap.</w:t>
+        <w:t xml:space="preserve">) — quiet, with a green heatmap and the impact-metrics strip.</w:t>
       </w:r>
     </w:p>
     <w:p>
@@ -7228,22 +8363,28 @@
           <w:b/>
           <w:bCs/>
         </w:rPr>
-        <w:t xml:space="preserve">Employee Portal</w:t>
-      </w:r>
-      <w:r>
-        <w:t xml:space="preserve"> </w:t>
-      </w:r>
-      <w:r>
-        <w:t xml:space="preserve">(</w:t>
+        <w:t xml:space="preserve">Risk-based login</w:t>
+      </w:r>
+      <w:r>
+        <w:t xml:space="preserve"> </w:t>
+      </w:r>
+      <w:r>
+        <w:t xml:space="preserve">— signing in as</w:t>
+      </w:r>
+      <w:r>
+        <w:t xml:space="preserve"> </w:t>
       </w:r>
       <w:r>
         <w:rPr>
           <w:rStyle w:val="VerbatimChar"/>
         </w:rPr>
-        <w:t xml:space="preserve">rmehta</w:t>
-      </w:r>
-      <w:r>
-        <w:t xml:space="preserve">) — a normal query is ALLOWED; an export of 1000 records triggers STEP-UP MFA (code</w:t>
+        <w:t xml:space="preserve">ext_dsouza</w:t>
+      </w:r>
+      <w:r>
+        <w:t xml:space="preserve"> </w:t>
+      </w:r>
+      <w:r>
+        <w:t xml:space="preserve">triggers the step-up challenge at the door (dormant, expired, unrecognized context); code</w:t>
       </w:r>
       <w:r>
         <w:t xml:space="preserve"> </w:t>
@@ -7255,52 +8396,22 @@
         <w:t xml:space="preserve">246810</w:t>
       </w:r>
       <w:r>
-        <w:t xml:space="preserve">). On the</w:t>
-      </w:r>
-      <w:r>
-        <w:t xml:space="preserve"> </w:t>
-      </w:r>
-      <w:r>
-        <w:rPr>
-          <w:b/>
-          <w:bCs/>
-        </w:rPr>
-        <w:t xml:space="preserve">banking desk</w:t>
-      </w:r>
-      <w:r>
-        <w:t xml:space="preserve">, a small transfer clears instantly, a high-value one is</w:t>
-      </w:r>
-      <w:r>
-        <w:t xml:space="preserve"> </w:t>
-      </w:r>
-      <w:r>
-        <w:rPr>
-          <w:b/>
-          <w:bCs/>
-        </w:rPr>
-        <w:t xml:space="preserve">HELD</w:t>
-      </w:r>
-      <w:r>
-        <w:t xml:space="preserve"> </w:t>
-      </w:r>
-      <w:r>
-        <w:t xml:space="preserve">for maker-checker, and a transfer to a watchlisted payee is</w:t>
-      </w:r>
-      <w:r>
-        <w:t xml:space="preserve"> </w:t>
-      </w:r>
-      <w:r>
-        <w:rPr>
-          <w:b/>
-          <w:bCs/>
-        </w:rPr>
-        <w:t xml:space="preserve">FLAGGED</w:t>
-      </w:r>
-      <w:r>
-        <w:t xml:space="preserve"> </w:t>
-      </w:r>
-      <w:r>
-        <w:t xml:space="preserve">and flashes a banner — surfacing as a CRITICAL alert in the SOC.</w:t>
+        <w:t xml:space="preserve"> </w:t>
+      </w:r>
+      <w:r>
+        <w:t xml:space="preserve">gets the</w:t>
+      </w:r>
+      <w:r>
+        <w:t xml:space="preserve"> </w:t>
+      </w:r>
+      <w:r>
+        <w:t xml:space="preserve">“attacker”</w:t>
+      </w:r>
+      <w:r>
+        <w:t xml:space="preserve"> </w:t>
+      </w:r>
+      <w:r>
+        <w:t xml:space="preserve">in.</w:t>
       </w:r>
     </w:p>
     <w:p>
@@ -7316,7 +8427,7 @@
           <w:b/>
           <w:bCs/>
         </w:rPr>
-        <w:t xml:space="preserve">Attacker</w:t>
+        <w:t xml:space="preserve">Employee Portal</w:t>
       </w:r>
       <w:r>
         <w:t xml:space="preserve"> </w:t>
@@ -7328,10 +8439,55 @@
         <w:rPr>
           <w:rStyle w:val="VerbatimChar"/>
         </w:rPr>
-        <w:t xml:space="preserve">ext_dsouza</w:t>
-      </w:r>
-      <w:r>
-        <w:t xml:space="preserve">) — escalate then export 5000 records -&gt; full-screen BLOCK; the account is locked.</w:t>
+        <w:t xml:space="preserve">rmehta</w:t>
+      </w:r>
+      <w:r>
+        <w:t xml:space="preserve">) — a normal query is ALLOWED; an export of 1200 records triggers STEP-UP MFA. On the</w:t>
+      </w:r>
+      <w:r>
+        <w:t xml:space="preserve"> </w:t>
+      </w:r>
+      <w:r>
+        <w:rPr>
+          <w:b/>
+          <w:bCs/>
+        </w:rPr>
+        <w:t xml:space="preserve">banking desk</w:t>
+      </w:r>
+      <w:r>
+        <w:t xml:space="preserve">, a small transfer clears instantly, a high-value one is</w:t>
+      </w:r>
+      <w:r>
+        <w:t xml:space="preserve"> </w:t>
+      </w:r>
+      <w:r>
+        <w:rPr>
+          <w:b/>
+          <w:bCs/>
+        </w:rPr>
+        <w:t xml:space="preserve">HELD</w:t>
+      </w:r>
+      <w:r>
+        <w:t xml:space="preserve"> </w:t>
+      </w:r>
+      <w:r>
+        <w:t xml:space="preserve">for maker-checker, and a transfer to a watchlisted payee is</w:t>
+      </w:r>
+      <w:r>
+        <w:t xml:space="preserve"> </w:t>
+      </w:r>
+      <w:r>
+        <w:rPr>
+          <w:b/>
+          <w:bCs/>
+        </w:rPr>
+        <w:t xml:space="preserve">FLAGGED</w:t>
+      </w:r>
+      <w:r>
+        <w:t xml:space="preserve"> </w:t>
+      </w:r>
+      <w:r>
+        <w:t xml:space="preserve">and flashes a banner — surfacing as a CRITICAL alert in the SOC.</w:t>
       </w:r>
     </w:p>
     <w:p>
@@ -7347,25 +8503,13 @@
           <w:b/>
           <w:bCs/>
         </w:rPr>
-        <w:t xml:space="preserve">SOC lights up</w:t>
-      </w:r>
-      <w:r>
-        <w:t xml:space="preserve"> </w:t>
-      </w:r>
-      <w:r>
-        <w:t xml:space="preserve">— a red live session at 100, a flashed CRITICAL alert tagged</w:t>
-      </w:r>
-      <w:r>
-        <w:t xml:space="preserve"> </w:t>
-      </w:r>
-      <w:r>
-        <w:rPr>
-          <w:rStyle w:val="VerbatimChar"/>
-        </w:rPr>
-        <w:t xml:space="preserve">malicious</w:t>
-      </w:r>
-      <w:r>
-        <w:t xml:space="preserve">, the why-flagged panel, the session replay (export struck through as DENIED), and a red heatmap cell.</w:t>
+        <w:t xml:space="preserve">JIT + vault</w:t>
+      </w:r>
+      <w:r>
+        <w:t xml:space="preserve"> </w:t>
+      </w:r>
+      <w:r>
+        <w:t xml:space="preserve">— an unsanctioned escalation alarms; after an analyst approves a JIT grant it is sanctioned; a credential checkout unseals a secret for a 5-minute lease.</w:t>
       </w:r>
     </w:p>
     <w:p>
@@ -7381,13 +8525,22 @@
           <w:b/>
           <w:bCs/>
         </w:rPr>
-        <w:t xml:space="preserve">Two more insider types</w:t>
-      </w:r>
-      <w:r>
-        <w:t xml:space="preserve"> </w:t>
-      </w:r>
-      <w:r>
-        <w:t xml:space="preserve">— the SOC buttons run Compromised -&gt; MFA and Negligent -&gt; maker-checker, each correctly typed.</w:t>
+        <w:t xml:space="preserve">Attacker</w:t>
+      </w:r>
+      <w:r>
+        <w:t xml:space="preserve"> </w:t>
+      </w:r>
+      <w:r>
+        <w:t xml:space="preserve">(</w:t>
+      </w:r>
+      <w:r>
+        <w:rPr>
+          <w:rStyle w:val="VerbatimChar"/>
+        </w:rPr>
+        <w:t xml:space="preserve">ext_dsouza</w:t>
+      </w:r>
+      <w:r>
+        <w:t xml:space="preserve">) — escalate then export 5000 records -&gt; full-screen BLOCK; the account is locked; the vault refuses him.</w:t>
       </w:r>
     </w:p>
     <w:p>
@@ -7403,13 +8556,25 @@
           <w:b/>
           <w:bCs/>
         </w:rPr>
-        <w:t xml:space="preserve">PAM access review</w:t>
-      </w:r>
-      <w:r>
-        <w:t xml:space="preserve"> </w:t>
-      </w:r>
-      <w:r>
-        <w:t xml:space="preserve">— dormant, vendor and expired flags.</w:t>
+        <w:t xml:space="preserve">SOC lights up</w:t>
+      </w:r>
+      <w:r>
+        <w:t xml:space="preserve"> </w:t>
+      </w:r>
+      <w:r>
+        <w:t xml:space="preserve">— a red live session at 100, a flashed CRITICAL alert tagged</w:t>
+      </w:r>
+      <w:r>
+        <w:t xml:space="preserve"> </w:t>
+      </w:r>
+      <w:r>
+        <w:rPr>
+          <w:rStyle w:val="VerbatimChar"/>
+        </w:rPr>
+        <w:t xml:space="preserve">malicious</w:t>
+      </w:r>
+      <w:r>
+        <w:t xml:space="preserve">, the why-flagged panel, the session replay (export struck through as DENIED), and a red heatmap cell.</w:t>
       </w:r>
     </w:p>
     <w:p>
@@ -7425,17 +8590,77 @@
           <w:b/>
           <w:bCs/>
         </w:rPr>
+        <w:t xml:space="preserve">Two more insider types</w:t>
+      </w:r>
+      <w:r>
+        <w:t xml:space="preserve"> </w:t>
+      </w:r>
+      <w:r>
+        <w:t xml:space="preserve">— the SOC buttons run Compromised -&gt; MFA and Negligent -&gt; maker-checker, each correctly typed.</w:t>
+      </w:r>
+    </w:p>
+    <w:p>
+      <w:pPr>
+        <w:pStyle w:val="Compact"/>
+        <w:numPr>
+          <w:ilvl w:val="0"/>
+          <w:numId w:val="1014"/>
+        </w:numPr>
+      </w:pPr>
+      <w:r>
+        <w:rPr>
+          <w:b/>
+          <w:bCs/>
+        </w:rPr>
+        <w:t xml:space="preserve">Explainable + measured AI</w:t>
+      </w:r>
+      <w:r>
+        <w:t xml:space="preserve"> </w:t>
+      </w:r>
+      <w:r>
+        <w:t xml:space="preserve">— the Model Insights panel (feature attribution, trajectory) and the held-out benchmark numbers.</w:t>
+      </w:r>
+    </w:p>
+    <w:p>
+      <w:pPr>
+        <w:pStyle w:val="Compact"/>
+        <w:numPr>
+          <w:ilvl w:val="0"/>
+          <w:numId w:val="1014"/>
+        </w:numPr>
+      </w:pPr>
+      <w:r>
+        <w:rPr>
+          <w:b/>
+          <w:bCs/>
+        </w:rPr>
         <w:t xml:space="preserve">Quantum-safe evidence</w:t>
       </w:r>
       <w:r>
         <w:t xml:space="preserve"> </w:t>
       </w:r>
       <w:r>
-        <w:t xml:space="preserve">— Verify Chain (green) then Tamper (red, FAILED at the exact entry).</w:t>
-      </w:r>
-    </w:p>
-    <w:bookmarkEnd w:id="59"/>
-    <w:bookmarkStart w:id="60" w:name="roadmap"/>
+        <w:t xml:space="preserve">— Verify Chain (green), Tamper (red, FAILED at the exact entry), then export the</w:t>
+      </w:r>
+      <w:r>
+        <w:t xml:space="preserve"> </w:t>
+      </w:r>
+      <w:r>
+        <w:rPr>
+          <w:b/>
+          <w:bCs/>
+        </w:rPr>
+        <w:t xml:space="preserve">signed evidence pack</w:t>
+      </w:r>
+      <w:r>
+        <w:t xml:space="preserve"> </w:t>
+      </w:r>
+      <w:r>
+        <w:t xml:space="preserve">for the blocked session.</w:t>
+      </w:r>
+    </w:p>
+    <w:bookmarkEnd w:id="64"/>
+    <w:bookmarkStart w:id="65" w:name="roadmap"/>
     <w:p>
       <w:pPr>
         <w:pStyle w:val="Heading1"/>
@@ -7463,7 +8688,7 @@
         <w:t xml:space="preserve"> </w:t>
       </w:r>
       <w:r>
-        <w:t xml:space="preserve">— link a privileged record-change to a suspicious downstream transaction.</w:t>
+        <w:t xml:space="preserve">— link a privileged record-change to a suspicious downstream transaction (the session-risk gate on transfers is the first step, already live).</w:t>
       </w:r>
     </w:p>
     <w:p>
@@ -7479,13 +8704,13 @@
           <w:b/>
           <w:bCs/>
         </w:rPr>
-        <w:t xml:space="preserve">Just-in-time access</w:t>
-      </w:r>
-      <w:r>
-        <w:t xml:space="preserve"> </w:t>
-      </w:r>
-      <w:r>
-        <w:t xml:space="preserve">and automated entitlement reviews.</w:t>
+        <w:t xml:space="preserve">Automated entitlement reviews</w:t>
+      </w:r>
+      <w:r>
+        <w:t xml:space="preserve"> </w:t>
+      </w:r>
+      <w:r>
+        <w:t xml:space="preserve">and credential auto-rotation on lease return.</w:t>
       </w:r>
     </w:p>
     <w:p>
@@ -7554,8 +8779,8 @@
         <w:t xml:space="preserve">beyond privileged accounts.</w:t>
       </w:r>
     </w:p>
-    <w:bookmarkEnd w:id="60"/>
-    <w:bookmarkStart w:id="61" w:name="repository-map"/>
+    <w:bookmarkEnd w:id="65"/>
+    <w:bookmarkStart w:id="66" w:name="repository-map"/>
     <w:p>
       <w:pPr>
         <w:pStyle w:val="Heading1"/>
@@ -7617,6 +8842,15 @@
         <w:rPr>
           <w:rStyle w:val="VerbatimChar"/>
         </w:rPr>
+        <w:t xml:space="preserve">    jit.py                just-in-time access (request/approve/expire)</w:t>
+      </w:r>
+      <w:r>
+        <w:br/>
+      </w:r>
+      <w:r>
+        <w:rPr>
+          <w:rStyle w:val="VerbatimChar"/>
+        </w:rPr>
         <w:t xml:space="preserve">    pam.py                session-command recording + access review</w:t>
       </w:r>
       <w:r>
@@ -7662,6 +8896,15 @@
         <w:rPr>
           <w:rStyle w:val="VerbatimChar"/>
         </w:rPr>
+        <w:t xml:space="preserve">    detection/evaluate.py held-out benchmark (measured performance)</w:t>
+      </w:r>
+      <w:r>
+        <w:br/>
+      </w:r>
+      <w:r>
+        <w:rPr>
+          <w:rStyle w:val="VerbatimChar"/>
+        </w:rPr>
         <w:t xml:space="preserve">    detection/score.py    0-100 risk score + reasons + insider type</w:t>
       </w:r>
       <w:r>
@@ -7752,7 +8995,7 @@
         <w:rPr>
           <w:rStyle w:val="VerbatimChar"/>
         </w:rPr>
-        <w:t xml:space="preserve">  tests/                  40 pytest tests</w:t>
+        <w:t xml:space="preserve">  tests/                  54 pytest tests</w:t>
       </w:r>
       <w:r>
         <w:br/>
@@ -7794,7 +9037,7 @@
         <w:t xml:space="preserve">Prahari — the sentinel for privileged access. Detect with AI and rules, explain every decision, respond in real time, and keep the proof quantum-safe.</w:t>
       </w:r>
     </w:p>
-    <w:bookmarkEnd w:id="61"/>
+    <w:bookmarkEnd w:id="66"/>
     <w:sectPr>
       <w:footnotePr>
         <w:numRestart w:val="eachSect"/>

</xml_diff>